<commit_message>
Chore (doc): Update chapter 3
</commit_message>
<xml_diff>
--- a/Chapter3.docx
+++ b/Chapter3.docx
@@ -111,13 +111,7 @@
         <w:jc w:val="both"/>
       </w:pPr>
       <w:r>
-        <w:t>The study will adopt a positivist research philosophy.</w:t>
-      </w:r>
-      <w:r>
-        <w:t xml:space="preserve"> </w:t>
-      </w:r>
-      <w:r>
-        <w:t>A positivist approach is appropriate because the study seeks to investigate measurable relationships between defined experimental variables and observable performance outcomes. Rather than relying primarily on subjective perceptions of system efficiency, the research will obtain quantitative measurements from controlled executions of the proposed ZK credential system.</w:t>
+        <w:t>The study will adopt a positivist research philosophy. A positivist approach is appropriate because the study seeks to investigate measurable relationships between defined experimental variables and observable performance outcomes. Rather than relying primarily on subjective perceptions of system efficiency, the research will obtain quantitative measurements from controlled executions of the proposed ZK credential system.</w:t>
       </w:r>
     </w:p>
     <w:p>
@@ -126,55 +120,7 @@
         <w:jc w:val="both"/>
       </w:pPr>
       <w:r>
-        <w:t>The study will therefore treat the experimental system as an observable computational environment in which changes to selected independent variables can be associated with changes in measurable dependent variables.</w:t>
-      </w:r>
-      <w:r>
-        <w:t xml:space="preserve"> </w:t>
-      </w:r>
-      <w:r>
-        <w:t>For example, the study will investigate whether increasing the complexity of an attribute-based credential circuit is associated with changes in</w:t>
-      </w:r>
-      <w:r>
-        <w:t xml:space="preserve"> </w:t>
-      </w:r>
-      <w:r>
-        <w:t>proof-generation time</w:t>
-      </w:r>
-      <w:r>
-        <w:t xml:space="preserve">, </w:t>
-      </w:r>
-      <w:r>
-        <w:t>peak memory consumption</w:t>
-      </w:r>
-      <w:r>
-        <w:t xml:space="preserve">, </w:t>
-      </w:r>
-      <w:r>
-        <w:t>proof size</w:t>
-      </w:r>
-      <w:r>
-        <w:t xml:space="preserve">, </w:t>
-      </w:r>
-      <w:r>
-        <w:t>verification time</w:t>
-      </w:r>
-      <w:r>
-        <w:t xml:space="preserve">, </w:t>
-      </w:r>
-      <w:r>
-        <w:t>circuit size</w:t>
-      </w:r>
-      <w:r>
-        <w:t xml:space="preserve">, </w:t>
-      </w:r>
-      <w:r>
-        <w:t>transaction calldata</w:t>
-      </w:r>
-      <w:r>
-        <w:t>, E</w:t>
-      </w:r>
-      <w:r>
-        <w:t>thereum gas consumption.</w:t>
+        <w:t>The study will therefore treat the experimental system as an observable computational environment in which changes to selected independent variables can be associated with changes in measurable dependent variables. For example, the study will investigate whether increasing the complexity of an attribute-based credential circuit is associated with changes in proof-generation time, peak memory consumption, proof size, verification time, circuit size, transaction calldata, Ethereum gas consumption.</w:t>
       </w:r>
     </w:p>
     <w:p>
@@ -207,79 +153,7 @@
         <w:jc w:val="both"/>
       </w:pPr>
       <w:r>
-        <w:t>The study will employ a quantitative research approach.</w:t>
-      </w:r>
-      <w:r>
-        <w:t xml:space="preserve"> </w:t>
-      </w:r>
-      <w:r>
-        <w:t>The research will generate numerical data from controlled experiments rather than primarily collecting opinions, perceptions, or qualitative experiences from participants.</w:t>
-      </w:r>
-      <w:r>
-        <w:t xml:space="preserve"> </w:t>
-      </w:r>
-      <w:r>
-        <w:t>The quantitative approach is appropriate because the research questions concern measurable performance characteristics of a ZK-SNARK credential system.</w:t>
-      </w:r>
-      <w:r>
-        <w:t xml:space="preserve"> </w:t>
-      </w:r>
-      <w:r>
-        <w:t>The principal data will consist of</w:t>
-      </w:r>
-      <w:r>
-        <w:t xml:space="preserve"> </w:t>
-      </w:r>
-      <w:r>
-        <w:t>execution times</w:t>
-      </w:r>
-      <w:r>
-        <w:t xml:space="preserve">, </w:t>
-      </w:r>
-      <w:r>
-        <w:t>memory measurements</w:t>
-      </w:r>
-      <w:r>
-        <w:t xml:space="preserve">, </w:t>
-      </w:r>
-      <w:r>
-        <w:t>circuit complexity measurements</w:t>
-      </w:r>
-      <w:r>
-        <w:t xml:space="preserve">, </w:t>
-      </w:r>
-      <w:r>
-        <w:t>proof sizes</w:t>
-      </w:r>
-      <w:r>
-        <w:t xml:space="preserve">, </w:t>
-      </w:r>
-      <w:r>
-        <w:t>verification times</w:t>
-      </w:r>
-      <w:r>
-        <w:t xml:space="preserve">, </w:t>
-      </w:r>
-      <w:r>
-        <w:t>Ethereum gas measurements</w:t>
-      </w:r>
-      <w:r>
-        <w:t xml:space="preserve">, </w:t>
-      </w:r>
-      <w:r>
-        <w:t>transaction/calldata sizes</w:t>
-      </w:r>
-      <w:r>
-        <w:t xml:space="preserve"> </w:t>
-      </w:r>
-      <w:r>
-        <w:t>and</w:t>
-      </w:r>
-      <w:r>
-        <w:t xml:space="preserve"> </w:t>
-      </w:r>
-      <w:r>
-        <w:t>repeated benchmark observations.</w:t>
+        <w:t>The study will employ a quantitative research approach. The research will generate numerical data from controlled experiments rather than primarily collecting opinions, perceptions, or qualitative experiences from participants. The quantitative approach is appropriate because the research questions concern measurable performance characteristics of a ZK-SNARK credential system. The principal data will consist of execution times, memory measurements, circuit complexity measurements, proof sizes, verification times, Ethereum gas measurements, transaction/calldata sizes and repeated benchmark observations.</w:t>
       </w:r>
     </w:p>
     <w:p>
@@ -288,13 +162,7 @@
         <w:jc w:val="both"/>
       </w:pPr>
       <w:r>
-        <w:t xml:space="preserve">The quantitative measurements will subsequently be </w:t>
-      </w:r>
-      <w:r>
-        <w:t>analyzed</w:t>
-      </w:r>
-      <w:r>
-        <w:t xml:space="preserve"> using descriptive statistics and, where appropriate, inferential statistical techniques.</w:t>
+        <w:t>The quantitative measurements will subsequently be analyzed using descriptive statistics and, where appropriate, inferential statistical techniques.</w:t>
       </w:r>
       <w:r>
         <w:br w:type="page"/>
@@ -321,13 +189,7 @@
         <w:jc w:val="both"/>
       </w:pPr>
       <w:r>
-        <w:t>The study will employ an experimental research design, specifically a controlled computational benchmarking experiment.</w:t>
-      </w:r>
-      <w:r>
-        <w:t xml:space="preserve"> </w:t>
-      </w:r>
-      <w:r>
-        <w:t>The experimental design will involve developing a prototype attribute-based credential system and systematically varying selected characteristics of the credential circuit.</w:t>
+        <w:t>The study will employ an experimental research design, specifically a controlled computational benchmarking experiment. The experimental design will involve developing a prototype attribute-based credential system and systematically varying selected characteristics of the credential circuit.</w:t>
       </w:r>
     </w:p>
     <w:p>
@@ -354,10 +216,7 @@
         <w:jc w:val="both"/>
       </w:pPr>
       <w:r>
-        <w:t>The study will consist of four major stages</w:t>
-      </w:r>
-      <w:r>
-        <w:t xml:space="preserve"> stated below;</w:t>
+        <w:t>The study will consist of four major stages stated below;</w:t>
       </w:r>
     </w:p>
     <w:p>
@@ -378,13 +237,7 @@
         <w:t>Stage 1</w:t>
       </w:r>
       <w:r>
-        <w:t>: System specification</w:t>
-      </w:r>
-      <w:r>
-        <w:t xml:space="preserve">. </w:t>
-      </w:r>
-      <w:r>
-        <w:t>The attribute-based credential model and verification requirements will be defined</w:t>
+        <w:t>: System specification. The attribute-based credential model and verification requirements will be defined</w:t>
       </w:r>
       <w:r>
         <w:t>.</w:t>
@@ -408,13 +261,7 @@
         <w:t>Stage 2</w:t>
       </w:r>
       <w:r>
-        <w:t>: ZK circuit implementation</w:t>
-      </w:r>
-      <w:r>
-        <w:t xml:space="preserve">. </w:t>
-      </w:r>
-      <w:r>
-        <w:t>The credential verification logic will be implemented using Noir</w:t>
+        <w:t>: ZK circuit implementation. The credential verification logic will be implemented using Noir</w:t>
       </w:r>
       <w:r>
         <w:t>.</w:t>
@@ -438,13 +285,7 @@
         <w:t>Stage 3</w:t>
       </w:r>
       <w:r>
-        <w:t>: Experimental benchmarking</w:t>
-      </w:r>
-      <w:r>
-        <w:t xml:space="preserve">. </w:t>
-      </w:r>
-      <w:r>
-        <w:t>The implementation will be executed under controlled conditions while measurements are collected</w:t>
+        <w:t>: Experimental benchmarking. The implementation will be executed under controlled conditions while measurements are collected</w:t>
       </w:r>
       <w:r>
         <w:t>.</w:t>
@@ -640,6 +481,7 @@
     </w:p>
     <w:p>
       <w:pPr>
+        <w:spacing w:line="360" w:lineRule="auto"/>
         <w:rPr>
           <w:rFonts w:ascii="Times New Roman" w:hAnsi="Times New Roman" w:cs="Times New Roman"/>
         </w:rPr>
@@ -689,6 +531,7 @@
     </w:p>
     <w:p>
       <w:pPr>
+        <w:spacing w:line="360" w:lineRule="auto"/>
         <w:rPr>
           <w:rFonts w:ascii="Times New Roman" w:hAnsi="Times New Roman" w:cs="Times New Roman"/>
         </w:rPr>
@@ -702,6 +545,7 @@
     </w:p>
     <w:p>
       <w:pPr>
+        <w:spacing w:line="360" w:lineRule="auto"/>
         <w:rPr>
           <w:rFonts w:ascii="Times New Roman" w:hAnsi="Times New Roman" w:cs="Times New Roman"/>
         </w:rPr>
@@ -715,6 +559,7 @@
     </w:p>
     <w:p>
       <w:pPr>
+        <w:spacing w:line="360" w:lineRule="auto"/>
         <w:rPr>
           <w:rFonts w:ascii="Times New Roman" w:hAnsi="Times New Roman" w:cs="Times New Roman"/>
         </w:rPr>
@@ -728,6 +573,7 @@
     </w:p>
     <w:p>
       <w:pPr>
+        <w:spacing w:line="360" w:lineRule="auto"/>
         <w:rPr>
           <w:rFonts w:ascii="Times New Roman" w:hAnsi="Times New Roman" w:cs="Times New Roman"/>
         </w:rPr>
@@ -741,6 +587,7 @@
     </w:p>
     <w:p>
       <w:pPr>
+        <w:spacing w:line="360" w:lineRule="auto"/>
         <w:rPr>
           <w:rFonts w:ascii="Times New Roman" w:hAnsi="Times New Roman" w:cs="Times New Roman"/>
         </w:rPr>
@@ -754,6 +601,7 @@
     </w:p>
     <w:p>
       <w:pPr>
+        <w:spacing w:line="360" w:lineRule="auto"/>
         <w:rPr>
           <w:rFonts w:ascii="Times New Roman" w:hAnsi="Times New Roman" w:cs="Times New Roman"/>
         </w:rPr>
@@ -767,6 +615,7 @@
     </w:p>
     <w:p>
       <w:pPr>
+        <w:spacing w:line="360" w:lineRule="auto"/>
         <w:rPr>
           <w:rFonts w:ascii="Times New Roman" w:hAnsi="Times New Roman" w:cs="Times New Roman"/>
         </w:rPr>
@@ -780,6 +629,7 @@
     </w:p>
     <w:p>
       <w:pPr>
+        <w:spacing w:line="360" w:lineRule="auto"/>
         <w:rPr>
           <w:rFonts w:ascii="Times New Roman" w:hAnsi="Times New Roman" w:cs="Times New Roman"/>
         </w:rPr>
@@ -793,6 +643,7 @@
     </w:p>
     <w:p>
       <w:pPr>
+        <w:spacing w:line="360" w:lineRule="auto"/>
         <w:rPr>
           <w:rFonts w:ascii="Times New Roman" w:hAnsi="Times New Roman" w:cs="Times New Roman"/>
         </w:rPr>
@@ -806,6 +657,7 @@
     </w:p>
     <w:p>
       <w:pPr>
+        <w:spacing w:line="360" w:lineRule="auto"/>
         <w:rPr>
           <w:rFonts w:ascii="Times New Roman" w:hAnsi="Times New Roman" w:cs="Times New Roman"/>
         </w:rPr>
@@ -837,6 +689,7 @@
     </w:p>
     <w:p>
       <w:pPr>
+        <w:spacing w:line="360" w:lineRule="auto"/>
         <w:rPr>
           <w:rFonts w:ascii="Times New Roman" w:hAnsi="Times New Roman" w:cs="Times New Roman"/>
         </w:rPr>
@@ -852,6 +705,7 @@
     </w:p>
     <w:p>
       <w:pPr>
+        <w:spacing w:line="360" w:lineRule="auto"/>
         <w:rPr>
           <w:rFonts w:ascii="Times New Roman" w:hAnsi="Times New Roman" w:cs="Times New Roman"/>
         </w:rPr>
@@ -889,6 +743,7 @@
     </w:p>
     <w:p>
       <w:pPr>
+        <w:spacing w:line="360" w:lineRule="auto"/>
         <w:rPr>
           <w:rFonts w:ascii="Times New Roman" w:hAnsi="Times New Roman" w:cs="Times New Roman"/>
         </w:rPr>
@@ -902,6 +757,7 @@
     </w:p>
     <w:p>
       <w:pPr>
+        <w:spacing w:line="360" w:lineRule="auto"/>
         <w:rPr>
           <w:rFonts w:ascii="Times New Roman" w:hAnsi="Times New Roman" w:cs="Times New Roman"/>
         </w:rPr>
@@ -915,6 +771,7 @@
     </w:p>
     <w:p>
       <w:pPr>
+        <w:spacing w:line="360" w:lineRule="auto"/>
         <w:rPr>
           <w:rFonts w:ascii="Times New Roman" w:hAnsi="Times New Roman" w:cs="Times New Roman"/>
         </w:rPr>
@@ -928,6 +785,7 @@
     </w:p>
     <w:p>
       <w:pPr>
+        <w:spacing w:line="360" w:lineRule="auto"/>
         <w:rPr>
           <w:rFonts w:ascii="Times New Roman" w:hAnsi="Times New Roman" w:cs="Times New Roman"/>
         </w:rPr>
@@ -941,6 +799,7 @@
     </w:p>
     <w:p>
       <w:pPr>
+        <w:spacing w:line="360" w:lineRule="auto"/>
         <w:rPr>
           <w:rFonts w:ascii="Times New Roman" w:hAnsi="Times New Roman" w:cs="Times New Roman"/>
         </w:rPr>
@@ -954,6 +813,7 @@
     </w:p>
     <w:p>
       <w:pPr>
+        <w:spacing w:line="360" w:lineRule="auto"/>
         <w:rPr>
           <w:rFonts w:ascii="Times New Roman" w:hAnsi="Times New Roman" w:cs="Times New Roman"/>
         </w:rPr>
@@ -975,6 +835,7 @@
     </w:p>
     <w:p>
       <w:pPr>
+        <w:spacing w:line="360" w:lineRule="auto"/>
         <w:rPr>
           <w:rFonts w:ascii="Times New Roman" w:hAnsi="Times New Roman" w:cs="Times New Roman"/>
         </w:rPr>
@@ -1008,6 +869,7 @@
     </w:p>
     <w:p>
       <w:pPr>
+        <w:spacing w:line="360" w:lineRule="auto"/>
         <w:rPr>
           <w:rFonts w:ascii="Times New Roman" w:hAnsi="Times New Roman" w:cs="Times New Roman"/>
         </w:rPr>
@@ -1038,6 +900,7 @@
           <w:ilvl w:val="0"/>
           <w:numId w:val="2"/>
         </w:numPr>
+        <w:spacing w:line="360" w:lineRule="auto"/>
         <w:rPr>
           <w:rFonts w:ascii="Times New Roman" w:hAnsi="Times New Roman" w:cs="Times New Roman"/>
         </w:rPr>
@@ -1080,6 +943,7 @@
           <w:ilvl w:val="1"/>
           <w:numId w:val="2"/>
         </w:numPr>
+        <w:spacing w:line="360" w:lineRule="auto"/>
         <w:rPr>
           <w:rFonts w:ascii="Times New Roman" w:hAnsi="Times New Roman" w:cs="Times New Roman"/>
         </w:rPr>
@@ -1098,6 +962,7 @@
           <w:ilvl w:val="1"/>
           <w:numId w:val="2"/>
         </w:numPr>
+        <w:spacing w:line="360" w:lineRule="auto"/>
         <w:rPr>
           <w:rFonts w:ascii="Times New Roman" w:hAnsi="Times New Roman" w:cs="Times New Roman"/>
         </w:rPr>
@@ -1116,6 +981,7 @@
           <w:ilvl w:val="1"/>
           <w:numId w:val="2"/>
         </w:numPr>
+        <w:spacing w:line="360" w:lineRule="auto"/>
         <w:rPr>
           <w:rFonts w:ascii="Times New Roman" w:hAnsi="Times New Roman" w:cs="Times New Roman"/>
         </w:rPr>
@@ -1134,6 +1000,7 @@
           <w:ilvl w:val="1"/>
           <w:numId w:val="2"/>
         </w:numPr>
+        <w:spacing w:line="360" w:lineRule="auto"/>
         <w:rPr>
           <w:rFonts w:ascii="Times New Roman" w:hAnsi="Times New Roman" w:cs="Times New Roman"/>
         </w:rPr>
@@ -1147,14 +1014,16 @@
     </w:p>
     <w:p>
       <w:pPr>
-        <w:rPr>
-          <w:rFonts w:ascii="Times New Roman" w:hAnsi="Times New Roman" w:cs="Times New Roman"/>
-        </w:rPr>
-      </w:pPr>
-      <w:r>
-        <w:rPr>
-          <w:rFonts w:ascii="Times New Roman" w:hAnsi="Times New Roman" w:cs="Times New Roman"/>
-        </w:rPr>
+        <w:spacing w:line="360" w:lineRule="auto"/>
+        <w:rPr>
+          <w:rFonts w:ascii="Times New Roman" w:hAnsi="Times New Roman" w:cs="Times New Roman"/>
+        </w:rPr>
+      </w:pPr>
+      <w:r>
+        <w:rPr>
+          <w:rFonts w:ascii="Times New Roman" w:hAnsi="Times New Roman" w:cs="Times New Roman"/>
+        </w:rPr>
+        <w:lastRenderedPageBreak/>
         <w:t>Noir's profiling documentation notes that ACIR opcode footprints can be used to approximately identify bottlenecks, while also warning that actual proving performance depends on how the selected backend interprets the ACIR representation.</w:t>
       </w:r>
     </w:p>
@@ -1165,6 +1034,7 @@
           <w:ilvl w:val="0"/>
           <w:numId w:val="2"/>
         </w:numPr>
+        <w:spacing w:line="360" w:lineRule="auto"/>
         <w:rPr>
           <w:rFonts w:ascii="Times New Roman" w:hAnsi="Times New Roman" w:cs="Times New Roman"/>
         </w:rPr>
@@ -1207,6 +1077,7 @@
           <w:ilvl w:val="1"/>
           <w:numId w:val="2"/>
         </w:numPr>
+        <w:spacing w:line="360" w:lineRule="auto"/>
         <w:rPr>
           <w:rFonts w:ascii="Times New Roman" w:hAnsi="Times New Roman" w:cs="Times New Roman"/>
         </w:rPr>
@@ -1225,6 +1096,7 @@
           <w:ilvl w:val="1"/>
           <w:numId w:val="2"/>
         </w:numPr>
+        <w:spacing w:line="360" w:lineRule="auto"/>
         <w:rPr>
           <w:rFonts w:ascii="Times New Roman" w:hAnsi="Times New Roman" w:cs="Times New Roman"/>
         </w:rPr>
@@ -1243,6 +1115,7 @@
           <w:ilvl w:val="1"/>
           <w:numId w:val="2"/>
         </w:numPr>
+        <w:spacing w:line="360" w:lineRule="auto"/>
         <w:rPr>
           <w:rFonts w:ascii="Times New Roman" w:hAnsi="Times New Roman" w:cs="Times New Roman"/>
         </w:rPr>
@@ -1261,6 +1134,7 @@
           <w:ilvl w:val="1"/>
           <w:numId w:val="2"/>
         </w:numPr>
+        <w:spacing w:line="360" w:lineRule="auto"/>
         <w:rPr>
           <w:rFonts w:ascii="Times New Roman" w:hAnsi="Times New Roman" w:cs="Times New Roman"/>
         </w:rPr>
@@ -1279,15 +1153,15 @@
           <w:ilvl w:val="1"/>
           <w:numId w:val="2"/>
         </w:numPr>
-        <w:rPr>
-          <w:rFonts w:ascii="Times New Roman" w:hAnsi="Times New Roman" w:cs="Times New Roman"/>
-        </w:rPr>
-      </w:pPr>
-      <w:r>
-        <w:rPr>
-          <w:rFonts w:ascii="Times New Roman" w:hAnsi="Times New Roman" w:cs="Times New Roman"/>
-        </w:rPr>
-        <w:lastRenderedPageBreak/>
+        <w:spacing w:line="360" w:lineRule="auto"/>
+        <w:rPr>
+          <w:rFonts w:ascii="Times New Roman" w:hAnsi="Times New Roman" w:cs="Times New Roman"/>
+        </w:rPr>
+      </w:pPr>
+      <w:r>
+        <w:rPr>
+          <w:rFonts w:ascii="Times New Roman" w:hAnsi="Times New Roman" w:cs="Times New Roman"/>
+        </w:rPr>
         <w:t>circuit-related measurements</w:t>
       </w:r>
     </w:p>
@@ -1298,6 +1172,7 @@
           <w:ilvl w:val="0"/>
           <w:numId w:val="2"/>
         </w:numPr>
+        <w:spacing w:line="360" w:lineRule="auto"/>
         <w:rPr>
           <w:rFonts w:ascii="Times New Roman" w:hAnsi="Times New Roman" w:cs="Times New Roman"/>
         </w:rPr>
@@ -1340,6 +1215,7 @@
           <w:ilvl w:val="1"/>
           <w:numId w:val="2"/>
         </w:numPr>
+        <w:spacing w:line="360" w:lineRule="auto"/>
         <w:rPr>
           <w:rFonts w:ascii="Times New Roman" w:hAnsi="Times New Roman" w:cs="Times New Roman"/>
         </w:rPr>
@@ -1358,6 +1234,7 @@
           <w:ilvl w:val="1"/>
           <w:numId w:val="2"/>
         </w:numPr>
+        <w:spacing w:line="360" w:lineRule="auto"/>
         <w:rPr>
           <w:rFonts w:ascii="Times New Roman" w:hAnsi="Times New Roman" w:cs="Times New Roman"/>
         </w:rPr>
@@ -1376,6 +1253,7 @@
           <w:ilvl w:val="1"/>
           <w:numId w:val="2"/>
         </w:numPr>
+        <w:spacing w:line="360" w:lineRule="auto"/>
         <w:rPr>
           <w:rFonts w:ascii="Times New Roman" w:hAnsi="Times New Roman" w:cs="Times New Roman"/>
         </w:rPr>
@@ -1394,6 +1272,7 @@
           <w:ilvl w:val="1"/>
           <w:numId w:val="2"/>
         </w:numPr>
+        <w:spacing w:line="360" w:lineRule="auto"/>
         <w:rPr>
           <w:rFonts w:ascii="Times New Roman" w:hAnsi="Times New Roman" w:cs="Times New Roman"/>
         </w:rPr>
@@ -1412,6 +1291,7 @@
           <w:ilvl w:val="0"/>
           <w:numId w:val="2"/>
         </w:numPr>
+        <w:spacing w:line="360" w:lineRule="auto"/>
         <w:rPr>
           <w:rFonts w:ascii="Times New Roman" w:hAnsi="Times New Roman" w:cs="Times New Roman"/>
         </w:rPr>
@@ -1442,6 +1322,7 @@
           <w:ilvl w:val="1"/>
           <w:numId w:val="2"/>
         </w:numPr>
+        <w:spacing w:line="360" w:lineRule="auto"/>
         <w:rPr>
           <w:rFonts w:ascii="Times New Roman" w:hAnsi="Times New Roman" w:cs="Times New Roman"/>
         </w:rPr>
@@ -1460,6 +1341,7 @@
           <w:ilvl w:val="1"/>
           <w:numId w:val="2"/>
         </w:numPr>
+        <w:spacing w:line="360" w:lineRule="auto"/>
         <w:rPr>
           <w:rFonts w:ascii="Times New Roman" w:hAnsi="Times New Roman" w:cs="Times New Roman"/>
         </w:rPr>
@@ -1478,6 +1360,7 @@
           <w:ilvl w:val="1"/>
           <w:numId w:val="2"/>
         </w:numPr>
+        <w:spacing w:line="360" w:lineRule="auto"/>
         <w:rPr>
           <w:rFonts w:ascii="Times New Roman" w:hAnsi="Times New Roman" w:cs="Times New Roman"/>
         </w:rPr>
@@ -1496,6 +1379,7 @@
           <w:ilvl w:val="1"/>
           <w:numId w:val="2"/>
         </w:numPr>
+        <w:spacing w:line="360" w:lineRule="auto"/>
         <w:rPr>
           <w:rFonts w:ascii="Times New Roman" w:hAnsi="Times New Roman" w:cs="Times New Roman"/>
         </w:rPr>
@@ -1514,6 +1398,7 @@
           <w:ilvl w:val="1"/>
           <w:numId w:val="2"/>
         </w:numPr>
+        <w:spacing w:line="360" w:lineRule="auto"/>
         <w:rPr>
           <w:rFonts w:ascii="Times New Roman" w:hAnsi="Times New Roman" w:cs="Times New Roman"/>
         </w:rPr>
@@ -1532,6 +1417,7 @@
           <w:ilvl w:val="1"/>
           <w:numId w:val="2"/>
         </w:numPr>
+        <w:spacing w:line="360" w:lineRule="auto"/>
         <w:rPr>
           <w:rFonts w:ascii="Times New Roman" w:hAnsi="Times New Roman" w:cs="Times New Roman"/>
         </w:rPr>
@@ -1545,6 +1431,7 @@
     </w:p>
     <w:p>
       <w:pPr>
+        <w:spacing w:line="360" w:lineRule="auto"/>
         <w:rPr>
           <w:rFonts w:ascii="Times New Roman" w:hAnsi="Times New Roman" w:cs="Times New Roman"/>
         </w:rPr>
@@ -1563,6 +1450,7 @@
           <w:ilvl w:val="0"/>
           <w:numId w:val="2"/>
         </w:numPr>
+        <w:spacing w:line="360" w:lineRule="auto"/>
         <w:rPr>
           <w:rFonts w:ascii="Times New Roman" w:hAnsi="Times New Roman" w:cs="Times New Roman"/>
         </w:rPr>
@@ -1593,6 +1481,7 @@
           <w:ilvl w:val="1"/>
           <w:numId w:val="2"/>
         </w:numPr>
+        <w:spacing w:line="360" w:lineRule="auto"/>
         <w:rPr>
           <w:rFonts w:ascii="Times New Roman" w:hAnsi="Times New Roman" w:cs="Times New Roman"/>
         </w:rPr>
@@ -1623,6 +1512,7 @@
           <w:ilvl w:val="1"/>
           <w:numId w:val="2"/>
         </w:numPr>
+        <w:spacing w:line="360" w:lineRule="auto"/>
         <w:rPr>
           <w:rFonts w:ascii="Times New Roman" w:hAnsi="Times New Roman" w:cs="Times New Roman"/>
         </w:rPr>
@@ -1641,6 +1531,7 @@
           <w:ilvl w:val="1"/>
           <w:numId w:val="2"/>
         </w:numPr>
+        <w:spacing w:line="360" w:lineRule="auto"/>
         <w:rPr>
           <w:rFonts w:ascii="Times New Roman" w:hAnsi="Times New Roman" w:cs="Times New Roman"/>
         </w:rPr>
@@ -1659,6 +1550,7 @@
           <w:ilvl w:val="1"/>
           <w:numId w:val="2"/>
         </w:numPr>
+        <w:spacing w:line="360" w:lineRule="auto"/>
         <w:rPr>
           <w:rFonts w:ascii="Times New Roman" w:hAnsi="Times New Roman" w:cs="Times New Roman"/>
         </w:rPr>
@@ -1677,19 +1569,22 @@
           <w:ilvl w:val="1"/>
           <w:numId w:val="2"/>
         </w:numPr>
-        <w:rPr>
-          <w:rFonts w:ascii="Times New Roman" w:hAnsi="Times New Roman" w:cs="Times New Roman"/>
-        </w:rPr>
-      </w:pPr>
-      <w:r>
-        <w:rPr>
-          <w:rFonts w:ascii="Times New Roman" w:hAnsi="Times New Roman" w:cs="Times New Roman"/>
-        </w:rPr>
+        <w:spacing w:line="360" w:lineRule="auto"/>
+        <w:rPr>
+          <w:rFonts w:ascii="Times New Roman" w:hAnsi="Times New Roman" w:cs="Times New Roman"/>
+        </w:rPr>
+      </w:pPr>
+      <w:r>
+        <w:rPr>
+          <w:rFonts w:ascii="Times New Roman" w:hAnsi="Times New Roman" w:cs="Times New Roman"/>
+        </w:rPr>
+        <w:lastRenderedPageBreak/>
         <w:t>processor configuration</w:t>
       </w:r>
     </w:p>
     <w:p>
       <w:pPr>
+        <w:spacing w:line="360" w:lineRule="auto"/>
         <w:rPr>
           <w:rFonts w:ascii="Times New Roman" w:hAnsi="Times New Roman" w:cs="Times New Roman"/>
         </w:rPr>
@@ -1711,6 +1606,7 @@
     </w:p>
     <w:p>
       <w:pPr>
+        <w:spacing w:line="360" w:lineRule="auto"/>
         <w:rPr>
           <w:rFonts w:ascii="Times New Roman" w:hAnsi="Times New Roman" w:cs="Times New Roman"/>
         </w:rPr>
@@ -1729,6 +1625,7 @@
           <w:ilvl w:val="0"/>
           <w:numId w:val="3"/>
         </w:numPr>
+        <w:spacing w:line="360" w:lineRule="auto"/>
         <w:rPr>
           <w:rFonts w:ascii="Times New Roman" w:hAnsi="Times New Roman" w:cs="Times New Roman"/>
         </w:rPr>
@@ -1747,6 +1644,7 @@
           <w:ilvl w:val="0"/>
           <w:numId w:val="3"/>
         </w:numPr>
+        <w:spacing w:line="360" w:lineRule="auto"/>
         <w:rPr>
           <w:rFonts w:ascii="Times New Roman" w:hAnsi="Times New Roman" w:cs="Times New Roman"/>
         </w:rPr>
@@ -1765,6 +1663,7 @@
           <w:ilvl w:val="0"/>
           <w:numId w:val="3"/>
         </w:numPr>
+        <w:spacing w:line="360" w:lineRule="auto"/>
         <w:rPr>
           <w:rFonts w:ascii="Times New Roman" w:hAnsi="Times New Roman" w:cs="Times New Roman"/>
         </w:rPr>
@@ -1783,6 +1682,7 @@
           <w:ilvl w:val="0"/>
           <w:numId w:val="3"/>
         </w:numPr>
+        <w:spacing w:line="360" w:lineRule="auto"/>
         <w:rPr>
           <w:rFonts w:ascii="Times New Roman" w:hAnsi="Times New Roman" w:cs="Times New Roman"/>
         </w:rPr>
@@ -1801,6 +1701,7 @@
           <w:ilvl w:val="0"/>
           <w:numId w:val="3"/>
         </w:numPr>
+        <w:spacing w:line="360" w:lineRule="auto"/>
         <w:rPr>
           <w:rFonts w:ascii="Times New Roman" w:hAnsi="Times New Roman" w:cs="Times New Roman"/>
         </w:rPr>
@@ -1819,6 +1720,7 @@
           <w:ilvl w:val="0"/>
           <w:numId w:val="3"/>
         </w:numPr>
+        <w:spacing w:line="360" w:lineRule="auto"/>
         <w:rPr>
           <w:rFonts w:ascii="Times New Roman" w:hAnsi="Times New Roman" w:cs="Times New Roman"/>
         </w:rPr>
@@ -1837,6 +1739,7 @@
           <w:ilvl w:val="0"/>
           <w:numId w:val="3"/>
         </w:numPr>
+        <w:spacing w:line="360" w:lineRule="auto"/>
         <w:rPr>
           <w:rFonts w:ascii="Times New Roman" w:hAnsi="Times New Roman" w:cs="Times New Roman"/>
         </w:rPr>
@@ -1855,6 +1758,7 @@
           <w:ilvl w:val="0"/>
           <w:numId w:val="3"/>
         </w:numPr>
+        <w:spacing w:line="360" w:lineRule="auto"/>
         <w:rPr>
           <w:rFonts w:ascii="Times New Roman" w:hAnsi="Times New Roman" w:cs="Times New Roman"/>
         </w:rPr>
@@ -1868,6 +1772,7 @@
     </w:p>
     <w:p>
       <w:pPr>
+        <w:spacing w:line="360" w:lineRule="auto"/>
         <w:rPr>
           <w:rFonts w:ascii="Times New Roman" w:hAnsi="Times New Roman" w:cs="Times New Roman"/>
         </w:rPr>
@@ -1881,13 +1786,15 @@
     </w:p>
     <w:p>
       <w:pPr>
-        <w:rPr>
-          <w:rFonts w:ascii="Times New Roman" w:hAnsi="Times New Roman" w:cs="Times New Roman"/>
-        </w:rPr>
-      </w:pPr>
-    </w:p>
-    <w:p>
-      <w:pPr>
+        <w:spacing w:line="360" w:lineRule="auto"/>
+        <w:rPr>
+          <w:rFonts w:ascii="Times New Roman" w:hAnsi="Times New Roman" w:cs="Times New Roman"/>
+        </w:rPr>
+      </w:pPr>
+    </w:p>
+    <w:p>
+      <w:pPr>
+        <w:spacing w:line="360" w:lineRule="auto"/>
         <w:rPr>
           <w:rFonts w:ascii="Times New Roman" w:hAnsi="Times New Roman" w:cs="Times New Roman"/>
         </w:rPr>
@@ -1901,6 +1808,7 @@
     </w:p>
     <w:p>
       <w:pPr>
+        <w:spacing w:line="360" w:lineRule="auto"/>
         <w:rPr>
           <w:rFonts w:ascii="Times New Roman" w:hAnsi="Times New Roman" w:cs="Times New Roman"/>
         </w:rPr>
@@ -1922,6 +1830,7 @@
     </w:p>
     <w:p>
       <w:pPr>
+        <w:spacing w:line="360" w:lineRule="auto"/>
         <w:rPr>
           <w:rFonts w:ascii="Times New Roman" w:hAnsi="Times New Roman" w:cs="Times New Roman"/>
         </w:rPr>
@@ -1943,6 +1852,7 @@
     </w:p>
     <w:p>
       <w:pPr>
+        <w:spacing w:line="360" w:lineRule="auto"/>
         <w:rPr>
           <w:rFonts w:ascii="Times New Roman" w:hAnsi="Times New Roman" w:cs="Times New Roman"/>
         </w:rPr>
@@ -1961,14 +1871,16 @@
           <w:ilvl w:val="0"/>
           <w:numId w:val="4"/>
         </w:numPr>
-        <w:rPr>
-          <w:rFonts w:ascii="Times New Roman" w:hAnsi="Times New Roman" w:cs="Times New Roman"/>
-        </w:rPr>
-      </w:pPr>
-      <w:r>
-        <w:rPr>
-          <w:rFonts w:ascii="Times New Roman" w:hAnsi="Times New Roman" w:cs="Times New Roman"/>
-        </w:rPr>
+        <w:spacing w:line="360" w:lineRule="auto"/>
+        <w:rPr>
+          <w:rFonts w:ascii="Times New Roman" w:hAnsi="Times New Roman" w:cs="Times New Roman"/>
+        </w:rPr>
+      </w:pPr>
+      <w:r>
+        <w:rPr>
+          <w:rFonts w:ascii="Times New Roman" w:hAnsi="Times New Roman" w:cs="Times New Roman"/>
+        </w:rPr>
+        <w:lastRenderedPageBreak/>
         <w:t>Attribute set size</w:t>
       </w:r>
       <w:r>
@@ -2099,15 +2011,433 @@
           <w:ilvl w:val="0"/>
           <w:numId w:val="4"/>
         </w:numPr>
-        <w:rPr>
-          <w:rFonts w:ascii="Times New Roman" w:hAnsi="Times New Roman" w:cs="Times New Roman"/>
-        </w:rPr>
-      </w:pPr>
-      <w:r>
-        <w:rPr>
-          <w:rFonts w:ascii="Times New Roman" w:hAnsi="Times New Roman" w:cs="Times New Roman"/>
-        </w:rPr>
-        <w:t>Predicate complexity</w:t>
+        <w:spacing w:line="360" w:lineRule="auto"/>
+        <w:rPr>
+          <w:rFonts w:ascii="Times New Roman" w:hAnsi="Times New Roman" w:cs="Times New Roman"/>
+        </w:rPr>
+      </w:pPr>
+      <w:r>
+        <w:rPr>
+          <w:rFonts w:ascii="Times New Roman" w:hAnsi="Times New Roman" w:cs="Times New Roman"/>
+        </w:rPr>
+        <w:t>Predicate complexity. Predicate complexity represents the logical conditions that the proof must establish. Examples include simple equality e.g., degree = "MSc" or range predicate e.g., age &gt;= 18, multiple predicates e.g., age &gt;= 18 AND qualification = "MSc" or compound predicates e.g., age &gt;= 18 AND qualification = "MSc" AND status = "ACTIVE"</w:t>
+      </w:r>
+    </w:p>
+    <w:p>
+      <w:pPr>
+        <w:spacing w:line="360" w:lineRule="auto"/>
+        <w:ind w:left="360"/>
+        <w:rPr>
+          <w:rFonts w:ascii="Times New Roman" w:hAnsi="Times New Roman" w:cs="Times New Roman"/>
+        </w:rPr>
+      </w:pPr>
+      <w:r>
+        <w:rPr>
+          <w:rFonts w:ascii="Times New Roman" w:hAnsi="Times New Roman" w:cs="Times New Roman"/>
+        </w:rPr>
+        <w:t>This variable is important because merely increasing the number of attributes does not necessarily increase computational complexity in the same way as increasing the logical constraints.</w:t>
+      </w:r>
+    </w:p>
+    <w:p>
+      <w:pPr>
+        <w:pStyle w:val="Heading3"/>
+      </w:pPr>
+      <w:r>
+        <w:t>3.8.2 Dependent Variables</w:t>
+      </w:r>
+    </w:p>
+    <w:p>
+      <w:pPr>
+        <w:spacing w:line="360" w:lineRule="auto"/>
+        <w:rPr>
+          <w:rFonts w:ascii="Times New Roman" w:hAnsi="Times New Roman" w:cs="Times New Roman"/>
+        </w:rPr>
+      </w:pPr>
+      <w:r>
+        <w:rPr>
+          <w:rFonts w:ascii="Times New Roman" w:hAnsi="Times New Roman" w:cs="Times New Roman"/>
+        </w:rPr>
+        <w:t>The dependent variables will be the measurable performance outcomes.</w:t>
+      </w:r>
+    </w:p>
+    <w:p>
+      <w:pPr>
+        <w:spacing w:line="360" w:lineRule="auto"/>
+        <w:rPr>
+          <w:rFonts w:ascii="Times New Roman" w:hAnsi="Times New Roman" w:cs="Times New Roman"/>
+        </w:rPr>
+      </w:pPr>
+      <w:r>
+        <w:rPr>
+          <w:rFonts w:ascii="Times New Roman" w:hAnsi="Times New Roman" w:cs="Times New Roman"/>
+        </w:rPr>
+        <w:t xml:space="preserve">A. </w:t>
+      </w:r>
+      <w:r>
+        <w:rPr>
+          <w:rFonts w:ascii="Times New Roman" w:hAnsi="Times New Roman" w:cs="Times New Roman"/>
+        </w:rPr>
+        <w:t>Proof-generation time</w:t>
+      </w:r>
+      <w:r>
+        <w:rPr>
+          <w:rFonts w:ascii="Times New Roman" w:hAnsi="Times New Roman" w:cs="Times New Roman"/>
+        </w:rPr>
+        <w:t>; t</w:t>
+      </w:r>
+      <w:r>
+        <w:rPr>
+          <w:rFonts w:ascii="Times New Roman" w:hAnsi="Times New Roman" w:cs="Times New Roman"/>
+        </w:rPr>
+        <w:t>he time required to generate a valid ZK proof</w:t>
+      </w:r>
+      <w:r>
+        <w:rPr>
+          <w:rFonts w:ascii="Times New Roman" w:hAnsi="Times New Roman" w:cs="Times New Roman"/>
+        </w:rPr>
+        <w:t>, m</w:t>
+      </w:r>
+      <w:r>
+        <w:rPr>
+          <w:rFonts w:ascii="Times New Roman" w:hAnsi="Times New Roman" w:cs="Times New Roman"/>
+        </w:rPr>
+        <w:t>easured in</w:t>
+      </w:r>
+      <w:r>
+        <w:rPr>
+          <w:rFonts w:ascii="Times New Roman" w:hAnsi="Times New Roman" w:cs="Times New Roman"/>
+        </w:rPr>
+        <w:t xml:space="preserve"> </w:t>
+      </w:r>
+      <w:r>
+        <w:rPr>
+          <w:rFonts w:ascii="Times New Roman" w:hAnsi="Times New Roman" w:cs="Times New Roman"/>
+        </w:rPr>
+        <w:t>milliseconds</w:t>
+      </w:r>
+      <w:r>
+        <w:rPr>
+          <w:rFonts w:ascii="Times New Roman" w:hAnsi="Times New Roman" w:cs="Times New Roman"/>
+        </w:rPr>
+        <w:t xml:space="preserve"> (</w:t>
+      </w:r>
+      <w:proofErr w:type="spellStart"/>
+      <w:r>
+        <w:rPr>
+          <w:rFonts w:ascii="Times New Roman" w:hAnsi="Times New Roman" w:cs="Times New Roman"/>
+        </w:rPr>
+        <w:t>ms</w:t>
+      </w:r>
+      <w:proofErr w:type="spellEnd"/>
+      <w:r>
+        <w:rPr>
+          <w:rFonts w:ascii="Times New Roman" w:hAnsi="Times New Roman" w:cs="Times New Roman"/>
+        </w:rPr>
+        <w:t>)</w:t>
+      </w:r>
+      <w:r>
+        <w:rPr>
+          <w:rFonts w:ascii="Times New Roman" w:hAnsi="Times New Roman" w:cs="Times New Roman"/>
+        </w:rPr>
+        <w:t xml:space="preserve"> or seconds</w:t>
+      </w:r>
+      <w:r>
+        <w:rPr>
+          <w:rFonts w:ascii="Times New Roman" w:hAnsi="Times New Roman" w:cs="Times New Roman"/>
+        </w:rPr>
+        <w:t xml:space="preserve"> (s)</w:t>
+      </w:r>
+      <w:r>
+        <w:rPr>
+          <w:rFonts w:ascii="Times New Roman" w:hAnsi="Times New Roman" w:cs="Times New Roman"/>
+        </w:rPr>
+        <w:t>.</w:t>
+      </w:r>
+    </w:p>
+    <w:p>
+      <w:pPr>
+        <w:spacing w:line="360" w:lineRule="auto"/>
+        <w:rPr>
+          <w:rFonts w:ascii="Times New Roman" w:hAnsi="Times New Roman" w:cs="Times New Roman"/>
+        </w:rPr>
+      </w:pPr>
+      <w:r>
+        <w:rPr>
+          <w:rFonts w:ascii="Times New Roman" w:hAnsi="Times New Roman" w:cs="Times New Roman"/>
+        </w:rPr>
+        <w:t>B. Local verification time</w:t>
+      </w:r>
+      <w:r>
+        <w:rPr>
+          <w:rFonts w:ascii="Times New Roman" w:hAnsi="Times New Roman" w:cs="Times New Roman"/>
+        </w:rPr>
+        <w:t>; t</w:t>
+      </w:r>
+      <w:r>
+        <w:rPr>
+          <w:rFonts w:ascii="Times New Roman" w:hAnsi="Times New Roman" w:cs="Times New Roman"/>
+        </w:rPr>
+        <w:t>he time required to verify the generated proof outside Ethereum</w:t>
+      </w:r>
+      <w:r>
+        <w:rPr>
+          <w:rFonts w:ascii="Times New Roman" w:hAnsi="Times New Roman" w:cs="Times New Roman"/>
+        </w:rPr>
+        <w:t xml:space="preserve"> and m</w:t>
+      </w:r>
+      <w:r>
+        <w:rPr>
+          <w:rFonts w:ascii="Times New Roman" w:hAnsi="Times New Roman" w:cs="Times New Roman"/>
+        </w:rPr>
+        <w:t>easured in</w:t>
+      </w:r>
+      <w:r>
+        <w:rPr>
+          <w:rFonts w:ascii="Times New Roman" w:hAnsi="Times New Roman" w:cs="Times New Roman"/>
+        </w:rPr>
+        <w:t xml:space="preserve"> </w:t>
+      </w:r>
+      <w:r>
+        <w:rPr>
+          <w:rFonts w:ascii="Times New Roman" w:hAnsi="Times New Roman" w:cs="Times New Roman"/>
+        </w:rPr>
+        <w:t>milliseconds</w:t>
+      </w:r>
+      <w:r>
+        <w:rPr>
+          <w:rFonts w:ascii="Times New Roman" w:hAnsi="Times New Roman" w:cs="Times New Roman"/>
+        </w:rPr>
+        <w:t xml:space="preserve"> (</w:t>
+      </w:r>
+      <w:proofErr w:type="spellStart"/>
+      <w:r>
+        <w:rPr>
+          <w:rFonts w:ascii="Times New Roman" w:hAnsi="Times New Roman" w:cs="Times New Roman"/>
+        </w:rPr>
+        <w:t>ms</w:t>
+      </w:r>
+      <w:proofErr w:type="spellEnd"/>
+      <w:r>
+        <w:rPr>
+          <w:rFonts w:ascii="Times New Roman" w:hAnsi="Times New Roman" w:cs="Times New Roman"/>
+        </w:rPr>
+        <w:t>)</w:t>
+      </w:r>
+      <w:r>
+        <w:rPr>
+          <w:rFonts w:ascii="Times New Roman" w:hAnsi="Times New Roman" w:cs="Times New Roman"/>
+        </w:rPr>
+        <w:t>.</w:t>
+      </w:r>
+      <w:r>
+        <w:rPr>
+          <w:rFonts w:ascii="Times New Roman" w:hAnsi="Times New Roman" w:cs="Times New Roman"/>
+        </w:rPr>
+        <w:t xml:space="preserve"> </w:t>
+      </w:r>
+      <w:r>
+        <w:rPr>
+          <w:rFonts w:ascii="Times New Roman" w:hAnsi="Times New Roman" w:cs="Times New Roman"/>
+        </w:rPr>
+        <w:t>This measurement will help distinguish cryptographic verification cost from blockchain execution cost.</w:t>
+      </w:r>
+    </w:p>
+    <w:p>
+      <w:pPr>
+        <w:spacing w:line="360" w:lineRule="auto"/>
+        <w:rPr>
+          <w:rFonts w:ascii="Times New Roman" w:hAnsi="Times New Roman" w:cs="Times New Roman"/>
+        </w:rPr>
+      </w:pPr>
+      <w:r>
+        <w:rPr>
+          <w:rFonts w:ascii="Times New Roman" w:hAnsi="Times New Roman" w:cs="Times New Roman"/>
+        </w:rPr>
+        <w:t>C. Peak memory consumption</w:t>
+      </w:r>
+      <w:r>
+        <w:rPr>
+          <w:rFonts w:ascii="Times New Roman" w:hAnsi="Times New Roman" w:cs="Times New Roman"/>
+        </w:rPr>
+        <w:t>; t</w:t>
+      </w:r>
+      <w:r>
+        <w:rPr>
+          <w:rFonts w:ascii="Times New Roman" w:hAnsi="Times New Roman" w:cs="Times New Roman"/>
+        </w:rPr>
+        <w:t>he maximum memory used during proof generation</w:t>
+      </w:r>
+      <w:r>
+        <w:rPr>
+          <w:rFonts w:ascii="Times New Roman" w:hAnsi="Times New Roman" w:cs="Times New Roman"/>
+        </w:rPr>
+        <w:t xml:space="preserve"> and m</w:t>
+      </w:r>
+      <w:r>
+        <w:rPr>
+          <w:rFonts w:ascii="Times New Roman" w:hAnsi="Times New Roman" w:cs="Times New Roman"/>
+        </w:rPr>
+        <w:t>easured in</w:t>
+      </w:r>
+      <w:r>
+        <w:rPr>
+          <w:rFonts w:ascii="Times New Roman" w:hAnsi="Times New Roman" w:cs="Times New Roman"/>
+        </w:rPr>
+        <w:t xml:space="preserve"> Megabytes (</w:t>
+      </w:r>
+      <w:r>
+        <w:rPr>
+          <w:rFonts w:ascii="Times New Roman" w:hAnsi="Times New Roman" w:cs="Times New Roman"/>
+        </w:rPr>
+        <w:t>MB</w:t>
+      </w:r>
+      <w:r>
+        <w:rPr>
+          <w:rFonts w:ascii="Times New Roman" w:hAnsi="Times New Roman" w:cs="Times New Roman"/>
+        </w:rPr>
+        <w:t>)</w:t>
+      </w:r>
+      <w:r>
+        <w:rPr>
+          <w:rFonts w:ascii="Times New Roman" w:hAnsi="Times New Roman" w:cs="Times New Roman"/>
+        </w:rPr>
+        <w:t xml:space="preserve"> or </w:t>
+      </w:r>
+      <w:r>
+        <w:rPr>
+          <w:rFonts w:ascii="Times New Roman" w:hAnsi="Times New Roman" w:cs="Times New Roman"/>
+        </w:rPr>
+        <w:t>Gigabytes (</w:t>
+      </w:r>
+      <w:r>
+        <w:rPr>
+          <w:rFonts w:ascii="Times New Roman" w:hAnsi="Times New Roman" w:cs="Times New Roman"/>
+        </w:rPr>
+        <w:t>GB</w:t>
+      </w:r>
+      <w:r>
+        <w:rPr>
+          <w:rFonts w:ascii="Times New Roman" w:hAnsi="Times New Roman" w:cs="Times New Roman"/>
+        </w:rPr>
+        <w:t>)</w:t>
+      </w:r>
+      <w:r>
+        <w:rPr>
+          <w:rFonts w:ascii="Times New Roman" w:hAnsi="Times New Roman" w:cs="Times New Roman"/>
+        </w:rPr>
+        <w:t>.</w:t>
+      </w:r>
+      <w:r>
+        <w:rPr>
+          <w:rFonts w:ascii="Times New Roman" w:hAnsi="Times New Roman" w:cs="Times New Roman"/>
+        </w:rPr>
+        <w:t xml:space="preserve"> </w:t>
+      </w:r>
+      <w:r>
+        <w:rPr>
+          <w:rFonts w:ascii="Times New Roman" w:hAnsi="Times New Roman" w:cs="Times New Roman"/>
+        </w:rPr>
+        <w:t>This is important because a system that performs well on a high-end workstation may not necessarily be practical on resource-constrained devices.</w:t>
+      </w:r>
+    </w:p>
+    <w:p>
+      <w:pPr>
+        <w:spacing w:line="360" w:lineRule="auto"/>
+        <w:rPr>
+          <w:rFonts w:ascii="Times New Roman" w:hAnsi="Times New Roman" w:cs="Times New Roman"/>
+        </w:rPr>
+      </w:pPr>
+      <w:r>
+        <w:rPr>
+          <w:rFonts w:ascii="Times New Roman" w:hAnsi="Times New Roman" w:cs="Times New Roman"/>
+        </w:rPr>
+        <w:t>D. Proof size</w:t>
+      </w:r>
+      <w:r>
+        <w:rPr>
+          <w:rFonts w:ascii="Times New Roman" w:hAnsi="Times New Roman" w:cs="Times New Roman"/>
+        </w:rPr>
+        <w:t>. This is t</w:t>
+      </w:r>
+      <w:r>
+        <w:rPr>
+          <w:rFonts w:ascii="Times New Roman" w:hAnsi="Times New Roman" w:cs="Times New Roman"/>
+        </w:rPr>
+        <w:t>he size of the generated proof.</w:t>
+      </w:r>
+      <w:r>
+        <w:rPr>
+          <w:rFonts w:ascii="Times New Roman" w:hAnsi="Times New Roman" w:cs="Times New Roman"/>
+        </w:rPr>
+        <w:t xml:space="preserve"> It is m</w:t>
+      </w:r>
+      <w:r>
+        <w:rPr>
+          <w:rFonts w:ascii="Times New Roman" w:hAnsi="Times New Roman" w:cs="Times New Roman"/>
+        </w:rPr>
+        <w:t>easured in</w:t>
+      </w:r>
+      <w:r>
+        <w:rPr>
+          <w:rFonts w:ascii="Times New Roman" w:hAnsi="Times New Roman" w:cs="Times New Roman"/>
+        </w:rPr>
+        <w:t xml:space="preserve"> </w:t>
+      </w:r>
+      <w:r>
+        <w:rPr>
+          <w:rFonts w:ascii="Times New Roman" w:hAnsi="Times New Roman" w:cs="Times New Roman"/>
+        </w:rPr>
+        <w:t xml:space="preserve">bytes / </w:t>
+      </w:r>
+      <w:r>
+        <w:rPr>
+          <w:rFonts w:ascii="Times New Roman" w:hAnsi="Times New Roman" w:cs="Times New Roman"/>
+        </w:rPr>
+        <w:t>kilobytes (</w:t>
+      </w:r>
+      <w:r>
+        <w:rPr>
+          <w:rFonts w:ascii="Times New Roman" w:hAnsi="Times New Roman" w:cs="Times New Roman"/>
+        </w:rPr>
+        <w:t>KB</w:t>
+      </w:r>
+      <w:r>
+        <w:rPr>
+          <w:rFonts w:ascii="Times New Roman" w:hAnsi="Times New Roman" w:cs="Times New Roman"/>
+        </w:rPr>
+        <w:t>)</w:t>
+      </w:r>
+      <w:r>
+        <w:rPr>
+          <w:rFonts w:ascii="Times New Roman" w:hAnsi="Times New Roman" w:cs="Times New Roman"/>
+        </w:rPr>
+        <w:t>.</w:t>
+      </w:r>
+      <w:r>
+        <w:rPr>
+          <w:rFonts w:ascii="Times New Roman" w:hAnsi="Times New Roman" w:cs="Times New Roman"/>
+        </w:rPr>
+        <w:t xml:space="preserve"> </w:t>
+      </w:r>
+      <w:r>
+        <w:rPr>
+          <w:rFonts w:ascii="Times New Roman" w:hAnsi="Times New Roman" w:cs="Times New Roman"/>
+        </w:rPr>
+        <w:t>Proof size matters because the proof may subsequently be transmitted to an Ethereum verifier.</w:t>
+      </w:r>
+    </w:p>
+    <w:p>
+      <w:pPr>
+        <w:spacing w:line="360" w:lineRule="auto"/>
+        <w:rPr>
+          <w:rFonts w:ascii="Times New Roman" w:hAnsi="Times New Roman" w:cs="Times New Roman"/>
+        </w:rPr>
+      </w:pPr>
+      <w:r>
+        <w:rPr>
+          <w:rFonts w:ascii="Times New Roman" w:hAnsi="Times New Roman" w:cs="Times New Roman"/>
+        </w:rPr>
+        <w:t>E. Circuit size</w:t>
       </w:r>
       <w:r>
         <w:rPr>
@@ -2119,7 +2449,46 @@
         <w:rPr>
           <w:rFonts w:ascii="Times New Roman" w:hAnsi="Times New Roman" w:cs="Times New Roman"/>
         </w:rPr>
-        <w:t>Predicate complexity represents the logical conditions that the proof must establish.</w:t>
+        <w:t>Circuit complexity will be measured using the available circuit representation and backend-specific measurements.</w:t>
+      </w:r>
+    </w:p>
+    <w:p>
+      <w:pPr>
+        <w:spacing w:line="360" w:lineRule="auto"/>
+        <w:rPr>
+          <w:rFonts w:ascii="Times New Roman" w:hAnsi="Times New Roman" w:cs="Times New Roman"/>
+        </w:rPr>
+      </w:pPr>
+      <w:r>
+        <w:rPr>
+          <w:rFonts w:ascii="Times New Roman" w:hAnsi="Times New Roman" w:cs="Times New Roman"/>
+        </w:rPr>
+        <w:lastRenderedPageBreak/>
+        <w:t>F. Ethereum gas consumption</w:t>
+      </w:r>
+      <w:r>
+        <w:rPr>
+          <w:rFonts w:ascii="Times New Roman" w:hAnsi="Times New Roman" w:cs="Times New Roman"/>
+        </w:rPr>
+        <w:t>. This is the g</w:t>
+      </w:r>
+      <w:r>
+        <w:rPr>
+          <w:rFonts w:ascii="Times New Roman" w:hAnsi="Times New Roman" w:cs="Times New Roman"/>
+        </w:rPr>
+        <w:t>as consumed during execution of the verifier contract.</w:t>
+      </w:r>
+      <w:r>
+        <w:rPr>
+          <w:rFonts w:ascii="Times New Roman" w:hAnsi="Times New Roman" w:cs="Times New Roman"/>
+        </w:rPr>
+        <w:t xml:space="preserve"> It is m</w:t>
+      </w:r>
+      <w:r>
+        <w:rPr>
+          <w:rFonts w:ascii="Times New Roman" w:hAnsi="Times New Roman" w:cs="Times New Roman"/>
+        </w:rPr>
+        <w:t>easured in</w:t>
       </w:r>
       <w:r>
         <w:rPr>
@@ -2131,79 +2500,7 @@
         <w:rPr>
           <w:rFonts w:ascii="Times New Roman" w:hAnsi="Times New Roman" w:cs="Times New Roman"/>
         </w:rPr>
-        <w:t>Examples include</w:t>
-      </w:r>
-      <w:r>
-        <w:rPr>
-          <w:rFonts w:ascii="Times New Roman" w:hAnsi="Times New Roman" w:cs="Times New Roman"/>
-        </w:rPr>
-        <w:t xml:space="preserve"> s</w:t>
-      </w:r>
-      <w:r>
-        <w:rPr>
-          <w:rFonts w:ascii="Times New Roman" w:hAnsi="Times New Roman" w:cs="Times New Roman"/>
-        </w:rPr>
-        <w:t>imple equality</w:t>
-      </w:r>
-      <w:r>
-        <w:rPr>
-          <w:rFonts w:ascii="Times New Roman" w:hAnsi="Times New Roman" w:cs="Times New Roman"/>
-        </w:rPr>
-        <w:t xml:space="preserve"> e.g., </w:t>
-      </w:r>
-      <w:r>
-        <w:rPr>
-          <w:rFonts w:ascii="Times New Roman" w:hAnsi="Times New Roman" w:cs="Times New Roman"/>
-        </w:rPr>
-        <w:t>degree = "MSc"</w:t>
-      </w:r>
-      <w:r>
-        <w:rPr>
-          <w:rFonts w:ascii="Times New Roman" w:hAnsi="Times New Roman" w:cs="Times New Roman"/>
-        </w:rPr>
-        <w:t xml:space="preserve"> or r</w:t>
-      </w:r>
-      <w:r>
-        <w:rPr>
-          <w:rFonts w:ascii="Times New Roman" w:hAnsi="Times New Roman" w:cs="Times New Roman"/>
-        </w:rPr>
-        <w:t>ange predicate</w:t>
-      </w:r>
-      <w:r>
-        <w:rPr>
-          <w:rFonts w:ascii="Times New Roman" w:hAnsi="Times New Roman" w:cs="Times New Roman"/>
-        </w:rPr>
-        <w:t xml:space="preserve"> e.g., </w:t>
-      </w:r>
-      <w:r>
-        <w:rPr>
-          <w:rFonts w:ascii="Times New Roman" w:hAnsi="Times New Roman" w:cs="Times New Roman"/>
-        </w:rPr>
-        <w:t>age &gt;= 18</w:t>
-      </w:r>
-      <w:r>
-        <w:rPr>
-          <w:rFonts w:ascii="Times New Roman" w:hAnsi="Times New Roman" w:cs="Times New Roman"/>
-        </w:rPr>
-        <w:t>, m</w:t>
-      </w:r>
-      <w:r>
-        <w:rPr>
-          <w:rFonts w:ascii="Times New Roman" w:hAnsi="Times New Roman" w:cs="Times New Roman"/>
-        </w:rPr>
-        <w:t>ultiple predicates</w:t>
-      </w:r>
-      <w:r>
-        <w:rPr>
-          <w:rFonts w:ascii="Times New Roman" w:hAnsi="Times New Roman" w:cs="Times New Roman"/>
-        </w:rPr>
-        <w:t xml:space="preserve"> e.g., </w:t>
-      </w:r>
-      <w:r>
-        <w:rPr>
-          <w:rFonts w:ascii="Times New Roman" w:hAnsi="Times New Roman" w:cs="Times New Roman"/>
-        </w:rPr>
-        <w:t>age &gt;= 18</w:t>
+        <w:t>gas units.</w:t>
       </w:r>
       <w:r>
         <w:rPr>
@@ -2215,7 +2512,57 @@
         <w:rPr>
           <w:rFonts w:ascii="Times New Roman" w:hAnsi="Times New Roman" w:cs="Times New Roman"/>
         </w:rPr>
-        <w:t>AND</w:t>
+        <w:t>Th</w:t>
+      </w:r>
+      <w:r>
+        <w:rPr>
+          <w:rFonts w:ascii="Times New Roman" w:hAnsi="Times New Roman" w:cs="Times New Roman"/>
+        </w:rPr>
+        <w:t>is</w:t>
+      </w:r>
+      <w:r>
+        <w:rPr>
+          <w:rFonts w:ascii="Times New Roman" w:hAnsi="Times New Roman" w:cs="Times New Roman"/>
+        </w:rPr>
+        <w:t xml:space="preserve"> study will report gas rather than immediately converting it into monetary cost because gas usage is the more stable computational measure. Monetary cost can vary according to gas price.</w:t>
+      </w:r>
+    </w:p>
+    <w:p>
+      <w:pPr>
+        <w:spacing w:line="360" w:lineRule="auto"/>
+        <w:rPr>
+          <w:rFonts w:ascii="Times New Roman" w:hAnsi="Times New Roman" w:cs="Times New Roman"/>
+        </w:rPr>
+      </w:pPr>
+      <w:r>
+        <w:rPr>
+          <w:rFonts w:ascii="Times New Roman" w:hAnsi="Times New Roman" w:cs="Times New Roman"/>
+        </w:rPr>
+        <w:t>G. Transaction calldata size</w:t>
+      </w:r>
+      <w:r>
+        <w:rPr>
+          <w:rFonts w:ascii="Times New Roman" w:hAnsi="Times New Roman" w:cs="Times New Roman"/>
+        </w:rPr>
+        <w:t xml:space="preserve"> is t</w:t>
+      </w:r>
+      <w:r>
+        <w:rPr>
+          <w:rFonts w:ascii="Times New Roman" w:hAnsi="Times New Roman" w:cs="Times New Roman"/>
+        </w:rPr>
+        <w:t>he amount of data submitted to the verifier contract.</w:t>
+      </w:r>
+      <w:r>
+        <w:rPr>
+          <w:rFonts w:ascii="Times New Roman" w:hAnsi="Times New Roman" w:cs="Times New Roman"/>
+        </w:rPr>
+        <w:t xml:space="preserve"> It is m</w:t>
+      </w:r>
+      <w:r>
+        <w:rPr>
+          <w:rFonts w:ascii="Times New Roman" w:hAnsi="Times New Roman" w:cs="Times New Roman"/>
+        </w:rPr>
+        <w:t>easured in</w:t>
       </w:r>
       <w:r>
         <w:rPr>
@@ -2227,31 +2574,7 @@
         <w:rPr>
           <w:rFonts w:ascii="Times New Roman" w:hAnsi="Times New Roman" w:cs="Times New Roman"/>
         </w:rPr>
-        <w:t>qualification = "MSc"</w:t>
-      </w:r>
-      <w:r>
-        <w:rPr>
-          <w:rFonts w:ascii="Times New Roman" w:hAnsi="Times New Roman" w:cs="Times New Roman"/>
-        </w:rPr>
-        <w:t xml:space="preserve"> or c</w:t>
-      </w:r>
-      <w:r>
-        <w:rPr>
-          <w:rFonts w:ascii="Times New Roman" w:hAnsi="Times New Roman" w:cs="Times New Roman"/>
-        </w:rPr>
-        <w:t>ompound predicates</w:t>
-      </w:r>
-      <w:r>
-        <w:rPr>
-          <w:rFonts w:ascii="Times New Roman" w:hAnsi="Times New Roman" w:cs="Times New Roman"/>
-        </w:rPr>
-        <w:t xml:space="preserve"> e.g., </w:t>
-      </w:r>
-      <w:r>
-        <w:rPr>
-          <w:rFonts w:ascii="Times New Roman" w:hAnsi="Times New Roman" w:cs="Times New Roman"/>
-        </w:rPr>
-        <w:t>age &gt;= 18</w:t>
+        <w:t>bytes.</w:t>
       </w:r>
       <w:r>
         <w:rPr>
@@ -2263,7 +2586,41 @@
         <w:rPr>
           <w:rFonts w:ascii="Times New Roman" w:hAnsi="Times New Roman" w:cs="Times New Roman"/>
         </w:rPr>
-        <w:t>AND</w:t>
+        <w:t xml:space="preserve">This </w:t>
+      </w:r>
+      <w:r>
+        <w:rPr>
+          <w:rFonts w:ascii="Times New Roman" w:hAnsi="Times New Roman" w:cs="Times New Roman"/>
+        </w:rPr>
+        <w:t>is</w:t>
+      </w:r>
+      <w:r>
+        <w:rPr>
+          <w:rFonts w:ascii="Times New Roman" w:hAnsi="Times New Roman" w:cs="Times New Roman"/>
+        </w:rPr>
+        <w:t xml:space="preserve"> reported separately from proof size.</w:t>
+      </w:r>
+    </w:p>
+    <w:p>
+      <w:pPr>
+        <w:pStyle w:val="Heading3"/>
+      </w:pPr>
+      <w:r>
+        <w:t>3.9 Controlled Variables</w:t>
+      </w:r>
+    </w:p>
+    <w:p>
+      <w:pPr>
+        <w:spacing w:line="360" w:lineRule="auto"/>
+        <w:rPr>
+          <w:rFonts w:ascii="Times New Roman" w:hAnsi="Times New Roman" w:cs="Times New Roman"/>
+        </w:rPr>
+      </w:pPr>
+      <w:r>
+        <w:rPr>
+          <w:rFonts w:ascii="Times New Roman" w:hAnsi="Times New Roman" w:cs="Times New Roman"/>
+        </w:rPr>
+        <w:t>To make the experiment scientifically defensible, several variables will be kept constant.</w:t>
       </w:r>
       <w:r>
         <w:rPr>
@@ -2275,7 +2632,7 @@
         <w:rPr>
           <w:rFonts w:ascii="Times New Roman" w:hAnsi="Times New Roman" w:cs="Times New Roman"/>
         </w:rPr>
-        <w:t>qualification = "MSc"</w:t>
+        <w:t>These will include, where possible</w:t>
       </w:r>
       <w:r>
         <w:rPr>
@@ -2287,7 +2644,177 @@
         <w:rPr>
           <w:rFonts w:ascii="Times New Roman" w:hAnsi="Times New Roman" w:cs="Times New Roman"/>
         </w:rPr>
-        <w:t>AND</w:t>
+        <w:t>hardware</w:t>
+      </w:r>
+      <w:r>
+        <w:rPr>
+          <w:rFonts w:ascii="Times New Roman" w:hAnsi="Times New Roman" w:cs="Times New Roman"/>
+        </w:rPr>
+        <w:t xml:space="preserve">, </w:t>
+      </w:r>
+      <w:r>
+        <w:rPr>
+          <w:rFonts w:ascii="Times New Roman" w:hAnsi="Times New Roman" w:cs="Times New Roman"/>
+        </w:rPr>
+        <w:t>operating system</w:t>
+      </w:r>
+      <w:r>
+        <w:rPr>
+          <w:rFonts w:ascii="Times New Roman" w:hAnsi="Times New Roman" w:cs="Times New Roman"/>
+        </w:rPr>
+        <w:t xml:space="preserve">, </w:t>
+      </w:r>
+      <w:r>
+        <w:rPr>
+          <w:rFonts w:ascii="Times New Roman" w:hAnsi="Times New Roman" w:cs="Times New Roman"/>
+        </w:rPr>
+        <w:t>Noir version</w:t>
+      </w:r>
+      <w:r>
+        <w:rPr>
+          <w:rFonts w:ascii="Times New Roman" w:hAnsi="Times New Roman" w:cs="Times New Roman"/>
+        </w:rPr>
+        <w:t xml:space="preserve">, </w:t>
+      </w:r>
+      <w:proofErr w:type="spellStart"/>
+      <w:r>
+        <w:rPr>
+          <w:rFonts w:ascii="Times New Roman" w:hAnsi="Times New Roman" w:cs="Times New Roman"/>
+        </w:rPr>
+        <w:t>Nargo</w:t>
+      </w:r>
+      <w:proofErr w:type="spellEnd"/>
+      <w:r>
+        <w:rPr>
+          <w:rFonts w:ascii="Times New Roman" w:hAnsi="Times New Roman" w:cs="Times New Roman"/>
+        </w:rPr>
+        <w:t xml:space="preserve"> version</w:t>
+      </w:r>
+      <w:r>
+        <w:rPr>
+          <w:rFonts w:ascii="Times New Roman" w:hAnsi="Times New Roman" w:cs="Times New Roman"/>
+        </w:rPr>
+        <w:t xml:space="preserve">, </w:t>
+      </w:r>
+      <w:r>
+        <w:rPr>
+          <w:rFonts w:ascii="Times New Roman" w:hAnsi="Times New Roman" w:cs="Times New Roman"/>
+        </w:rPr>
+        <w:t>proving backend version</w:t>
+      </w:r>
+      <w:r>
+        <w:rPr>
+          <w:rFonts w:ascii="Times New Roman" w:hAnsi="Times New Roman" w:cs="Times New Roman"/>
+        </w:rPr>
+        <w:t xml:space="preserve">, </w:t>
+      </w:r>
+      <w:r>
+        <w:rPr>
+          <w:rFonts w:ascii="Times New Roman" w:hAnsi="Times New Roman" w:cs="Times New Roman"/>
+        </w:rPr>
+        <w:t>compiler configuration</w:t>
+      </w:r>
+      <w:r>
+        <w:rPr>
+          <w:rFonts w:ascii="Times New Roman" w:hAnsi="Times New Roman" w:cs="Times New Roman"/>
+        </w:rPr>
+        <w:t xml:space="preserve">, </w:t>
+      </w:r>
+      <w:r>
+        <w:rPr>
+          <w:rFonts w:ascii="Times New Roman" w:hAnsi="Times New Roman" w:cs="Times New Roman"/>
+        </w:rPr>
+        <w:t>Ethereum client/environment</w:t>
+      </w:r>
+      <w:r>
+        <w:rPr>
+          <w:rFonts w:ascii="Times New Roman" w:hAnsi="Times New Roman" w:cs="Times New Roman"/>
+        </w:rPr>
+        <w:t xml:space="preserve">, </w:t>
+      </w:r>
+      <w:r>
+        <w:rPr>
+          <w:rFonts w:ascii="Times New Roman" w:hAnsi="Times New Roman" w:cs="Times New Roman"/>
+        </w:rPr>
+        <w:t>Solidity compiler version</w:t>
+      </w:r>
+      <w:r>
+        <w:rPr>
+          <w:rFonts w:ascii="Times New Roman" w:hAnsi="Times New Roman" w:cs="Times New Roman"/>
+        </w:rPr>
+        <w:t xml:space="preserve">, </w:t>
+      </w:r>
+      <w:r>
+        <w:rPr>
+          <w:rFonts w:ascii="Times New Roman" w:hAnsi="Times New Roman" w:cs="Times New Roman"/>
+        </w:rPr>
+        <w:t>verifier contract</w:t>
+      </w:r>
+      <w:r>
+        <w:rPr>
+          <w:rFonts w:ascii="Times New Roman" w:hAnsi="Times New Roman" w:cs="Times New Roman"/>
+        </w:rPr>
+        <w:t>, c</w:t>
+      </w:r>
+      <w:r>
+        <w:rPr>
+          <w:rFonts w:ascii="Times New Roman" w:hAnsi="Times New Roman" w:cs="Times New Roman"/>
+        </w:rPr>
+        <w:t>ryptographic curve</w:t>
+      </w:r>
+      <w:r>
+        <w:rPr>
+          <w:rFonts w:ascii="Times New Roman" w:hAnsi="Times New Roman" w:cs="Times New Roman"/>
+        </w:rPr>
+        <w:t xml:space="preserve">, </w:t>
+      </w:r>
+      <w:r>
+        <w:rPr>
+          <w:rFonts w:ascii="Times New Roman" w:hAnsi="Times New Roman" w:cs="Times New Roman"/>
+        </w:rPr>
+        <w:t>benchmark input format</w:t>
+      </w:r>
+      <w:r>
+        <w:rPr>
+          <w:rFonts w:ascii="Times New Roman" w:hAnsi="Times New Roman" w:cs="Times New Roman"/>
+        </w:rPr>
+        <w:t xml:space="preserve">, </w:t>
+      </w:r>
+      <w:r>
+        <w:rPr>
+          <w:rFonts w:ascii="Times New Roman" w:hAnsi="Times New Roman" w:cs="Times New Roman"/>
+        </w:rPr>
+        <w:t>proof system</w:t>
+      </w:r>
+      <w:r>
+        <w:rPr>
+          <w:rFonts w:ascii="Times New Roman" w:hAnsi="Times New Roman" w:cs="Times New Roman"/>
+        </w:rPr>
+        <w:t xml:space="preserve">, </w:t>
+      </w:r>
+      <w:r>
+        <w:rPr>
+          <w:rFonts w:ascii="Times New Roman" w:hAnsi="Times New Roman" w:cs="Times New Roman"/>
+        </w:rPr>
+        <w:t>network configuration</w:t>
+      </w:r>
+      <w:r>
+        <w:rPr>
+          <w:rFonts w:ascii="Times New Roman" w:hAnsi="Times New Roman" w:cs="Times New Roman"/>
+        </w:rPr>
+        <w:t xml:space="preserve"> and </w:t>
+      </w:r>
+      <w:r>
+        <w:rPr>
+          <w:rFonts w:ascii="Times New Roman" w:hAnsi="Times New Roman" w:cs="Times New Roman"/>
+        </w:rPr>
+        <w:t>optimization</w:t>
+      </w:r>
+      <w:r>
+        <w:rPr>
+          <w:rFonts w:ascii="Times New Roman" w:hAnsi="Times New Roman" w:cs="Times New Roman"/>
+        </w:rPr>
+        <w:t xml:space="preserve"> settings.</w:t>
       </w:r>
       <w:r>
         <w:rPr>
@@ -2299,842 +2826,36 @@
         <w:rPr>
           <w:rFonts w:ascii="Times New Roman" w:hAnsi="Times New Roman" w:cs="Times New Roman"/>
         </w:rPr>
-        <w:t>status = "ACTIVE"</w:t>
-      </w:r>
-    </w:p>
-    <w:p>
-      <w:pPr>
-        <w:ind w:left="360"/>
-        <w:rPr>
-          <w:rFonts w:ascii="Times New Roman" w:hAnsi="Times New Roman" w:cs="Times New Roman"/>
-        </w:rPr>
-      </w:pPr>
-      <w:r>
-        <w:rPr>
-          <w:rFonts w:ascii="Times New Roman" w:hAnsi="Times New Roman" w:cs="Times New Roman"/>
-        </w:rPr>
-        <w:t>This variable is important because merely increasing the number of attributes does not necessarily increase computational complexity in the same way as increasing the logical constraints.</w:t>
-      </w:r>
+        <w:t>This is essential because changing multiple components simultaneously would make it difficult to determine what caused a performance difference.</w:t>
+      </w:r>
+      <w:r>
+        <w:rPr>
+          <w:rFonts w:ascii="Times New Roman" w:hAnsi="Times New Roman" w:cs="Times New Roman"/>
+        </w:rPr>
+        <w:br w:type="page"/>
+      </w:r>
+    </w:p>
+    <w:p>
+      <w:pPr>
+        <w:spacing w:line="360" w:lineRule="auto"/>
+        <w:rPr>
+          <w:rFonts w:ascii="Times New Roman" w:hAnsi="Times New Roman" w:cs="Times New Roman"/>
+        </w:rPr>
+      </w:pPr>
     </w:p>
     <w:p>
       <w:pPr>
         <w:pStyle w:val="Heading3"/>
       </w:pPr>
       <w:r>
-        <w:t>3.8.2 Dependent Variables</w:t>
-      </w:r>
-    </w:p>
-    <w:p>
-      <w:pPr>
-        <w:rPr>
-          <w:rFonts w:ascii="Times New Roman" w:hAnsi="Times New Roman" w:cs="Times New Roman"/>
-        </w:rPr>
-      </w:pPr>
-      <w:r>
-        <w:rPr>
-          <w:rFonts w:ascii="Times New Roman" w:hAnsi="Times New Roman" w:cs="Times New Roman"/>
-        </w:rPr>
-        <w:t>The dependent variables will be the measurable performance outcomes.</w:t>
-      </w:r>
-    </w:p>
-    <w:p>
-      <w:pPr>
-        <w:rPr>
-          <w:rFonts w:ascii="Times New Roman" w:hAnsi="Times New Roman" w:cs="Times New Roman"/>
-        </w:rPr>
-      </w:pPr>
-      <w:r>
-        <w:rPr>
-          <w:rFonts w:ascii="Times New Roman" w:hAnsi="Times New Roman" w:cs="Times New Roman"/>
-        </w:rPr>
-        <w:t xml:space="preserve">A. </w:t>
-      </w:r>
-      <w:r>
-        <w:rPr>
-          <w:rFonts w:ascii="Times New Roman" w:hAnsi="Times New Roman" w:cs="Times New Roman"/>
-        </w:rPr>
-        <w:t>Proof-generation time</w:t>
-      </w:r>
-      <w:r>
-        <w:rPr>
-          <w:rFonts w:ascii="Times New Roman" w:hAnsi="Times New Roman" w:cs="Times New Roman"/>
-        </w:rPr>
-        <w:t>; t</w:t>
-      </w:r>
-      <w:r>
-        <w:rPr>
-          <w:rFonts w:ascii="Times New Roman" w:hAnsi="Times New Roman" w:cs="Times New Roman"/>
-        </w:rPr>
-        <w:t>he time required to generate a valid ZK proof</w:t>
-      </w:r>
-      <w:r>
-        <w:rPr>
-          <w:rFonts w:ascii="Times New Roman" w:hAnsi="Times New Roman" w:cs="Times New Roman"/>
-        </w:rPr>
-        <w:t>, m</w:t>
-      </w:r>
-      <w:r>
-        <w:rPr>
-          <w:rFonts w:ascii="Times New Roman" w:hAnsi="Times New Roman" w:cs="Times New Roman"/>
-        </w:rPr>
-        <w:t>easured in</w:t>
-      </w:r>
-      <w:r>
-        <w:rPr>
-          <w:rFonts w:ascii="Times New Roman" w:hAnsi="Times New Roman" w:cs="Times New Roman"/>
-        </w:rPr>
-        <w:t xml:space="preserve"> </w:t>
-      </w:r>
-      <w:r>
-        <w:rPr>
-          <w:rFonts w:ascii="Times New Roman" w:hAnsi="Times New Roman" w:cs="Times New Roman"/>
-        </w:rPr>
-        <w:t>milliseconds</w:t>
-      </w:r>
-      <w:r>
-        <w:rPr>
-          <w:rFonts w:ascii="Times New Roman" w:hAnsi="Times New Roman" w:cs="Times New Roman"/>
-        </w:rPr>
-        <w:t xml:space="preserve"> (</w:t>
-      </w:r>
-      <w:proofErr w:type="spellStart"/>
-      <w:r>
-        <w:rPr>
-          <w:rFonts w:ascii="Times New Roman" w:hAnsi="Times New Roman" w:cs="Times New Roman"/>
-        </w:rPr>
-        <w:t>ms</w:t>
-      </w:r>
-      <w:proofErr w:type="spellEnd"/>
-      <w:r>
-        <w:rPr>
-          <w:rFonts w:ascii="Times New Roman" w:hAnsi="Times New Roman" w:cs="Times New Roman"/>
-        </w:rPr>
-        <w:t>)</w:t>
-      </w:r>
-      <w:r>
-        <w:rPr>
-          <w:rFonts w:ascii="Times New Roman" w:hAnsi="Times New Roman" w:cs="Times New Roman"/>
-        </w:rPr>
-        <w:t xml:space="preserve"> or seconds</w:t>
-      </w:r>
-      <w:r>
-        <w:rPr>
-          <w:rFonts w:ascii="Times New Roman" w:hAnsi="Times New Roman" w:cs="Times New Roman"/>
-        </w:rPr>
-        <w:t xml:space="preserve"> (s)</w:t>
-      </w:r>
-      <w:r>
-        <w:rPr>
-          <w:rFonts w:ascii="Times New Roman" w:hAnsi="Times New Roman" w:cs="Times New Roman"/>
-        </w:rPr>
-        <w:t>.</w:t>
-      </w:r>
-    </w:p>
-    <w:p>
-      <w:pPr>
-        <w:rPr>
-          <w:rFonts w:ascii="Times New Roman" w:hAnsi="Times New Roman" w:cs="Times New Roman"/>
-        </w:rPr>
-      </w:pPr>
-      <w:r>
-        <w:rPr>
-          <w:rFonts w:ascii="Times New Roman" w:hAnsi="Times New Roman" w:cs="Times New Roman"/>
-        </w:rPr>
-        <w:t>B. Local verification time</w:t>
-      </w:r>
-      <w:r>
-        <w:rPr>
-          <w:rFonts w:ascii="Times New Roman" w:hAnsi="Times New Roman" w:cs="Times New Roman"/>
-        </w:rPr>
-        <w:t>; t</w:t>
-      </w:r>
-      <w:r>
-        <w:rPr>
-          <w:rFonts w:ascii="Times New Roman" w:hAnsi="Times New Roman" w:cs="Times New Roman"/>
-        </w:rPr>
-        <w:t>he time required to verify the generated proof outside Ethereum</w:t>
-      </w:r>
-      <w:r>
-        <w:rPr>
-          <w:rFonts w:ascii="Times New Roman" w:hAnsi="Times New Roman" w:cs="Times New Roman"/>
-        </w:rPr>
-        <w:t xml:space="preserve"> and m</w:t>
-      </w:r>
-      <w:r>
-        <w:rPr>
-          <w:rFonts w:ascii="Times New Roman" w:hAnsi="Times New Roman" w:cs="Times New Roman"/>
-        </w:rPr>
-        <w:t>easured in</w:t>
-      </w:r>
-      <w:r>
-        <w:rPr>
-          <w:rFonts w:ascii="Times New Roman" w:hAnsi="Times New Roman" w:cs="Times New Roman"/>
-        </w:rPr>
-        <w:t xml:space="preserve"> </w:t>
-      </w:r>
-      <w:r>
-        <w:rPr>
-          <w:rFonts w:ascii="Times New Roman" w:hAnsi="Times New Roman" w:cs="Times New Roman"/>
-        </w:rPr>
-        <w:t>milliseconds</w:t>
-      </w:r>
-      <w:r>
-        <w:rPr>
-          <w:rFonts w:ascii="Times New Roman" w:hAnsi="Times New Roman" w:cs="Times New Roman"/>
-        </w:rPr>
-        <w:t xml:space="preserve"> (</w:t>
-      </w:r>
-      <w:proofErr w:type="spellStart"/>
-      <w:r>
-        <w:rPr>
-          <w:rFonts w:ascii="Times New Roman" w:hAnsi="Times New Roman" w:cs="Times New Roman"/>
-        </w:rPr>
-        <w:t>ms</w:t>
-      </w:r>
-      <w:proofErr w:type="spellEnd"/>
-      <w:r>
-        <w:rPr>
-          <w:rFonts w:ascii="Times New Roman" w:hAnsi="Times New Roman" w:cs="Times New Roman"/>
-        </w:rPr>
-        <w:t>)</w:t>
-      </w:r>
-      <w:r>
-        <w:rPr>
-          <w:rFonts w:ascii="Times New Roman" w:hAnsi="Times New Roman" w:cs="Times New Roman"/>
-        </w:rPr>
-        <w:t>.</w:t>
-      </w:r>
-      <w:r>
-        <w:rPr>
-          <w:rFonts w:ascii="Times New Roman" w:hAnsi="Times New Roman" w:cs="Times New Roman"/>
-        </w:rPr>
-        <w:t xml:space="preserve"> </w:t>
-      </w:r>
-      <w:r>
-        <w:rPr>
-          <w:rFonts w:ascii="Times New Roman" w:hAnsi="Times New Roman" w:cs="Times New Roman"/>
-        </w:rPr>
-        <w:t>This measurement will help distinguish cryptographic verification cost from blockchain execution cost.</w:t>
-      </w:r>
-    </w:p>
-    <w:p>
-      <w:pPr>
-        <w:rPr>
-          <w:rFonts w:ascii="Times New Roman" w:hAnsi="Times New Roman" w:cs="Times New Roman"/>
-        </w:rPr>
-      </w:pPr>
-      <w:r>
-        <w:rPr>
-          <w:rFonts w:ascii="Times New Roman" w:hAnsi="Times New Roman" w:cs="Times New Roman"/>
-        </w:rPr>
-        <w:t>C. Peak memory consumption</w:t>
-      </w:r>
-      <w:r>
-        <w:rPr>
-          <w:rFonts w:ascii="Times New Roman" w:hAnsi="Times New Roman" w:cs="Times New Roman"/>
-        </w:rPr>
-        <w:t>; t</w:t>
-      </w:r>
-      <w:r>
-        <w:rPr>
-          <w:rFonts w:ascii="Times New Roman" w:hAnsi="Times New Roman" w:cs="Times New Roman"/>
-        </w:rPr>
-        <w:t>he maximum memory used during proof generation</w:t>
-      </w:r>
-      <w:r>
-        <w:rPr>
-          <w:rFonts w:ascii="Times New Roman" w:hAnsi="Times New Roman" w:cs="Times New Roman"/>
-        </w:rPr>
-        <w:t xml:space="preserve"> and m</w:t>
-      </w:r>
-      <w:r>
-        <w:rPr>
-          <w:rFonts w:ascii="Times New Roman" w:hAnsi="Times New Roman" w:cs="Times New Roman"/>
-        </w:rPr>
-        <w:t>easured in</w:t>
-      </w:r>
-      <w:r>
-        <w:rPr>
-          <w:rFonts w:ascii="Times New Roman" w:hAnsi="Times New Roman" w:cs="Times New Roman"/>
-        </w:rPr>
-        <w:t xml:space="preserve"> Megabytes (</w:t>
-      </w:r>
-      <w:r>
-        <w:rPr>
-          <w:rFonts w:ascii="Times New Roman" w:hAnsi="Times New Roman" w:cs="Times New Roman"/>
-        </w:rPr>
-        <w:t>MB</w:t>
-      </w:r>
-      <w:r>
-        <w:rPr>
-          <w:rFonts w:ascii="Times New Roman" w:hAnsi="Times New Roman" w:cs="Times New Roman"/>
-        </w:rPr>
-        <w:t>)</w:t>
-      </w:r>
-      <w:r>
-        <w:rPr>
-          <w:rFonts w:ascii="Times New Roman" w:hAnsi="Times New Roman" w:cs="Times New Roman"/>
-        </w:rPr>
-        <w:t xml:space="preserve"> or </w:t>
-      </w:r>
-      <w:r>
-        <w:rPr>
-          <w:rFonts w:ascii="Times New Roman" w:hAnsi="Times New Roman" w:cs="Times New Roman"/>
-        </w:rPr>
-        <w:t>Gigabytes (</w:t>
-      </w:r>
-      <w:r>
-        <w:rPr>
-          <w:rFonts w:ascii="Times New Roman" w:hAnsi="Times New Roman" w:cs="Times New Roman"/>
-        </w:rPr>
-        <w:t>GB</w:t>
-      </w:r>
-      <w:r>
-        <w:rPr>
-          <w:rFonts w:ascii="Times New Roman" w:hAnsi="Times New Roman" w:cs="Times New Roman"/>
-        </w:rPr>
-        <w:t>)</w:t>
-      </w:r>
-      <w:r>
-        <w:rPr>
-          <w:rFonts w:ascii="Times New Roman" w:hAnsi="Times New Roman" w:cs="Times New Roman"/>
-        </w:rPr>
-        <w:t>.</w:t>
-      </w:r>
-      <w:r>
-        <w:rPr>
-          <w:rFonts w:ascii="Times New Roman" w:hAnsi="Times New Roman" w:cs="Times New Roman"/>
-        </w:rPr>
-        <w:t xml:space="preserve"> </w:t>
-      </w:r>
-      <w:r>
-        <w:rPr>
-          <w:rFonts w:ascii="Times New Roman" w:hAnsi="Times New Roman" w:cs="Times New Roman"/>
-        </w:rPr>
-        <w:t xml:space="preserve">This is important because a system that </w:t>
-      </w:r>
-      <w:r>
-        <w:rPr>
-          <w:rFonts w:ascii="Times New Roman" w:hAnsi="Times New Roman" w:cs="Times New Roman"/>
-        </w:rPr>
-        <w:lastRenderedPageBreak/>
-        <w:t>performs well on a high-end workstation may not necessarily be practical on resource-constrained devices.</w:t>
-      </w:r>
-    </w:p>
-    <w:p>
-      <w:pPr>
-        <w:rPr>
-          <w:rFonts w:ascii="Times New Roman" w:hAnsi="Times New Roman" w:cs="Times New Roman"/>
-        </w:rPr>
-      </w:pPr>
-      <w:r>
-        <w:rPr>
-          <w:rFonts w:ascii="Times New Roman" w:hAnsi="Times New Roman" w:cs="Times New Roman"/>
-        </w:rPr>
-        <w:t>D. Proof size</w:t>
-      </w:r>
-      <w:r>
-        <w:rPr>
-          <w:rFonts w:ascii="Times New Roman" w:hAnsi="Times New Roman" w:cs="Times New Roman"/>
-        </w:rPr>
-        <w:t>. This is t</w:t>
-      </w:r>
-      <w:r>
-        <w:rPr>
-          <w:rFonts w:ascii="Times New Roman" w:hAnsi="Times New Roman" w:cs="Times New Roman"/>
-        </w:rPr>
-        <w:t>he size of the generated proof.</w:t>
-      </w:r>
-      <w:r>
-        <w:rPr>
-          <w:rFonts w:ascii="Times New Roman" w:hAnsi="Times New Roman" w:cs="Times New Roman"/>
-        </w:rPr>
-        <w:t xml:space="preserve"> It is m</w:t>
-      </w:r>
-      <w:r>
-        <w:rPr>
-          <w:rFonts w:ascii="Times New Roman" w:hAnsi="Times New Roman" w:cs="Times New Roman"/>
-        </w:rPr>
-        <w:t>easured in</w:t>
-      </w:r>
-      <w:r>
-        <w:rPr>
-          <w:rFonts w:ascii="Times New Roman" w:hAnsi="Times New Roman" w:cs="Times New Roman"/>
-        </w:rPr>
-        <w:t xml:space="preserve"> </w:t>
-      </w:r>
-      <w:r>
-        <w:rPr>
-          <w:rFonts w:ascii="Times New Roman" w:hAnsi="Times New Roman" w:cs="Times New Roman"/>
-        </w:rPr>
-        <w:t xml:space="preserve">bytes / </w:t>
-      </w:r>
-      <w:r>
-        <w:rPr>
-          <w:rFonts w:ascii="Times New Roman" w:hAnsi="Times New Roman" w:cs="Times New Roman"/>
-        </w:rPr>
-        <w:t>kilobytes (</w:t>
-      </w:r>
-      <w:r>
-        <w:rPr>
-          <w:rFonts w:ascii="Times New Roman" w:hAnsi="Times New Roman" w:cs="Times New Roman"/>
-        </w:rPr>
-        <w:t>KB</w:t>
-      </w:r>
-      <w:r>
-        <w:rPr>
-          <w:rFonts w:ascii="Times New Roman" w:hAnsi="Times New Roman" w:cs="Times New Roman"/>
-        </w:rPr>
-        <w:t>)</w:t>
-      </w:r>
-      <w:r>
-        <w:rPr>
-          <w:rFonts w:ascii="Times New Roman" w:hAnsi="Times New Roman" w:cs="Times New Roman"/>
-        </w:rPr>
-        <w:t>.</w:t>
-      </w:r>
-      <w:r>
-        <w:rPr>
-          <w:rFonts w:ascii="Times New Roman" w:hAnsi="Times New Roman" w:cs="Times New Roman"/>
-        </w:rPr>
-        <w:t xml:space="preserve"> </w:t>
-      </w:r>
-      <w:r>
-        <w:rPr>
-          <w:rFonts w:ascii="Times New Roman" w:hAnsi="Times New Roman" w:cs="Times New Roman"/>
-        </w:rPr>
-        <w:t>Proof size matters because the proof may subsequently be transmitted to an Ethereum verifier.</w:t>
-      </w:r>
-    </w:p>
-    <w:p>
-      <w:pPr>
-        <w:rPr>
-          <w:rFonts w:ascii="Times New Roman" w:hAnsi="Times New Roman" w:cs="Times New Roman"/>
-        </w:rPr>
-      </w:pPr>
-      <w:r>
-        <w:rPr>
-          <w:rFonts w:ascii="Times New Roman" w:hAnsi="Times New Roman" w:cs="Times New Roman"/>
-        </w:rPr>
-        <w:t>E. Circuit size</w:t>
-      </w:r>
-      <w:r>
-        <w:rPr>
-          <w:rFonts w:ascii="Times New Roman" w:hAnsi="Times New Roman" w:cs="Times New Roman"/>
-        </w:rPr>
-        <w:t xml:space="preserve">. </w:t>
-      </w:r>
-      <w:r>
-        <w:rPr>
-          <w:rFonts w:ascii="Times New Roman" w:hAnsi="Times New Roman" w:cs="Times New Roman"/>
-        </w:rPr>
-        <w:t>Circuit complexity will be measured using the available circuit representation and backend-specific measurements.</w:t>
-      </w:r>
-    </w:p>
-    <w:p>
-      <w:pPr>
-        <w:rPr>
-          <w:rFonts w:ascii="Times New Roman" w:hAnsi="Times New Roman" w:cs="Times New Roman"/>
-        </w:rPr>
-      </w:pPr>
-      <w:r>
-        <w:rPr>
-          <w:rFonts w:ascii="Times New Roman" w:hAnsi="Times New Roman" w:cs="Times New Roman"/>
-        </w:rPr>
-        <w:t>F. Ethereum gas consumption</w:t>
-      </w:r>
-      <w:r>
-        <w:rPr>
-          <w:rFonts w:ascii="Times New Roman" w:hAnsi="Times New Roman" w:cs="Times New Roman"/>
-        </w:rPr>
-        <w:t>. This is the g</w:t>
-      </w:r>
-      <w:r>
-        <w:rPr>
-          <w:rFonts w:ascii="Times New Roman" w:hAnsi="Times New Roman" w:cs="Times New Roman"/>
-        </w:rPr>
-        <w:t>as consumed during execution of the verifier contract.</w:t>
-      </w:r>
-      <w:r>
-        <w:rPr>
-          <w:rFonts w:ascii="Times New Roman" w:hAnsi="Times New Roman" w:cs="Times New Roman"/>
-        </w:rPr>
-        <w:t xml:space="preserve"> It is m</w:t>
-      </w:r>
-      <w:r>
-        <w:rPr>
-          <w:rFonts w:ascii="Times New Roman" w:hAnsi="Times New Roman" w:cs="Times New Roman"/>
-        </w:rPr>
-        <w:t>easured in</w:t>
-      </w:r>
-      <w:r>
-        <w:rPr>
-          <w:rFonts w:ascii="Times New Roman" w:hAnsi="Times New Roman" w:cs="Times New Roman"/>
-        </w:rPr>
-        <w:t xml:space="preserve"> </w:t>
-      </w:r>
-      <w:r>
-        <w:rPr>
-          <w:rFonts w:ascii="Times New Roman" w:hAnsi="Times New Roman" w:cs="Times New Roman"/>
-        </w:rPr>
-        <w:t>gas units.</w:t>
-      </w:r>
-      <w:r>
-        <w:rPr>
-          <w:rFonts w:ascii="Times New Roman" w:hAnsi="Times New Roman" w:cs="Times New Roman"/>
-        </w:rPr>
-        <w:t xml:space="preserve"> </w:t>
-      </w:r>
-      <w:r>
-        <w:rPr>
-          <w:rFonts w:ascii="Times New Roman" w:hAnsi="Times New Roman" w:cs="Times New Roman"/>
-        </w:rPr>
-        <w:t>Th</w:t>
-      </w:r>
-      <w:r>
-        <w:rPr>
-          <w:rFonts w:ascii="Times New Roman" w:hAnsi="Times New Roman" w:cs="Times New Roman"/>
-        </w:rPr>
-        <w:t>is</w:t>
-      </w:r>
-      <w:r>
-        <w:rPr>
-          <w:rFonts w:ascii="Times New Roman" w:hAnsi="Times New Roman" w:cs="Times New Roman"/>
-        </w:rPr>
-        <w:t xml:space="preserve"> study will report gas rather than immediately converting it into monetary cost because gas usage is the more stable computational measure. Monetary cost can vary according to gas price.</w:t>
-      </w:r>
-    </w:p>
-    <w:p>
-      <w:pPr>
-        <w:rPr>
-          <w:rFonts w:ascii="Times New Roman" w:hAnsi="Times New Roman" w:cs="Times New Roman"/>
-        </w:rPr>
-      </w:pPr>
-      <w:r>
-        <w:rPr>
-          <w:rFonts w:ascii="Times New Roman" w:hAnsi="Times New Roman" w:cs="Times New Roman"/>
-        </w:rPr>
-        <w:t>G. Transaction calldata size</w:t>
-      </w:r>
-      <w:r>
-        <w:rPr>
-          <w:rFonts w:ascii="Times New Roman" w:hAnsi="Times New Roman" w:cs="Times New Roman"/>
-        </w:rPr>
-        <w:t xml:space="preserve"> is t</w:t>
-      </w:r>
-      <w:r>
-        <w:rPr>
-          <w:rFonts w:ascii="Times New Roman" w:hAnsi="Times New Roman" w:cs="Times New Roman"/>
-        </w:rPr>
-        <w:t>he amount of data submitted to the verifier contract.</w:t>
-      </w:r>
-      <w:r>
-        <w:rPr>
-          <w:rFonts w:ascii="Times New Roman" w:hAnsi="Times New Roman" w:cs="Times New Roman"/>
-        </w:rPr>
-        <w:t xml:space="preserve"> It is m</w:t>
-      </w:r>
-      <w:r>
-        <w:rPr>
-          <w:rFonts w:ascii="Times New Roman" w:hAnsi="Times New Roman" w:cs="Times New Roman"/>
-        </w:rPr>
-        <w:t>easured in</w:t>
-      </w:r>
-      <w:r>
-        <w:rPr>
-          <w:rFonts w:ascii="Times New Roman" w:hAnsi="Times New Roman" w:cs="Times New Roman"/>
-        </w:rPr>
-        <w:t xml:space="preserve"> </w:t>
-      </w:r>
-      <w:r>
-        <w:rPr>
-          <w:rFonts w:ascii="Times New Roman" w:hAnsi="Times New Roman" w:cs="Times New Roman"/>
-        </w:rPr>
-        <w:t>bytes.</w:t>
-      </w:r>
-      <w:r>
-        <w:rPr>
-          <w:rFonts w:ascii="Times New Roman" w:hAnsi="Times New Roman" w:cs="Times New Roman"/>
-        </w:rPr>
-        <w:t xml:space="preserve"> </w:t>
-      </w:r>
-      <w:r>
-        <w:rPr>
-          <w:rFonts w:ascii="Times New Roman" w:hAnsi="Times New Roman" w:cs="Times New Roman"/>
-        </w:rPr>
-        <w:t xml:space="preserve">This </w:t>
-      </w:r>
-      <w:r>
-        <w:rPr>
-          <w:rFonts w:ascii="Times New Roman" w:hAnsi="Times New Roman" w:cs="Times New Roman"/>
-        </w:rPr>
-        <w:t>is</w:t>
-      </w:r>
-      <w:r>
-        <w:rPr>
-          <w:rFonts w:ascii="Times New Roman" w:hAnsi="Times New Roman" w:cs="Times New Roman"/>
-        </w:rPr>
-        <w:t xml:space="preserve"> reported separately from proof size.</w:t>
-      </w:r>
-    </w:p>
-    <w:p>
-      <w:pPr>
-        <w:pStyle w:val="Heading3"/>
-      </w:pPr>
-      <w:r>
-        <w:t>3.9 Controlled Variables</w:t>
-      </w:r>
-    </w:p>
-    <w:p>
-      <w:pPr>
-        <w:rPr>
-          <w:rFonts w:ascii="Times New Roman" w:hAnsi="Times New Roman" w:cs="Times New Roman"/>
-        </w:rPr>
-      </w:pPr>
-      <w:r>
-        <w:rPr>
-          <w:rFonts w:ascii="Times New Roman" w:hAnsi="Times New Roman" w:cs="Times New Roman"/>
-        </w:rPr>
-        <w:t>To make the experiment scientifically defensible, several variables will be kept constant.</w:t>
-      </w:r>
-      <w:r>
-        <w:rPr>
-          <w:rFonts w:ascii="Times New Roman" w:hAnsi="Times New Roman" w:cs="Times New Roman"/>
-        </w:rPr>
-        <w:t xml:space="preserve"> </w:t>
-      </w:r>
-      <w:r>
-        <w:rPr>
-          <w:rFonts w:ascii="Times New Roman" w:hAnsi="Times New Roman" w:cs="Times New Roman"/>
-        </w:rPr>
-        <w:t>These will include, where possible</w:t>
-      </w:r>
-      <w:r>
-        <w:rPr>
-          <w:rFonts w:ascii="Times New Roman" w:hAnsi="Times New Roman" w:cs="Times New Roman"/>
-        </w:rPr>
-        <w:t xml:space="preserve"> </w:t>
-      </w:r>
-      <w:r>
-        <w:rPr>
-          <w:rFonts w:ascii="Times New Roman" w:hAnsi="Times New Roman" w:cs="Times New Roman"/>
-        </w:rPr>
-        <w:t>hardware</w:t>
-      </w:r>
-      <w:r>
-        <w:rPr>
-          <w:rFonts w:ascii="Times New Roman" w:hAnsi="Times New Roman" w:cs="Times New Roman"/>
-        </w:rPr>
-        <w:t xml:space="preserve">, </w:t>
-      </w:r>
-      <w:r>
-        <w:rPr>
-          <w:rFonts w:ascii="Times New Roman" w:hAnsi="Times New Roman" w:cs="Times New Roman"/>
-        </w:rPr>
-        <w:t>operating system</w:t>
-      </w:r>
-      <w:r>
-        <w:rPr>
-          <w:rFonts w:ascii="Times New Roman" w:hAnsi="Times New Roman" w:cs="Times New Roman"/>
-        </w:rPr>
-        <w:t xml:space="preserve">, </w:t>
-      </w:r>
-      <w:r>
-        <w:rPr>
-          <w:rFonts w:ascii="Times New Roman" w:hAnsi="Times New Roman" w:cs="Times New Roman"/>
-        </w:rPr>
-        <w:t>Noir version</w:t>
-      </w:r>
-      <w:r>
-        <w:rPr>
-          <w:rFonts w:ascii="Times New Roman" w:hAnsi="Times New Roman" w:cs="Times New Roman"/>
-        </w:rPr>
-        <w:t xml:space="preserve">, </w:t>
-      </w:r>
-      <w:proofErr w:type="spellStart"/>
-      <w:r>
-        <w:rPr>
-          <w:rFonts w:ascii="Times New Roman" w:hAnsi="Times New Roman" w:cs="Times New Roman"/>
-        </w:rPr>
-        <w:t>Nargo</w:t>
-      </w:r>
-      <w:proofErr w:type="spellEnd"/>
-      <w:r>
-        <w:rPr>
-          <w:rFonts w:ascii="Times New Roman" w:hAnsi="Times New Roman" w:cs="Times New Roman"/>
-        </w:rPr>
-        <w:t xml:space="preserve"> version</w:t>
-      </w:r>
-      <w:r>
-        <w:rPr>
-          <w:rFonts w:ascii="Times New Roman" w:hAnsi="Times New Roman" w:cs="Times New Roman"/>
-        </w:rPr>
-        <w:t xml:space="preserve">, </w:t>
-      </w:r>
-      <w:r>
-        <w:rPr>
-          <w:rFonts w:ascii="Times New Roman" w:hAnsi="Times New Roman" w:cs="Times New Roman"/>
-        </w:rPr>
-        <w:t>proving backend version</w:t>
-      </w:r>
-      <w:r>
-        <w:rPr>
-          <w:rFonts w:ascii="Times New Roman" w:hAnsi="Times New Roman" w:cs="Times New Roman"/>
-        </w:rPr>
-        <w:t xml:space="preserve">, </w:t>
-      </w:r>
-      <w:r>
-        <w:rPr>
-          <w:rFonts w:ascii="Times New Roman" w:hAnsi="Times New Roman" w:cs="Times New Roman"/>
-        </w:rPr>
-        <w:t>compiler configuration</w:t>
-      </w:r>
-      <w:r>
-        <w:rPr>
-          <w:rFonts w:ascii="Times New Roman" w:hAnsi="Times New Roman" w:cs="Times New Roman"/>
-        </w:rPr>
-        <w:t xml:space="preserve">, </w:t>
-      </w:r>
-      <w:r>
-        <w:rPr>
-          <w:rFonts w:ascii="Times New Roman" w:hAnsi="Times New Roman" w:cs="Times New Roman"/>
-        </w:rPr>
-        <w:t>Ethereum client/environment</w:t>
-      </w:r>
-      <w:r>
-        <w:rPr>
-          <w:rFonts w:ascii="Times New Roman" w:hAnsi="Times New Roman" w:cs="Times New Roman"/>
-        </w:rPr>
-        <w:t xml:space="preserve">, </w:t>
-      </w:r>
-      <w:r>
-        <w:rPr>
-          <w:rFonts w:ascii="Times New Roman" w:hAnsi="Times New Roman" w:cs="Times New Roman"/>
-        </w:rPr>
-        <w:t>Solidity compiler version</w:t>
-      </w:r>
-      <w:r>
-        <w:rPr>
-          <w:rFonts w:ascii="Times New Roman" w:hAnsi="Times New Roman" w:cs="Times New Roman"/>
-        </w:rPr>
-        <w:t xml:space="preserve">, </w:t>
-      </w:r>
-      <w:r>
-        <w:rPr>
-          <w:rFonts w:ascii="Times New Roman" w:hAnsi="Times New Roman" w:cs="Times New Roman"/>
-        </w:rPr>
-        <w:t>verifier contract</w:t>
-      </w:r>
-      <w:r>
-        <w:rPr>
-          <w:rFonts w:ascii="Times New Roman" w:hAnsi="Times New Roman" w:cs="Times New Roman"/>
-        </w:rPr>
-        <w:t>, c</w:t>
-      </w:r>
-      <w:r>
-        <w:rPr>
-          <w:rFonts w:ascii="Times New Roman" w:hAnsi="Times New Roman" w:cs="Times New Roman"/>
-        </w:rPr>
-        <w:t>ryptographic curve</w:t>
-      </w:r>
-      <w:r>
-        <w:rPr>
-          <w:rFonts w:ascii="Times New Roman" w:hAnsi="Times New Roman" w:cs="Times New Roman"/>
-        </w:rPr>
-        <w:t xml:space="preserve">, </w:t>
-      </w:r>
-      <w:r>
-        <w:rPr>
-          <w:rFonts w:ascii="Times New Roman" w:hAnsi="Times New Roman" w:cs="Times New Roman"/>
-        </w:rPr>
-        <w:t>benchmark input format</w:t>
-      </w:r>
-      <w:r>
-        <w:rPr>
-          <w:rFonts w:ascii="Times New Roman" w:hAnsi="Times New Roman" w:cs="Times New Roman"/>
-        </w:rPr>
-        <w:t xml:space="preserve">, </w:t>
-      </w:r>
-      <w:r>
-        <w:rPr>
-          <w:rFonts w:ascii="Times New Roman" w:hAnsi="Times New Roman" w:cs="Times New Roman"/>
-        </w:rPr>
-        <w:t>proof system</w:t>
-      </w:r>
-      <w:r>
-        <w:rPr>
-          <w:rFonts w:ascii="Times New Roman" w:hAnsi="Times New Roman" w:cs="Times New Roman"/>
-        </w:rPr>
-        <w:t xml:space="preserve">, </w:t>
-      </w:r>
-      <w:r>
-        <w:rPr>
-          <w:rFonts w:ascii="Times New Roman" w:hAnsi="Times New Roman" w:cs="Times New Roman"/>
-        </w:rPr>
-        <w:t>network configuration</w:t>
-      </w:r>
-      <w:r>
-        <w:rPr>
-          <w:rFonts w:ascii="Times New Roman" w:hAnsi="Times New Roman" w:cs="Times New Roman"/>
-        </w:rPr>
-        <w:t xml:space="preserve"> and </w:t>
-      </w:r>
-      <w:r>
-        <w:rPr>
-          <w:rFonts w:ascii="Times New Roman" w:hAnsi="Times New Roman" w:cs="Times New Roman"/>
-        </w:rPr>
-        <w:t>optimization</w:t>
-      </w:r>
-      <w:r>
-        <w:rPr>
-          <w:rFonts w:ascii="Times New Roman" w:hAnsi="Times New Roman" w:cs="Times New Roman"/>
-        </w:rPr>
-        <w:t xml:space="preserve"> settings.</w:t>
-      </w:r>
-      <w:r>
-        <w:rPr>
-          <w:rFonts w:ascii="Times New Roman" w:hAnsi="Times New Roman" w:cs="Times New Roman"/>
-        </w:rPr>
-        <w:t xml:space="preserve"> </w:t>
-      </w:r>
-      <w:r>
-        <w:rPr>
-          <w:rFonts w:ascii="Times New Roman" w:hAnsi="Times New Roman" w:cs="Times New Roman"/>
-        </w:rPr>
-        <w:t>This is essential because changing multiple components simultaneously would make it difficult to determine what caused a performance difference.</w:t>
-      </w:r>
-      <w:r>
-        <w:rPr>
-          <w:rFonts w:ascii="Times New Roman" w:hAnsi="Times New Roman" w:cs="Times New Roman"/>
-        </w:rPr>
-        <w:br w:type="page"/>
-      </w:r>
-    </w:p>
-    <w:p>
-      <w:pPr>
-        <w:rPr>
-          <w:rFonts w:ascii="Times New Roman" w:hAnsi="Times New Roman" w:cs="Times New Roman"/>
-        </w:rPr>
-      </w:pPr>
-    </w:p>
-    <w:p>
-      <w:pPr>
-        <w:pStyle w:val="Heading3"/>
-      </w:pPr>
-      <w:r>
-        <w:t xml:space="preserve">3.10 </w:t>
-      </w:r>
-      <w:r>
-        <w:t>Operationalization</w:t>
-      </w:r>
-      <w:r>
-        <w:t xml:space="preserve"> of Variables</w:t>
+        <w:t>3.10 Operationalization of Variables</w:t>
       </w:r>
     </w:p>
     <w:p>
       <w:pPr>
         <w:pStyle w:val="Caption"/>
         <w:keepNext/>
+        <w:spacing w:line="360" w:lineRule="auto"/>
         <w:rPr>
           <w:sz w:val="24"/>
           <w:szCs w:val="24"/>
@@ -3229,7 +2950,7 @@
           </w:tcPr>
           <w:p>
             <w:pPr>
-              <w:spacing w:after="0" w:line="240" w:lineRule="auto"/>
+              <w:spacing w:after="0" w:line="360" w:lineRule="auto"/>
               <w:jc w:val="center"/>
               <w:rPr>
                 <w:rFonts w:ascii="Times New Roman" w:eastAsia="Times New Roman" w:hAnsi="Times New Roman" w:cs="Times New Roman"/>
@@ -3259,7 +2980,7 @@
           </w:tcPr>
           <w:p>
             <w:pPr>
-              <w:spacing w:after="0" w:line="240" w:lineRule="auto"/>
+              <w:spacing w:after="0" w:line="360" w:lineRule="auto"/>
               <w:jc w:val="center"/>
               <w:rPr>
                 <w:rFonts w:ascii="Times New Roman" w:eastAsia="Times New Roman" w:hAnsi="Times New Roman" w:cs="Times New Roman"/>
@@ -3289,7 +3010,7 @@
           </w:tcPr>
           <w:p>
             <w:pPr>
-              <w:spacing w:after="0" w:line="240" w:lineRule="auto"/>
+              <w:spacing w:after="0" w:line="360" w:lineRule="auto"/>
               <w:jc w:val="center"/>
               <w:rPr>
                 <w:rFonts w:ascii="Times New Roman" w:eastAsia="Times New Roman" w:hAnsi="Times New Roman" w:cs="Times New Roman"/>
@@ -3324,7 +3045,7 @@
           </w:tcPr>
           <w:p>
             <w:pPr>
-              <w:spacing w:after="0" w:line="240" w:lineRule="auto"/>
+              <w:spacing w:after="0" w:line="360" w:lineRule="auto"/>
               <w:rPr>
                 <w:rFonts w:ascii="Times New Roman" w:eastAsia="Times New Roman" w:hAnsi="Times New Roman" w:cs="Times New Roman"/>
                 <w:kern w:val="0"/>
@@ -3349,7 +3070,7 @@
           </w:tcPr>
           <w:p>
             <w:pPr>
-              <w:spacing w:after="0" w:line="240" w:lineRule="auto"/>
+              <w:spacing w:after="0" w:line="360" w:lineRule="auto"/>
               <w:rPr>
                 <w:rFonts w:ascii="Times New Roman" w:eastAsia="Times New Roman" w:hAnsi="Times New Roman" w:cs="Times New Roman"/>
                 <w:kern w:val="0"/>
@@ -3374,7 +3095,7 @@
           </w:tcPr>
           <w:p>
             <w:pPr>
-              <w:spacing w:after="0" w:line="240" w:lineRule="auto"/>
+              <w:spacing w:after="0" w:line="360" w:lineRule="auto"/>
               <w:rPr>
                 <w:rFonts w:ascii="Times New Roman" w:eastAsia="Times New Roman" w:hAnsi="Times New Roman" w:cs="Times New Roman"/>
                 <w:kern w:val="0"/>
@@ -3404,7 +3125,7 @@
           </w:tcPr>
           <w:p>
             <w:pPr>
-              <w:spacing w:after="0" w:line="240" w:lineRule="auto"/>
+              <w:spacing w:after="0" w:line="360" w:lineRule="auto"/>
               <w:rPr>
                 <w:rFonts w:ascii="Times New Roman" w:eastAsia="Times New Roman" w:hAnsi="Times New Roman" w:cs="Times New Roman"/>
                 <w:kern w:val="0"/>
@@ -3429,7 +3150,7 @@
           </w:tcPr>
           <w:p>
             <w:pPr>
-              <w:spacing w:after="0" w:line="240" w:lineRule="auto"/>
+              <w:spacing w:after="0" w:line="360" w:lineRule="auto"/>
               <w:rPr>
                 <w:rFonts w:ascii="Times New Roman" w:eastAsia="Times New Roman" w:hAnsi="Times New Roman" w:cs="Times New Roman"/>
                 <w:kern w:val="0"/>
@@ -3454,7 +3175,7 @@
           </w:tcPr>
           <w:p>
             <w:pPr>
-              <w:spacing w:after="0" w:line="240" w:lineRule="auto"/>
+              <w:spacing w:after="0" w:line="360" w:lineRule="auto"/>
               <w:rPr>
                 <w:rFonts w:ascii="Times New Roman" w:eastAsia="Times New Roman" w:hAnsi="Times New Roman" w:cs="Times New Roman"/>
                 <w:kern w:val="0"/>
@@ -3484,7 +3205,7 @@
           </w:tcPr>
           <w:p>
             <w:pPr>
-              <w:spacing w:after="0" w:line="240" w:lineRule="auto"/>
+              <w:spacing w:after="0" w:line="360" w:lineRule="auto"/>
               <w:rPr>
                 <w:rFonts w:ascii="Times New Roman" w:eastAsia="Times New Roman" w:hAnsi="Times New Roman" w:cs="Times New Roman"/>
                 <w:kern w:val="0"/>
@@ -3509,7 +3230,7 @@
           </w:tcPr>
           <w:p>
             <w:pPr>
-              <w:spacing w:after="0" w:line="240" w:lineRule="auto"/>
+              <w:spacing w:after="0" w:line="360" w:lineRule="auto"/>
               <w:rPr>
                 <w:rFonts w:ascii="Times New Roman" w:eastAsia="Times New Roman" w:hAnsi="Times New Roman" w:cs="Times New Roman"/>
                 <w:kern w:val="0"/>
@@ -3534,7 +3255,7 @@
           </w:tcPr>
           <w:p>
             <w:pPr>
-              <w:spacing w:after="0" w:line="240" w:lineRule="auto"/>
+              <w:spacing w:after="0" w:line="360" w:lineRule="auto"/>
               <w:rPr>
                 <w:rFonts w:ascii="Times New Roman" w:eastAsia="Times New Roman" w:hAnsi="Times New Roman" w:cs="Times New Roman"/>
                 <w:kern w:val="0"/>
@@ -3564,7 +3285,7 @@
           </w:tcPr>
           <w:p>
             <w:pPr>
-              <w:spacing w:after="0" w:line="240" w:lineRule="auto"/>
+              <w:spacing w:after="0" w:line="360" w:lineRule="auto"/>
               <w:rPr>
                 <w:rFonts w:ascii="Times New Roman" w:eastAsia="Times New Roman" w:hAnsi="Times New Roman" w:cs="Times New Roman"/>
                 <w:kern w:val="0"/>
@@ -3589,7 +3310,7 @@
           </w:tcPr>
           <w:p>
             <w:pPr>
-              <w:spacing w:after="0" w:line="240" w:lineRule="auto"/>
+              <w:spacing w:after="0" w:line="360" w:lineRule="auto"/>
               <w:rPr>
                 <w:rFonts w:ascii="Times New Roman" w:eastAsia="Times New Roman" w:hAnsi="Times New Roman" w:cs="Times New Roman"/>
                 <w:kern w:val="0"/>
@@ -3614,7 +3335,7 @@
           </w:tcPr>
           <w:p>
             <w:pPr>
-              <w:spacing w:after="0" w:line="240" w:lineRule="auto"/>
+              <w:spacing w:after="0" w:line="360" w:lineRule="auto"/>
               <w:rPr>
                 <w:rFonts w:ascii="Times New Roman" w:eastAsia="Times New Roman" w:hAnsi="Times New Roman" w:cs="Times New Roman"/>
                 <w:kern w:val="0"/>
@@ -3654,7 +3375,7 @@
           </w:tcPr>
           <w:p>
             <w:pPr>
-              <w:spacing w:after="0" w:line="240" w:lineRule="auto"/>
+              <w:spacing w:after="0" w:line="360" w:lineRule="auto"/>
               <w:rPr>
                 <w:rFonts w:ascii="Times New Roman" w:eastAsia="Times New Roman" w:hAnsi="Times New Roman" w:cs="Times New Roman"/>
                 <w:kern w:val="0"/>
@@ -3679,7 +3400,7 @@
           </w:tcPr>
           <w:p>
             <w:pPr>
-              <w:spacing w:after="0" w:line="240" w:lineRule="auto"/>
+              <w:spacing w:after="0" w:line="360" w:lineRule="auto"/>
               <w:rPr>
                 <w:rFonts w:ascii="Times New Roman" w:eastAsia="Times New Roman" w:hAnsi="Times New Roman" w:cs="Times New Roman"/>
                 <w:kern w:val="0"/>
@@ -3704,7 +3425,7 @@
           </w:tcPr>
           <w:p>
             <w:pPr>
-              <w:spacing w:after="0" w:line="240" w:lineRule="auto"/>
+              <w:spacing w:after="0" w:line="360" w:lineRule="auto"/>
               <w:rPr>
                 <w:rFonts w:ascii="Times New Roman" w:eastAsia="Times New Roman" w:hAnsi="Times New Roman" w:cs="Times New Roman"/>
                 <w:kern w:val="0"/>
@@ -3734,7 +3455,7 @@
           </w:tcPr>
           <w:p>
             <w:pPr>
-              <w:spacing w:after="0" w:line="240" w:lineRule="auto"/>
+              <w:spacing w:after="0" w:line="360" w:lineRule="auto"/>
               <w:rPr>
                 <w:rFonts w:ascii="Times New Roman" w:eastAsia="Times New Roman" w:hAnsi="Times New Roman" w:cs="Times New Roman"/>
                 <w:kern w:val="0"/>
@@ -3759,7 +3480,7 @@
           </w:tcPr>
           <w:p>
             <w:pPr>
-              <w:spacing w:after="0" w:line="240" w:lineRule="auto"/>
+              <w:spacing w:after="0" w:line="360" w:lineRule="auto"/>
               <w:rPr>
                 <w:rFonts w:ascii="Times New Roman" w:eastAsia="Times New Roman" w:hAnsi="Times New Roman" w:cs="Times New Roman"/>
                 <w:kern w:val="0"/>
@@ -3784,7 +3505,7 @@
           </w:tcPr>
           <w:p>
             <w:pPr>
-              <w:spacing w:after="0" w:line="240" w:lineRule="auto"/>
+              <w:spacing w:after="0" w:line="360" w:lineRule="auto"/>
               <w:rPr>
                 <w:rFonts w:ascii="Times New Roman" w:eastAsia="Times New Roman" w:hAnsi="Times New Roman" w:cs="Times New Roman"/>
                 <w:kern w:val="0"/>
@@ -3814,7 +3535,7 @@
           </w:tcPr>
           <w:p>
             <w:pPr>
-              <w:spacing w:after="0" w:line="240" w:lineRule="auto"/>
+              <w:spacing w:after="0" w:line="360" w:lineRule="auto"/>
               <w:rPr>
                 <w:rFonts w:ascii="Times New Roman" w:eastAsia="Times New Roman" w:hAnsi="Times New Roman" w:cs="Times New Roman"/>
                 <w:kern w:val="0"/>
@@ -3839,7 +3560,7 @@
           </w:tcPr>
           <w:p>
             <w:pPr>
-              <w:spacing w:after="0" w:line="240" w:lineRule="auto"/>
+              <w:spacing w:after="0" w:line="360" w:lineRule="auto"/>
               <w:rPr>
                 <w:rFonts w:ascii="Times New Roman" w:eastAsia="Times New Roman" w:hAnsi="Times New Roman" w:cs="Times New Roman"/>
                 <w:kern w:val="0"/>
@@ -3864,7 +3585,7 @@
           </w:tcPr>
           <w:p>
             <w:pPr>
-              <w:spacing w:after="0" w:line="240" w:lineRule="auto"/>
+              <w:spacing w:after="0" w:line="360" w:lineRule="auto"/>
               <w:rPr>
                 <w:rFonts w:ascii="Times New Roman" w:eastAsia="Times New Roman" w:hAnsi="Times New Roman" w:cs="Times New Roman"/>
                 <w:kern w:val="0"/>
@@ -3896,7 +3617,7 @@
           </w:tcPr>
           <w:p>
             <w:pPr>
-              <w:spacing w:after="0" w:line="240" w:lineRule="auto"/>
+              <w:spacing w:after="0" w:line="360" w:lineRule="auto"/>
               <w:rPr>
                 <w:rFonts w:ascii="Times New Roman" w:eastAsia="Times New Roman" w:hAnsi="Times New Roman" w:cs="Times New Roman"/>
                 <w:kern w:val="0"/>
@@ -3921,7 +3642,7 @@
           </w:tcPr>
           <w:p>
             <w:pPr>
-              <w:spacing w:after="0" w:line="240" w:lineRule="auto"/>
+              <w:spacing w:after="0" w:line="360" w:lineRule="auto"/>
               <w:rPr>
                 <w:rFonts w:ascii="Times New Roman" w:eastAsia="Times New Roman" w:hAnsi="Times New Roman" w:cs="Times New Roman"/>
                 <w:kern w:val="0"/>
@@ -3946,7 +3667,7 @@
           </w:tcPr>
           <w:p>
             <w:pPr>
-              <w:spacing w:after="0" w:line="240" w:lineRule="auto"/>
+              <w:spacing w:after="0" w:line="360" w:lineRule="auto"/>
               <w:rPr>
                 <w:rFonts w:ascii="Times New Roman" w:eastAsia="Times New Roman" w:hAnsi="Times New Roman" w:cs="Times New Roman"/>
                 <w:kern w:val="0"/>
@@ -3976,7 +3697,7 @@
           </w:tcPr>
           <w:p>
             <w:pPr>
-              <w:spacing w:after="0" w:line="240" w:lineRule="auto"/>
+              <w:spacing w:after="0" w:line="360" w:lineRule="auto"/>
               <w:rPr>
                 <w:rFonts w:ascii="Times New Roman" w:eastAsia="Times New Roman" w:hAnsi="Times New Roman" w:cs="Times New Roman"/>
                 <w:kern w:val="0"/>
@@ -4001,7 +3722,7 @@
           </w:tcPr>
           <w:p>
             <w:pPr>
-              <w:spacing w:after="0" w:line="240" w:lineRule="auto"/>
+              <w:spacing w:after="0" w:line="360" w:lineRule="auto"/>
               <w:rPr>
                 <w:rFonts w:ascii="Times New Roman" w:eastAsia="Times New Roman" w:hAnsi="Times New Roman" w:cs="Times New Roman"/>
                 <w:kern w:val="0"/>
@@ -4026,7 +3747,7 @@
           </w:tcPr>
           <w:p>
             <w:pPr>
-              <w:spacing w:after="0" w:line="240" w:lineRule="auto"/>
+              <w:spacing w:after="0" w:line="360" w:lineRule="auto"/>
               <w:rPr>
                 <w:rFonts w:ascii="Times New Roman" w:eastAsia="Times New Roman" w:hAnsi="Times New Roman" w:cs="Times New Roman"/>
                 <w:kern w:val="0"/>
@@ -4056,7 +3777,7 @@
           </w:tcPr>
           <w:p>
             <w:pPr>
-              <w:spacing w:after="0" w:line="240" w:lineRule="auto"/>
+              <w:spacing w:after="0" w:line="360" w:lineRule="auto"/>
               <w:rPr>
                 <w:rFonts w:ascii="Times New Roman" w:eastAsia="Times New Roman" w:hAnsi="Times New Roman" w:cs="Times New Roman"/>
                 <w:kern w:val="0"/>
@@ -4081,7 +3802,7 @@
           </w:tcPr>
           <w:p>
             <w:pPr>
-              <w:spacing w:after="0" w:line="240" w:lineRule="auto"/>
+              <w:spacing w:after="0" w:line="360" w:lineRule="auto"/>
               <w:rPr>
                 <w:rFonts w:ascii="Times New Roman" w:eastAsia="Times New Roman" w:hAnsi="Times New Roman" w:cs="Times New Roman"/>
                 <w:kern w:val="0"/>
@@ -4106,7 +3827,7 @@
           </w:tcPr>
           <w:p>
             <w:pPr>
-              <w:spacing w:after="0" w:line="240" w:lineRule="auto"/>
+              <w:spacing w:after="0" w:line="360" w:lineRule="auto"/>
               <w:rPr>
                 <w:rFonts w:ascii="Times New Roman" w:eastAsia="Times New Roman" w:hAnsi="Times New Roman" w:cs="Times New Roman"/>
                 <w:kern w:val="0"/>
@@ -4136,7 +3857,7 @@
           </w:tcPr>
           <w:p>
             <w:pPr>
-              <w:spacing w:after="0" w:line="240" w:lineRule="auto"/>
+              <w:spacing w:after="0" w:line="360" w:lineRule="auto"/>
               <w:rPr>
                 <w:rFonts w:ascii="Times New Roman" w:eastAsia="Times New Roman" w:hAnsi="Times New Roman" w:cs="Times New Roman"/>
                 <w:kern w:val="0"/>
@@ -4161,7 +3882,7 @@
           </w:tcPr>
           <w:p>
             <w:pPr>
-              <w:spacing w:after="0" w:line="240" w:lineRule="auto"/>
+              <w:spacing w:after="0" w:line="360" w:lineRule="auto"/>
               <w:rPr>
                 <w:rFonts w:ascii="Times New Roman" w:eastAsia="Times New Roman" w:hAnsi="Times New Roman" w:cs="Times New Roman"/>
                 <w:kern w:val="0"/>
@@ -4186,7 +3907,7 @@
           </w:tcPr>
           <w:p>
             <w:pPr>
-              <w:spacing w:after="0" w:line="240" w:lineRule="auto"/>
+              <w:spacing w:after="0" w:line="360" w:lineRule="auto"/>
               <w:rPr>
                 <w:rFonts w:ascii="Times New Roman" w:eastAsia="Times New Roman" w:hAnsi="Times New Roman" w:cs="Times New Roman"/>
                 <w:kern w:val="0"/>
@@ -4216,7 +3937,7 @@
           </w:tcPr>
           <w:p>
             <w:pPr>
-              <w:spacing w:after="0" w:line="240" w:lineRule="auto"/>
+              <w:spacing w:after="0" w:line="360" w:lineRule="auto"/>
               <w:rPr>
                 <w:rFonts w:ascii="Times New Roman" w:eastAsia="Times New Roman" w:hAnsi="Times New Roman" w:cs="Times New Roman"/>
                 <w:kern w:val="0"/>
@@ -4241,7 +3962,7 @@
           </w:tcPr>
           <w:p>
             <w:pPr>
-              <w:spacing w:after="0" w:line="240" w:lineRule="auto"/>
+              <w:spacing w:after="0" w:line="360" w:lineRule="auto"/>
               <w:rPr>
                 <w:rFonts w:ascii="Times New Roman" w:eastAsia="Times New Roman" w:hAnsi="Times New Roman" w:cs="Times New Roman"/>
                 <w:kern w:val="0"/>
@@ -4266,7 +3987,7 @@
           </w:tcPr>
           <w:p>
             <w:pPr>
-              <w:spacing w:after="0" w:line="240" w:lineRule="auto"/>
+              <w:spacing w:after="0" w:line="360" w:lineRule="auto"/>
               <w:rPr>
                 <w:rFonts w:ascii="Times New Roman" w:eastAsia="Times New Roman" w:hAnsi="Times New Roman" w:cs="Times New Roman"/>
                 <w:kern w:val="0"/>
@@ -4296,7 +4017,7 @@
           </w:tcPr>
           <w:p>
             <w:pPr>
-              <w:spacing w:after="0" w:line="240" w:lineRule="auto"/>
+              <w:spacing w:after="0" w:line="360" w:lineRule="auto"/>
               <w:rPr>
                 <w:rFonts w:ascii="Times New Roman" w:eastAsia="Times New Roman" w:hAnsi="Times New Roman" w:cs="Times New Roman"/>
                 <w:kern w:val="0"/>
@@ -4321,7 +4042,7 @@
           </w:tcPr>
           <w:p>
             <w:pPr>
-              <w:spacing w:after="0" w:line="240" w:lineRule="auto"/>
+              <w:spacing w:after="0" w:line="360" w:lineRule="auto"/>
               <w:rPr>
                 <w:rFonts w:ascii="Times New Roman" w:eastAsia="Times New Roman" w:hAnsi="Times New Roman" w:cs="Times New Roman"/>
                 <w:kern w:val="0"/>
@@ -4347,7 +4068,7 @@
           <w:p>
             <w:pPr>
               <w:keepNext/>
-              <w:spacing w:after="0" w:line="240" w:lineRule="auto"/>
+              <w:spacing w:after="0" w:line="360" w:lineRule="auto"/>
               <w:rPr>
                 <w:rFonts w:ascii="Times New Roman" w:eastAsia="Times New Roman" w:hAnsi="Times New Roman" w:cs="Times New Roman"/>
                 <w:kern w:val="0"/>
@@ -4369,6 +4090,7 @@
     <w:p>
       <w:pPr>
         <w:pStyle w:val="Caption"/>
+        <w:spacing w:line="360" w:lineRule="auto"/>
       </w:pPr>
     </w:p>
     <w:p>
@@ -4381,6 +4103,7 @@
     </w:p>
     <w:p>
       <w:pPr>
+        <w:spacing w:line="360" w:lineRule="auto"/>
         <w:rPr>
           <w:rFonts w:ascii="Times New Roman" w:hAnsi="Times New Roman" w:cs="Times New Roman"/>
         </w:rPr>
@@ -4544,6 +4267,7 @@
     </w:p>
     <w:p>
       <w:pPr>
+        <w:spacing w:line="360" w:lineRule="auto"/>
         <w:rPr>
           <w:rFonts w:ascii="Times New Roman" w:hAnsi="Times New Roman" w:cs="Times New Roman"/>
         </w:rPr>
@@ -4588,7 +4312,14 @@
         <w:rPr>
           <w:rFonts w:ascii="Times New Roman" w:hAnsi="Times New Roman" w:cs="Times New Roman"/>
         </w:rPr>
-        <w:t>"I possess a valid credential and the age attribute satisfies the required threshold"</w:t>
+        <w:t xml:space="preserve">"I </w:t>
+      </w:r>
+      <w:r>
+        <w:rPr>
+          <w:rFonts w:ascii="Times New Roman" w:hAnsi="Times New Roman" w:cs="Times New Roman"/>
+        </w:rPr>
+        <w:lastRenderedPageBreak/>
+        <w:t>possess a valid credential and the age attribute satisfies the required threshold"</w:t>
       </w:r>
       <w:r>
         <w:rPr>
@@ -4649,6 +4380,7 @@
     </w:p>
     <w:p>
       <w:pPr>
+        <w:spacing w:line="360" w:lineRule="auto"/>
         <w:rPr>
           <w:rFonts w:ascii="Times New Roman" w:hAnsi="Times New Roman" w:cs="Times New Roman"/>
         </w:rPr>
@@ -4723,14 +4455,7 @@
         <w:rPr>
           <w:rFonts w:ascii="Times New Roman" w:hAnsi="Times New Roman" w:cs="Times New Roman"/>
         </w:rPr>
-        <w:t xml:space="preserve"> will </w:t>
-      </w:r>
-      <w:r>
-        <w:rPr>
-          <w:rFonts w:ascii="Times New Roman" w:hAnsi="Times New Roman" w:cs="Times New Roman"/>
-        </w:rPr>
-        <w:lastRenderedPageBreak/>
-        <w:t>have e</w:t>
+        <w:t xml:space="preserve"> will have e</w:t>
       </w:r>
       <w:r>
         <w:rPr>
@@ -4873,6 +4598,7 @@
     </w:p>
     <w:p>
       <w:pPr>
+        <w:spacing w:line="360" w:lineRule="auto"/>
         <w:rPr>
           <w:rFonts w:ascii="Times New Roman" w:hAnsi="Times New Roman" w:cs="Times New Roman"/>
         </w:rPr>
@@ -4894,6 +4620,7 @@
     </w:p>
     <w:p>
       <w:pPr>
+        <w:spacing w:line="360" w:lineRule="auto"/>
         <w:rPr>
           <w:rFonts w:ascii="Times New Roman" w:hAnsi="Times New Roman" w:cs="Times New Roman"/>
         </w:rPr>
@@ -4942,6 +4669,7 @@
           <w:ilvl w:val="0"/>
           <w:numId w:val="5"/>
         </w:numPr>
+        <w:spacing w:line="360" w:lineRule="auto"/>
         <w:rPr>
           <w:rFonts w:ascii="Times New Roman" w:hAnsi="Times New Roman" w:cs="Times New Roman"/>
         </w:rPr>
@@ -4958,31 +4686,7 @@
         <w:rPr>
           <w:rFonts w:ascii="Times New Roman" w:hAnsi="Times New Roman" w:cs="Times New Roman"/>
         </w:rPr>
-        <w:t xml:space="preserve"> (</w:t>
-      </w:r>
-      <w:r>
-        <w:rPr>
-          <w:rFonts w:ascii="Times New Roman" w:hAnsi="Times New Roman" w:cs="Times New Roman"/>
-        </w:rPr>
-        <w:t>age</w:t>
-      </w:r>
-      <w:r>
-        <w:rPr>
-          <w:rFonts w:ascii="Times New Roman" w:hAnsi="Times New Roman" w:cs="Times New Roman"/>
-        </w:rPr>
-        <w:t xml:space="preserve">, </w:t>
-      </w:r>
-      <w:r>
-        <w:rPr>
-          <w:rFonts w:ascii="Times New Roman" w:hAnsi="Times New Roman" w:cs="Times New Roman"/>
-        </w:rPr>
-        <w:t>qualification</w:t>
-      </w:r>
-      <w:r>
-        <w:rPr>
-          <w:rFonts w:ascii="Times New Roman" w:hAnsi="Times New Roman" w:cs="Times New Roman"/>
-        </w:rPr>
-        <w:t xml:space="preserve">, </w:t>
+        <w:t xml:space="preserve"> (age, qualification, </w:t>
       </w:r>
       <w:proofErr w:type="spellStart"/>
       <w:r>
@@ -5006,6 +4710,7 @@
           <w:ilvl w:val="0"/>
           <w:numId w:val="5"/>
         </w:numPr>
+        <w:spacing w:line="360" w:lineRule="auto"/>
         <w:rPr>
           <w:rFonts w:ascii="Times New Roman" w:hAnsi="Times New Roman" w:cs="Times New Roman"/>
         </w:rPr>
@@ -5074,6 +4779,7 @@
           <w:ilvl w:val="0"/>
           <w:numId w:val="5"/>
         </w:numPr>
+        <w:spacing w:line="360" w:lineRule="auto"/>
         <w:rPr>
           <w:rFonts w:ascii="Times New Roman" w:hAnsi="Times New Roman" w:cs="Times New Roman"/>
         </w:rPr>
@@ -5163,6 +4869,7 @@
     </w:p>
     <w:p>
       <w:pPr>
+        <w:spacing w:line="360" w:lineRule="auto"/>
         <w:rPr>
           <w:rFonts w:ascii="Times New Roman" w:hAnsi="Times New Roman" w:cs="Times New Roman"/>
         </w:rPr>
@@ -5196,6 +4903,7 @@
     </w:p>
     <w:p>
       <w:pPr>
+        <w:spacing w:line="360" w:lineRule="auto"/>
         <w:rPr>
           <w:rFonts w:ascii="Times New Roman" w:hAnsi="Times New Roman" w:cs="Times New Roman"/>
         </w:rPr>
@@ -5232,14 +4940,16 @@
           <w:ilvl w:val="0"/>
           <w:numId w:val="6"/>
         </w:numPr>
-        <w:rPr>
-          <w:rFonts w:ascii="Times New Roman" w:hAnsi="Times New Roman" w:cs="Times New Roman"/>
-        </w:rPr>
-      </w:pPr>
-      <w:r>
-        <w:rPr>
-          <w:rFonts w:ascii="Times New Roman" w:hAnsi="Times New Roman" w:cs="Times New Roman"/>
-        </w:rPr>
+        <w:spacing w:line="360" w:lineRule="auto"/>
+        <w:rPr>
+          <w:rFonts w:ascii="Times New Roman" w:hAnsi="Times New Roman" w:cs="Times New Roman"/>
+        </w:rPr>
+      </w:pPr>
+      <w:r>
+        <w:rPr>
+          <w:rFonts w:ascii="Times New Roman" w:hAnsi="Times New Roman" w:cs="Times New Roman"/>
+        </w:rPr>
+        <w:lastRenderedPageBreak/>
         <w:t>Prepare input</w:t>
       </w:r>
       <w:r>
@@ -5262,6 +4972,7 @@
           <w:ilvl w:val="0"/>
           <w:numId w:val="6"/>
         </w:numPr>
+        <w:spacing w:line="360" w:lineRule="auto"/>
         <w:rPr>
           <w:rFonts w:ascii="Times New Roman" w:hAnsi="Times New Roman" w:cs="Times New Roman"/>
         </w:rPr>
@@ -5304,6 +5015,7 @@
           <w:ilvl w:val="0"/>
           <w:numId w:val="6"/>
         </w:numPr>
+        <w:spacing w:line="360" w:lineRule="auto"/>
         <w:rPr>
           <w:rFonts w:ascii="Times New Roman" w:hAnsi="Times New Roman" w:cs="Times New Roman"/>
         </w:rPr>
@@ -5334,6 +5046,7 @@
           <w:ilvl w:val="0"/>
           <w:numId w:val="6"/>
         </w:numPr>
+        <w:spacing w:line="360" w:lineRule="auto"/>
         <w:rPr>
           <w:rFonts w:ascii="Times New Roman" w:hAnsi="Times New Roman" w:cs="Times New Roman"/>
         </w:rPr>
@@ -5359,6 +5072,7 @@
     </w:p>
     <w:p>
       <w:pPr>
+        <w:spacing w:line="360" w:lineRule="auto"/>
         <w:ind w:left="360"/>
         <w:rPr>
           <w:rFonts w:ascii="Times New Roman" w:hAnsi="Times New Roman" w:cs="Times New Roman"/>
@@ -5462,6 +5176,7 @@
           <w:ilvl w:val="0"/>
           <w:numId w:val="6"/>
         </w:numPr>
+        <w:spacing w:line="360" w:lineRule="auto"/>
         <w:rPr>
           <w:rFonts w:ascii="Times New Roman" w:hAnsi="Times New Roman" w:cs="Times New Roman"/>
         </w:rPr>
@@ -5504,6 +5219,7 @@
           <w:ilvl w:val="0"/>
           <w:numId w:val="6"/>
         </w:numPr>
+        <w:spacing w:line="360" w:lineRule="auto"/>
         <w:rPr>
           <w:rFonts w:ascii="Times New Roman" w:hAnsi="Times New Roman" w:cs="Times New Roman"/>
         </w:rPr>
@@ -5534,6 +5250,7 @@
           <w:ilvl w:val="0"/>
           <w:numId w:val="6"/>
         </w:numPr>
+        <w:spacing w:line="360" w:lineRule="auto"/>
         <w:rPr>
           <w:rFonts w:ascii="Times New Roman" w:hAnsi="Times New Roman" w:cs="Times New Roman"/>
         </w:rPr>
@@ -5547,6 +5264,7 @@
     </w:p>
     <w:p>
       <w:pPr>
+        <w:spacing w:line="360" w:lineRule="auto"/>
         <w:ind w:left="360"/>
         <w:rPr>
           <w:rFonts w:ascii="Times New Roman" w:hAnsi="Times New Roman" w:cs="Times New Roman"/>
@@ -5556,7 +5274,6 @@
         <w:rPr>
           <w:rFonts w:ascii="Times New Roman" w:hAnsi="Times New Roman" w:cs="Times New Roman"/>
         </w:rPr>
-        <w:lastRenderedPageBreak/>
         <w:t>The following will be collected</w:t>
       </w:r>
       <w:r>
@@ -5615,6 +5332,7 @@
           <w:ilvl w:val="0"/>
           <w:numId w:val="6"/>
         </w:numPr>
+        <w:spacing w:line="360" w:lineRule="auto"/>
         <w:rPr>
           <w:rFonts w:ascii="Times New Roman" w:hAnsi="Times New Roman" w:cs="Times New Roman"/>
         </w:rPr>
@@ -5628,6 +5346,7 @@
     </w:p>
     <w:p>
       <w:pPr>
+        <w:spacing w:line="360" w:lineRule="auto"/>
         <w:rPr>
           <w:rFonts w:ascii="Times New Roman" w:hAnsi="Times New Roman" w:cs="Times New Roman"/>
         </w:rPr>
@@ -5643,6 +5362,7 @@
     </w:p>
     <w:p>
       <w:pPr>
+        <w:spacing w:line="360" w:lineRule="auto"/>
         <w:rPr>
           <w:rFonts w:ascii="Times New Roman" w:hAnsi="Times New Roman" w:cs="Times New Roman"/>
         </w:rPr>
@@ -5663,42 +5383,26 @@
         <w:rPr>
           <w:rFonts w:ascii="Times New Roman" w:hAnsi="Times New Roman" w:cs="Times New Roman"/>
         </w:rPr>
-        <w:t>A reasonable starting design would be:</w:t>
-      </w:r>
-    </w:p>
-    <w:p>
-      <w:pPr>
-        <w:rPr>
-          <w:rFonts w:ascii="Times New Roman" w:hAnsi="Times New Roman" w:cs="Times New Roman"/>
-        </w:rPr>
-      </w:pPr>
-    </w:p>
-    <w:p>
-      <w:pPr>
-        <w:rPr>
-          <w:rFonts w:ascii="Times New Roman" w:hAnsi="Times New Roman" w:cs="Times New Roman"/>
-        </w:rPr>
-      </w:pPr>
+        <w:t>A reasonable starting design would be</w:t>
+      </w:r>
+      <w:r>
+        <w:rPr>
+          <w:rFonts w:ascii="Times New Roman" w:hAnsi="Times New Roman" w:cs="Times New Roman"/>
+        </w:rPr>
+        <w:t xml:space="preserve"> </w:t>
+      </w:r>
       <w:r>
         <w:rPr>
           <w:rFonts w:ascii="Times New Roman" w:hAnsi="Times New Roman" w:cs="Times New Roman"/>
         </w:rPr>
         <w:t>30 successful executions per scenario</w:t>
       </w:r>
-    </w:p>
-    <w:p>
-      <w:pPr>
-        <w:rPr>
-          <w:rFonts w:ascii="Times New Roman" w:hAnsi="Times New Roman" w:cs="Times New Roman"/>
-        </w:rPr>
-      </w:pPr>
-    </w:p>
-    <w:p>
-      <w:pPr>
-        <w:rPr>
-          <w:rFonts w:ascii="Times New Roman" w:hAnsi="Times New Roman" w:cs="Times New Roman"/>
-        </w:rPr>
-      </w:pPr>
+      <w:r>
+        <w:rPr>
+          <w:rFonts w:ascii="Times New Roman" w:hAnsi="Times New Roman" w:cs="Times New Roman"/>
+        </w:rPr>
+        <w:t xml:space="preserve"> </w:t>
+      </w:r>
       <w:r>
         <w:rPr>
           <w:rFonts w:ascii="Times New Roman" w:hAnsi="Times New Roman" w:cs="Times New Roman"/>
@@ -5708,37 +5412,23 @@
     </w:p>
     <w:p>
       <w:pPr>
-        <w:rPr>
-          <w:rFonts w:ascii="Times New Roman" w:hAnsi="Times New Roman" w:cs="Times New Roman"/>
-        </w:rPr>
-      </w:pPr>
-    </w:p>
-    <w:p>
-      <w:pPr>
-        <w:rPr>
-          <w:rFonts w:ascii="Times New Roman" w:hAnsi="Times New Roman" w:cs="Times New Roman"/>
-        </w:rPr>
-      </w:pPr>
-      <w:r>
-        <w:rPr>
-          <w:rFonts w:ascii="Times New Roman" w:hAnsi="Times New Roman" w:cs="Times New Roman"/>
-        </w:rPr>
-        <w:t>This would produce:</w:t>
-      </w:r>
-    </w:p>
-    <w:p>
-      <w:pPr>
-        <w:rPr>
-          <w:rFonts w:ascii="Times New Roman" w:hAnsi="Times New Roman" w:cs="Times New Roman"/>
-        </w:rPr>
-      </w:pPr>
-    </w:p>
-    <w:p>
-      <w:pPr>
-        <w:rPr>
-          <w:rFonts w:ascii="Times New Roman" w:hAnsi="Times New Roman" w:cs="Times New Roman"/>
-        </w:rPr>
-      </w:pPr>
+        <w:spacing w:line="360" w:lineRule="auto"/>
+        <w:rPr>
+          <w:rFonts w:ascii="Times New Roman" w:hAnsi="Times New Roman" w:cs="Times New Roman"/>
+        </w:rPr>
+      </w:pPr>
+      <w:r>
+        <w:rPr>
+          <w:rFonts w:ascii="Times New Roman" w:hAnsi="Times New Roman" w:cs="Times New Roman"/>
+        </w:rPr>
+        <w:t>This would produce</w:t>
+      </w:r>
+      <w:r>
+        <w:rPr>
+          <w:rFonts w:ascii="Times New Roman" w:hAnsi="Times New Roman" w:cs="Times New Roman"/>
+        </w:rPr>
+        <w:t xml:space="preserve"> </w:t>
+      </w:r>
       <w:r>
         <w:rPr>
           <w:rFonts w:ascii="Times New Roman" w:hAnsi="Times New Roman" w:cs="Times New Roman"/>
@@ -5748,13 +5438,7 @@
     </w:p>
     <w:p>
       <w:pPr>
-        <w:rPr>
-          <w:rFonts w:ascii="Times New Roman" w:hAnsi="Times New Roman" w:cs="Times New Roman"/>
-        </w:rPr>
-      </w:pPr>
-    </w:p>
-    <w:p>
-      <w:pPr>
+        <w:spacing w:line="360" w:lineRule="auto"/>
         <w:rPr>
           <w:rFonts w:ascii="Times New Roman" w:hAnsi="Times New Roman" w:cs="Times New Roman"/>
         </w:rPr>
@@ -5765,40 +5449,24 @@
         </w:rPr>
         <w:t>However, this number should be treated as a methodological target rather than a fixed requirement.</w:t>
       </w:r>
-    </w:p>
-    <w:p>
-      <w:pPr>
-        <w:rPr>
-          <w:rFonts w:ascii="Times New Roman" w:hAnsi="Times New Roman" w:cs="Times New Roman"/>
-        </w:rPr>
-      </w:pPr>
-    </w:p>
-    <w:p>
-      <w:pPr>
-        <w:rPr>
-          <w:rFonts w:ascii="Times New Roman" w:hAnsi="Times New Roman" w:cs="Times New Roman"/>
-        </w:rPr>
-      </w:pPr>
+      <w:r>
+        <w:rPr>
+          <w:rFonts w:ascii="Times New Roman" w:hAnsi="Times New Roman" w:cs="Times New Roman"/>
+        </w:rPr>
+        <w:t xml:space="preserve"> </w:t>
+      </w:r>
       <w:r>
         <w:rPr>
           <w:rFonts w:ascii="Times New Roman" w:hAnsi="Times New Roman" w:cs="Times New Roman"/>
         </w:rPr>
         <w:t>If the proving process is computationally expensive, a pilot study can determine an appropriate number of repetitions.</w:t>
       </w:r>
-    </w:p>
-    <w:p>
-      <w:pPr>
-        <w:rPr>
-          <w:rFonts w:ascii="Times New Roman" w:hAnsi="Times New Roman" w:cs="Times New Roman"/>
-        </w:rPr>
-      </w:pPr>
-    </w:p>
-    <w:p>
-      <w:pPr>
-        <w:rPr>
-          <w:rFonts w:ascii="Times New Roman" w:hAnsi="Times New Roman" w:cs="Times New Roman"/>
-        </w:rPr>
-      </w:pPr>
+      <w:r>
+        <w:rPr>
+          <w:rFonts w:ascii="Times New Roman" w:hAnsi="Times New Roman" w:cs="Times New Roman"/>
+        </w:rPr>
+        <w:t xml:space="preserve"> </w:t>
+      </w:r>
       <w:r>
         <w:rPr>
           <w:rFonts w:ascii="Times New Roman" w:hAnsi="Times New Roman" w:cs="Times New Roman"/>
@@ -5808,230 +5476,1043 @@
     </w:p>
     <w:p>
       <w:pPr>
-        <w:rPr>
-          <w:rFonts w:ascii="Times New Roman" w:hAnsi="Times New Roman" w:cs="Times New Roman"/>
-        </w:rPr>
-      </w:pPr>
-    </w:p>
-    <w:p>
-      <w:pPr>
-        <w:rPr>
-          <w:rFonts w:ascii="Times New Roman" w:hAnsi="Times New Roman" w:cs="Times New Roman"/>
-        </w:rPr>
-      </w:pPr>
-      <w:r>
-        <w:rPr>
-          <w:rFonts w:ascii="Times New Roman" w:hAnsi="Times New Roman" w:cs="Times New Roman"/>
-        </w:rPr>
+        <w:pStyle w:val="Heading3"/>
+      </w:pPr>
+      <w:r>
+        <w:lastRenderedPageBreak/>
         <w:t>3.17 Warm-Up and Measurement Procedure</w:t>
       </w:r>
     </w:p>
     <w:p>
       <w:pPr>
-        <w:rPr>
-          <w:rFonts w:ascii="Times New Roman" w:hAnsi="Times New Roman" w:cs="Times New Roman"/>
-        </w:rPr>
-      </w:pPr>
-    </w:p>
-    <w:p>
-      <w:pPr>
-        <w:rPr>
-          <w:rFonts w:ascii="Times New Roman" w:hAnsi="Times New Roman" w:cs="Times New Roman"/>
-        </w:rPr>
-      </w:pPr>
-      <w:r>
-        <w:rPr>
-          <w:rFonts w:ascii="Times New Roman" w:hAnsi="Times New Roman" w:cs="Times New Roman"/>
-        </w:rPr>
-        <w:t>To improve measurement consistency:</w:t>
-      </w:r>
-    </w:p>
-    <w:p>
-      <w:pPr>
-        <w:rPr>
-          <w:rFonts w:ascii="Times New Roman" w:hAnsi="Times New Roman" w:cs="Times New Roman"/>
-        </w:rPr>
-      </w:pPr>
-    </w:p>
-    <w:p>
-      <w:pPr>
-        <w:rPr>
-          <w:rFonts w:ascii="Times New Roman" w:hAnsi="Times New Roman" w:cs="Times New Roman"/>
-        </w:rPr>
-      </w:pPr>
-      <w:r>
-        <w:rPr>
-          <w:rFonts w:ascii="Times New Roman" w:hAnsi="Times New Roman" w:cs="Times New Roman"/>
-        </w:rPr>
+        <w:spacing w:line="360" w:lineRule="auto"/>
+        <w:rPr>
+          <w:rFonts w:ascii="Times New Roman" w:hAnsi="Times New Roman" w:cs="Times New Roman"/>
+        </w:rPr>
+      </w:pPr>
+      <w:r>
+        <w:rPr>
+          <w:rFonts w:ascii="Times New Roman" w:hAnsi="Times New Roman" w:cs="Times New Roman"/>
+        </w:rPr>
+        <w:t>To improve measurement consistency</w:t>
+      </w:r>
+      <w:r>
+        <w:rPr>
+          <w:rFonts w:ascii="Times New Roman" w:hAnsi="Times New Roman" w:cs="Times New Roman"/>
+        </w:rPr>
+        <w:t>;</w:t>
+      </w:r>
+      <w:r>
+        <w:rPr>
+          <w:rFonts w:ascii="Times New Roman" w:hAnsi="Times New Roman" w:cs="Times New Roman"/>
+        </w:rPr>
+        <w:t xml:space="preserve"> </w:t>
+      </w:r>
+    </w:p>
+    <w:p>
+      <w:pPr>
+        <w:pStyle w:val="ListParagraph"/>
+        <w:numPr>
+          <w:ilvl w:val="0"/>
+          <w:numId w:val="9"/>
+        </w:numPr>
+        <w:spacing w:line="360" w:lineRule="auto"/>
+        <w:rPr>
+          <w:rFonts w:ascii="Times New Roman" w:hAnsi="Times New Roman" w:cs="Times New Roman"/>
+        </w:rPr>
+      </w:pPr>
+      <w:r>
+        <w:rPr>
+          <w:rFonts w:ascii="Times New Roman" w:hAnsi="Times New Roman" w:cs="Times New Roman"/>
+        </w:rPr>
+        <w:t>the system will be started in a known state;</w:t>
+      </w:r>
+    </w:p>
+    <w:p>
+      <w:pPr>
+        <w:pStyle w:val="ListParagraph"/>
+        <w:numPr>
+          <w:ilvl w:val="0"/>
+          <w:numId w:val="9"/>
+        </w:numPr>
+        <w:spacing w:line="360" w:lineRule="auto"/>
+        <w:rPr>
+          <w:rFonts w:ascii="Times New Roman" w:hAnsi="Times New Roman" w:cs="Times New Roman"/>
+        </w:rPr>
+      </w:pPr>
+      <w:r>
+        <w:rPr>
+          <w:rFonts w:ascii="Times New Roman" w:hAnsi="Times New Roman" w:cs="Times New Roman"/>
+        </w:rPr>
+        <w:t xml:space="preserve">background applications will be </w:t>
+      </w:r>
+      <w:r>
+        <w:rPr>
+          <w:rFonts w:ascii="Times New Roman" w:hAnsi="Times New Roman" w:cs="Times New Roman"/>
+        </w:rPr>
+        <w:t>minimized</w:t>
+      </w:r>
+      <w:r>
+        <w:rPr>
+          <w:rFonts w:ascii="Times New Roman" w:hAnsi="Times New Roman" w:cs="Times New Roman"/>
+        </w:rPr>
+        <w:t>;</w:t>
+      </w:r>
+    </w:p>
+    <w:p>
+      <w:pPr>
+        <w:pStyle w:val="ListParagraph"/>
+        <w:numPr>
+          <w:ilvl w:val="0"/>
+          <w:numId w:val="9"/>
+        </w:numPr>
+        <w:spacing w:line="360" w:lineRule="auto"/>
+        <w:rPr>
+          <w:rFonts w:ascii="Times New Roman" w:hAnsi="Times New Roman" w:cs="Times New Roman"/>
+        </w:rPr>
+      </w:pPr>
+      <w:r>
+        <w:rPr>
+          <w:rFonts w:ascii="Times New Roman" w:hAnsi="Times New Roman" w:cs="Times New Roman"/>
+        </w:rPr>
+        <w:t>warm-up executions will be performed where appropriate;</w:t>
+      </w:r>
+    </w:p>
+    <w:p>
+      <w:pPr>
+        <w:pStyle w:val="ListParagraph"/>
+        <w:numPr>
+          <w:ilvl w:val="0"/>
+          <w:numId w:val="9"/>
+        </w:numPr>
+        <w:spacing w:line="360" w:lineRule="auto"/>
+        <w:rPr>
+          <w:rFonts w:ascii="Times New Roman" w:hAnsi="Times New Roman" w:cs="Times New Roman"/>
+        </w:rPr>
+      </w:pPr>
+      <w:r>
+        <w:rPr>
+          <w:rFonts w:ascii="Times New Roman" w:hAnsi="Times New Roman" w:cs="Times New Roman"/>
+        </w:rPr>
+        <w:t xml:space="preserve">measurements will begin after the environment has </w:t>
+      </w:r>
+      <w:r>
+        <w:rPr>
+          <w:rFonts w:ascii="Times New Roman" w:hAnsi="Times New Roman" w:cs="Times New Roman"/>
+        </w:rPr>
+        <w:t>stabilized</w:t>
+      </w:r>
+      <w:r>
+        <w:rPr>
+          <w:rFonts w:ascii="Times New Roman" w:hAnsi="Times New Roman" w:cs="Times New Roman"/>
+        </w:rPr>
+        <w:t>;</w:t>
+      </w:r>
+    </w:p>
+    <w:p>
+      <w:pPr>
+        <w:pStyle w:val="ListParagraph"/>
+        <w:numPr>
+          <w:ilvl w:val="0"/>
+          <w:numId w:val="9"/>
+        </w:numPr>
+        <w:spacing w:line="360" w:lineRule="auto"/>
+        <w:rPr>
+          <w:rFonts w:ascii="Times New Roman" w:hAnsi="Times New Roman" w:cs="Times New Roman"/>
+        </w:rPr>
+      </w:pPr>
+      <w:r>
+        <w:rPr>
+          <w:rFonts w:ascii="Times New Roman" w:hAnsi="Times New Roman" w:cs="Times New Roman"/>
+        </w:rPr>
+        <w:t>each execution will be independently recorded;</w:t>
+      </w:r>
+    </w:p>
+    <w:p>
+      <w:pPr>
+        <w:pStyle w:val="ListParagraph"/>
+        <w:numPr>
+          <w:ilvl w:val="0"/>
+          <w:numId w:val="9"/>
+        </w:numPr>
+        <w:spacing w:line="360" w:lineRule="auto"/>
+        <w:rPr>
+          <w:rFonts w:ascii="Times New Roman" w:hAnsi="Times New Roman" w:cs="Times New Roman"/>
+        </w:rPr>
+      </w:pPr>
+      <w:r>
+        <w:rPr>
+          <w:rFonts w:ascii="Times New Roman" w:hAnsi="Times New Roman" w:cs="Times New Roman"/>
+        </w:rPr>
+        <w:t>failed executions will be recorded rather than silently discarded;</w:t>
+      </w:r>
+    </w:p>
+    <w:p>
+      <w:pPr>
+        <w:pStyle w:val="ListParagraph"/>
+        <w:numPr>
+          <w:ilvl w:val="0"/>
+          <w:numId w:val="9"/>
+        </w:numPr>
+        <w:spacing w:line="360" w:lineRule="auto"/>
+        <w:rPr>
+          <w:rFonts w:ascii="Times New Roman" w:hAnsi="Times New Roman" w:cs="Times New Roman"/>
+        </w:rPr>
+      </w:pPr>
+      <w:r>
+        <w:rPr>
+          <w:rFonts w:ascii="Times New Roman" w:hAnsi="Times New Roman" w:cs="Times New Roman"/>
+        </w:rPr>
+        <w:t>abnormal executions will be investigated before removal.</w:t>
+      </w:r>
+    </w:p>
+    <w:p>
+      <w:pPr>
+        <w:spacing w:line="360" w:lineRule="auto"/>
+        <w:rPr>
+          <w:rFonts w:ascii="Times New Roman" w:hAnsi="Times New Roman" w:cs="Times New Roman"/>
+        </w:rPr>
+      </w:pPr>
+      <w:r>
+        <w:rPr>
+          <w:rFonts w:ascii="Times New Roman" w:hAnsi="Times New Roman" w:cs="Times New Roman"/>
+        </w:rPr>
+        <w:t>The reason for recording failures is important.</w:t>
+      </w:r>
+      <w:r>
+        <w:rPr>
+          <w:rFonts w:ascii="Times New Roman" w:hAnsi="Times New Roman" w:cs="Times New Roman"/>
+        </w:rPr>
+        <w:t xml:space="preserve"> </w:t>
+      </w:r>
+      <w:r>
+        <w:rPr>
+          <w:rFonts w:ascii="Times New Roman" w:hAnsi="Times New Roman" w:cs="Times New Roman"/>
+        </w:rPr>
+        <w:t>A failure can itself be evidence of a scalability or resource limitation.</w:t>
+      </w:r>
+    </w:p>
+    <w:p>
+      <w:pPr>
+        <w:pStyle w:val="Heading3"/>
+      </w:pPr>
+      <w:r>
+        <w:t>3.18 Performance Measurement</w:t>
+      </w:r>
+    </w:p>
+    <w:p>
+      <w:pPr>
+        <w:pStyle w:val="Heading3"/>
+      </w:pPr>
+      <w:r>
+        <w:t>3.18.1 Proof Generation</w:t>
+      </w:r>
+    </w:p>
+    <w:p>
+      <w:pPr>
+        <w:spacing w:line="360" w:lineRule="auto"/>
+        <w:rPr>
+          <w:rFonts w:ascii="Times New Roman" w:hAnsi="Times New Roman" w:cs="Times New Roman"/>
+          <w:b/>
+          <w:bCs/>
+          <w:i/>
+          <w:iCs/>
+        </w:rPr>
+      </w:pPr>
+      <w:r>
+        <w:rPr>
+          <w:rFonts w:ascii="Times New Roman" w:hAnsi="Times New Roman" w:cs="Times New Roman"/>
+        </w:rPr>
+        <w:t>Proof-generation time will be calculated as</w:t>
+      </w:r>
+      <w:r>
+        <w:rPr>
+          <w:rFonts w:ascii="Times New Roman" w:hAnsi="Times New Roman" w:cs="Times New Roman"/>
+        </w:rPr>
+        <w:t xml:space="preserve"> </w:t>
+      </w:r>
+      <w:proofErr w:type="spellStart"/>
+      <w:r>
+        <w:rPr>
+          <w:rFonts w:ascii="Times New Roman" w:hAnsi="Times New Roman" w:cs="Times New Roman"/>
+          <w:b/>
+          <w:bCs/>
+          <w:i/>
+          <w:iCs/>
+        </w:rPr>
+        <w:t>T</w:t>
+      </w:r>
+      <w:r>
+        <w:rPr>
+          <w:rFonts w:ascii="Times New Roman" w:hAnsi="Times New Roman" w:cs="Times New Roman"/>
+          <w:b/>
+          <w:bCs/>
+          <w:i/>
+          <w:iCs/>
+          <w:vertAlign w:val="subscript"/>
+        </w:rPr>
+        <w:t>p</w:t>
+      </w:r>
+      <w:proofErr w:type="spellEnd"/>
+      <w:r>
+        <w:rPr>
+          <w:rFonts w:ascii="Times New Roman" w:hAnsi="Times New Roman" w:cs="Times New Roman"/>
+          <w:b/>
+          <w:bCs/>
+          <w:i/>
+          <w:iCs/>
+        </w:rPr>
+        <w:t xml:space="preserve"> </w:t>
+      </w:r>
+      <w:r>
+        <w:rPr>
+          <w:rFonts w:ascii="Times New Roman" w:hAnsi="Times New Roman" w:cs="Times New Roman"/>
+          <w:b/>
+          <w:bCs/>
+          <w:i/>
+          <w:iCs/>
+        </w:rPr>
+        <w:t xml:space="preserve">= </w:t>
+      </w:r>
+      <w:r>
+        <w:rPr>
+          <w:rFonts w:ascii="Times New Roman" w:hAnsi="Times New Roman" w:cs="Times New Roman"/>
+          <w:b/>
+          <w:bCs/>
+          <w:i/>
+          <w:iCs/>
+        </w:rPr>
+        <w:t>T</w:t>
+      </w:r>
+      <w:r>
+        <w:rPr>
+          <w:rFonts w:ascii="Times New Roman" w:hAnsi="Times New Roman" w:cs="Times New Roman"/>
+          <w:b/>
+          <w:bCs/>
+          <w:i/>
+          <w:iCs/>
+          <w:vertAlign w:val="subscript"/>
+        </w:rPr>
+        <w:t>end</w:t>
+      </w:r>
+      <w:r>
+        <w:rPr>
+          <w:rFonts w:ascii="Times New Roman" w:hAnsi="Times New Roman" w:cs="Times New Roman"/>
+          <w:b/>
+          <w:bCs/>
+          <w:i/>
+          <w:iCs/>
+        </w:rPr>
+        <w:t xml:space="preserve"> – </w:t>
+      </w:r>
+      <w:proofErr w:type="spellStart"/>
+      <w:r>
+        <w:rPr>
+          <w:rFonts w:ascii="Times New Roman" w:hAnsi="Times New Roman" w:cs="Times New Roman"/>
+          <w:b/>
+          <w:bCs/>
+          <w:i/>
+          <w:iCs/>
+        </w:rPr>
+        <w:t>T</w:t>
+      </w:r>
+      <w:r>
+        <w:rPr>
+          <w:rFonts w:ascii="Times New Roman" w:hAnsi="Times New Roman" w:cs="Times New Roman"/>
+          <w:b/>
+          <w:bCs/>
+          <w:i/>
+          <w:iCs/>
+          <w:vertAlign w:val="subscript"/>
+        </w:rPr>
+        <w:t>start</w:t>
+      </w:r>
+      <w:proofErr w:type="spellEnd"/>
+      <w:r>
+        <w:rPr>
+          <w:rFonts w:ascii="Times New Roman" w:hAnsi="Times New Roman" w:cs="Times New Roman"/>
+        </w:rPr>
+        <w:t xml:space="preserve"> w</w:t>
+      </w:r>
+      <w:r>
+        <w:rPr>
+          <w:rFonts w:ascii="Times New Roman" w:hAnsi="Times New Roman" w:cs="Times New Roman"/>
+        </w:rPr>
+        <w:t>here</w:t>
+      </w:r>
+      <w:r>
+        <w:rPr>
+          <w:rFonts w:ascii="Times New Roman" w:hAnsi="Times New Roman" w:cs="Times New Roman"/>
+        </w:rPr>
+        <w:t xml:space="preserve"> </w:t>
+      </w:r>
+      <w:proofErr w:type="spellStart"/>
+      <w:r>
+        <w:rPr>
+          <w:rFonts w:ascii="Times New Roman" w:hAnsi="Times New Roman" w:cs="Times New Roman"/>
+          <w:b/>
+          <w:bCs/>
+          <w:i/>
+          <w:iCs/>
+        </w:rPr>
+        <w:t>T</w:t>
+      </w:r>
+      <w:r>
+        <w:rPr>
+          <w:rFonts w:ascii="Times New Roman" w:hAnsi="Times New Roman" w:cs="Times New Roman"/>
+          <w:b/>
+          <w:bCs/>
+          <w:i/>
+          <w:iCs/>
+          <w:vertAlign w:val="subscript"/>
+        </w:rPr>
+        <w:t>p</w:t>
+      </w:r>
+      <w:proofErr w:type="spellEnd"/>
+      <w:r>
+        <w:rPr>
+          <w:rFonts w:ascii="Times New Roman" w:hAnsi="Times New Roman" w:cs="Times New Roman"/>
+        </w:rPr>
+        <w:t xml:space="preserve"> is the </w:t>
+      </w:r>
+      <w:r>
+        <w:rPr>
+          <w:rFonts w:ascii="Times New Roman" w:hAnsi="Times New Roman" w:cs="Times New Roman"/>
+        </w:rPr>
+        <w:t>proof-generation time</w:t>
+      </w:r>
+      <w:r>
+        <w:rPr>
+          <w:rFonts w:ascii="Times New Roman" w:hAnsi="Times New Roman" w:cs="Times New Roman"/>
+        </w:rPr>
+        <w:t xml:space="preserve">, </w:t>
+      </w:r>
+      <w:proofErr w:type="spellStart"/>
+      <w:r>
+        <w:rPr>
+          <w:rFonts w:ascii="Times New Roman" w:hAnsi="Times New Roman" w:cs="Times New Roman"/>
+          <w:b/>
+          <w:bCs/>
+          <w:i/>
+          <w:iCs/>
+        </w:rPr>
+        <w:t>T</w:t>
+      </w:r>
+      <w:r>
+        <w:rPr>
+          <w:rFonts w:ascii="Times New Roman" w:hAnsi="Times New Roman" w:cs="Times New Roman"/>
+          <w:b/>
+          <w:bCs/>
+          <w:i/>
+          <w:iCs/>
+          <w:vertAlign w:val="subscript"/>
+        </w:rPr>
+        <w:t>start</w:t>
+      </w:r>
+      <w:proofErr w:type="spellEnd"/>
+      <w:r>
+        <w:rPr>
+          <w:rFonts w:ascii="Times New Roman" w:hAnsi="Times New Roman" w:cs="Times New Roman"/>
+        </w:rPr>
+        <w:t xml:space="preserve"> is the </w:t>
+      </w:r>
+      <w:r>
+        <w:rPr>
+          <w:rFonts w:ascii="Times New Roman" w:hAnsi="Times New Roman" w:cs="Times New Roman"/>
+        </w:rPr>
+        <w:t>proof-generation start time</w:t>
+      </w:r>
+      <w:r>
+        <w:rPr>
+          <w:rFonts w:ascii="Times New Roman" w:hAnsi="Times New Roman" w:cs="Times New Roman"/>
+        </w:rPr>
+        <w:t xml:space="preserve"> and </w:t>
+      </w:r>
+      <w:r>
+        <w:rPr>
+          <w:rFonts w:ascii="Times New Roman" w:hAnsi="Times New Roman" w:cs="Times New Roman"/>
+          <w:b/>
+          <w:bCs/>
+          <w:i/>
+          <w:iCs/>
+        </w:rPr>
+        <w:t>T</w:t>
+      </w:r>
+      <w:r>
+        <w:rPr>
+          <w:rFonts w:ascii="Times New Roman" w:hAnsi="Times New Roman" w:cs="Times New Roman"/>
+          <w:b/>
+          <w:bCs/>
+          <w:i/>
+          <w:iCs/>
+          <w:vertAlign w:val="subscript"/>
+        </w:rPr>
+        <w:t>end</w:t>
+      </w:r>
+      <w:r>
+        <w:rPr>
+          <w:rFonts w:ascii="Times New Roman" w:hAnsi="Times New Roman" w:cs="Times New Roman"/>
+          <w:b/>
+          <w:bCs/>
+          <w:i/>
+          <w:iCs/>
+        </w:rPr>
+        <w:t xml:space="preserve"> </w:t>
+      </w:r>
+      <w:r>
+        <w:rPr>
+          <w:rFonts w:ascii="Times New Roman" w:hAnsi="Times New Roman" w:cs="Times New Roman"/>
+        </w:rPr>
+        <w:t xml:space="preserve">is the </w:t>
+      </w:r>
+      <w:r>
+        <w:rPr>
+          <w:rFonts w:ascii="Times New Roman" w:hAnsi="Times New Roman" w:cs="Times New Roman"/>
+        </w:rPr>
+        <w:t>proof-generation completion time.</w:t>
+      </w:r>
+      <w:r>
+        <w:rPr>
+          <w:rFonts w:ascii="Times New Roman" w:hAnsi="Times New Roman" w:cs="Times New Roman"/>
+          <w:b/>
+          <w:bCs/>
+          <w:i/>
+          <w:iCs/>
+        </w:rPr>
+        <w:t xml:space="preserve"> </w:t>
+      </w:r>
+      <w:r>
+        <w:rPr>
+          <w:rFonts w:ascii="Times New Roman" w:hAnsi="Times New Roman" w:cs="Times New Roman"/>
+        </w:rPr>
+        <w:t>Where the tooling provides separate witness-generation and proof-generation measurements, both will be recorded.</w:t>
+      </w:r>
+      <w:r>
+        <w:rPr>
+          <w:rFonts w:ascii="Times New Roman" w:hAnsi="Times New Roman" w:cs="Times New Roman"/>
+        </w:rPr>
+        <w:t xml:space="preserve"> </w:t>
+      </w:r>
+      <w:r>
+        <w:rPr>
+          <w:rFonts w:ascii="Times New Roman" w:hAnsi="Times New Roman" w:cs="Times New Roman"/>
+        </w:rPr>
+        <w:t>This distinction is important because</w:t>
+      </w:r>
+      <w:r>
+        <w:rPr>
+          <w:rFonts w:ascii="Times New Roman" w:hAnsi="Times New Roman" w:cs="Times New Roman"/>
+        </w:rPr>
+        <w:t xml:space="preserve"> </w:t>
+      </w:r>
+      <w:r>
+        <w:rPr>
+          <w:rFonts w:ascii="Times New Roman" w:hAnsi="Times New Roman" w:cs="Times New Roman"/>
+        </w:rPr>
+        <w:t xml:space="preserve">witness construction </w:t>
+      </w:r>
+      <w:r>
+        <w:rPr>
+          <w:rFonts w:ascii="Times New Roman" w:hAnsi="Times New Roman" w:cs="Times New Roman"/>
+        </w:rPr>
+        <w:t>and</w:t>
+      </w:r>
+      <w:r>
+        <w:rPr>
+          <w:rFonts w:ascii="Times New Roman" w:hAnsi="Times New Roman" w:cs="Times New Roman"/>
+        </w:rPr>
+        <w:t xml:space="preserve"> proving</w:t>
+      </w:r>
+      <w:r>
+        <w:rPr>
+          <w:rFonts w:ascii="Times New Roman" w:hAnsi="Times New Roman" w:cs="Times New Roman"/>
+        </w:rPr>
+        <w:t xml:space="preserve"> </w:t>
+      </w:r>
+      <w:r>
+        <w:rPr>
+          <w:rFonts w:ascii="Times New Roman" w:hAnsi="Times New Roman" w:cs="Times New Roman"/>
+        </w:rPr>
+        <w:t>may not be equivalent to</w:t>
+      </w:r>
+      <w:r>
+        <w:rPr>
+          <w:rFonts w:ascii="Times New Roman" w:hAnsi="Times New Roman" w:cs="Times New Roman"/>
+        </w:rPr>
+        <w:t xml:space="preserve"> </w:t>
+      </w:r>
+      <w:r>
+        <w:rPr>
+          <w:rFonts w:ascii="Times New Roman" w:hAnsi="Times New Roman" w:cs="Times New Roman"/>
+        </w:rPr>
+        <w:t>proving alone.</w:t>
+      </w:r>
+    </w:p>
+    <w:p>
+      <w:pPr>
+        <w:pStyle w:val="Heading3"/>
+      </w:pPr>
+      <w:r>
+        <w:t>3.18.2 Verification Time</w:t>
+      </w:r>
+    </w:p>
+    <w:p>
+      <w:pPr>
+        <w:spacing w:line="360" w:lineRule="auto"/>
+        <w:rPr>
+          <w:rFonts w:ascii="Times New Roman" w:hAnsi="Times New Roman" w:cs="Times New Roman"/>
+        </w:rPr>
+      </w:pPr>
+      <w:r>
+        <w:rPr>
+          <w:rFonts w:ascii="Times New Roman" w:hAnsi="Times New Roman" w:cs="Times New Roman"/>
+        </w:rPr>
+        <w:t>Local verification time will be calculated as</w:t>
+      </w:r>
+      <w:r>
+        <w:rPr>
+          <w:rFonts w:ascii="Times New Roman" w:hAnsi="Times New Roman" w:cs="Times New Roman"/>
+        </w:rPr>
+        <w:t xml:space="preserve"> </w:t>
+      </w:r>
+      <w:r>
+        <w:rPr>
+          <w:rFonts w:ascii="Times New Roman" w:hAnsi="Times New Roman" w:cs="Times New Roman"/>
+          <w:b/>
+          <w:bCs/>
+          <w:i/>
+          <w:iCs/>
+        </w:rPr>
+        <w:t>T</w:t>
+      </w:r>
+      <w:r>
+        <w:rPr>
+          <w:rFonts w:ascii="Times New Roman" w:hAnsi="Times New Roman" w:cs="Times New Roman"/>
+          <w:b/>
+          <w:bCs/>
+          <w:i/>
+          <w:iCs/>
+          <w:vertAlign w:val="subscript"/>
+        </w:rPr>
+        <w:t>v</w:t>
+      </w:r>
+      <w:r>
+        <w:rPr>
+          <w:rFonts w:ascii="Times New Roman" w:hAnsi="Times New Roman" w:cs="Times New Roman"/>
+        </w:rPr>
+        <w:t xml:space="preserve"> = </w:t>
+      </w:r>
+      <w:proofErr w:type="spellStart"/>
+      <w:r>
+        <w:rPr>
+          <w:rFonts w:ascii="Times New Roman" w:hAnsi="Times New Roman" w:cs="Times New Roman"/>
+          <w:b/>
+          <w:bCs/>
+          <w:i/>
+          <w:iCs/>
+        </w:rPr>
+        <w:t>T</w:t>
+      </w:r>
+      <w:r>
+        <w:rPr>
+          <w:rFonts w:ascii="Times New Roman" w:hAnsi="Times New Roman" w:cs="Times New Roman"/>
+          <w:b/>
+          <w:bCs/>
+          <w:i/>
+          <w:iCs/>
+          <w:vertAlign w:val="subscript"/>
+        </w:rPr>
+        <w:t>verification,end</w:t>
+      </w:r>
+      <w:proofErr w:type="spellEnd"/>
+      <w:r>
+        <w:rPr>
+          <w:rFonts w:ascii="Times New Roman" w:hAnsi="Times New Roman" w:cs="Times New Roman"/>
+          <w:b/>
+          <w:bCs/>
+          <w:i/>
+          <w:iCs/>
+          <w:vertAlign w:val="subscript"/>
+        </w:rPr>
+        <w:t xml:space="preserve">  </w:t>
+      </w:r>
+      <w:r>
+        <w:rPr>
+          <w:rFonts w:ascii="Times New Roman" w:hAnsi="Times New Roman" w:cs="Times New Roman"/>
+        </w:rPr>
+        <w:t xml:space="preserve">– </w:t>
+      </w:r>
+      <w:proofErr w:type="spellStart"/>
+      <w:r>
+        <w:rPr>
+          <w:rFonts w:ascii="Times New Roman" w:hAnsi="Times New Roman" w:cs="Times New Roman"/>
+          <w:b/>
+          <w:bCs/>
+          <w:i/>
+          <w:iCs/>
+        </w:rPr>
+        <w:t>T</w:t>
+      </w:r>
+      <w:r>
+        <w:rPr>
+          <w:rFonts w:ascii="Times New Roman" w:hAnsi="Times New Roman" w:cs="Times New Roman"/>
+          <w:b/>
+          <w:bCs/>
+          <w:i/>
+          <w:iCs/>
+          <w:vertAlign w:val="subscript"/>
+        </w:rPr>
+        <w:t>verification,start</w:t>
+      </w:r>
+      <w:proofErr w:type="spellEnd"/>
+      <w:r>
+        <w:rPr>
+          <w:rFonts w:ascii="Times New Roman" w:hAnsi="Times New Roman" w:cs="Times New Roman"/>
+        </w:rPr>
+        <w:t xml:space="preserve">. </w:t>
+      </w:r>
+      <w:r>
+        <w:rPr>
+          <w:rFonts w:ascii="Times New Roman" w:hAnsi="Times New Roman" w:cs="Times New Roman"/>
+        </w:rPr>
+        <w:t>This measurement will be kept separate from Ethereum transaction execution.</w:t>
+      </w:r>
+    </w:p>
+    <w:p>
+      <w:pPr>
+        <w:pStyle w:val="Heading3"/>
+      </w:pPr>
+      <w:r>
+        <w:t>3.18.3 Memory Consumption</w:t>
+      </w:r>
+    </w:p>
+    <w:p>
+      <w:pPr>
+        <w:spacing w:line="360" w:lineRule="auto"/>
+        <w:rPr>
+          <w:rFonts w:ascii="Times New Roman" w:hAnsi="Times New Roman" w:cs="Times New Roman"/>
+        </w:rPr>
+      </w:pPr>
+      <w:r>
+        <w:rPr>
+          <w:rFonts w:ascii="Times New Roman" w:hAnsi="Times New Roman" w:cs="Times New Roman"/>
+        </w:rPr>
+        <w:t>Peak memory will be recorded during proof generation.</w:t>
+      </w:r>
+      <w:r>
+        <w:rPr>
+          <w:rFonts w:ascii="Times New Roman" w:hAnsi="Times New Roman" w:cs="Times New Roman"/>
+        </w:rPr>
+        <w:t xml:space="preserve"> </w:t>
+      </w:r>
+      <w:r>
+        <w:rPr>
+          <w:rFonts w:ascii="Times New Roman" w:hAnsi="Times New Roman" w:cs="Times New Roman"/>
+        </w:rPr>
+        <w:t>The study will report</w:t>
+      </w:r>
+      <w:r>
+        <w:rPr>
+          <w:rFonts w:ascii="Times New Roman" w:hAnsi="Times New Roman" w:cs="Times New Roman"/>
+        </w:rPr>
+        <w:t xml:space="preserve"> </w:t>
+      </w:r>
+      <w:proofErr w:type="spellStart"/>
+      <w:r>
+        <w:rPr>
+          <w:rFonts w:ascii="Times New Roman" w:hAnsi="Times New Roman" w:cs="Times New Roman"/>
+          <w:b/>
+          <w:bCs/>
+          <w:i/>
+          <w:iCs/>
+        </w:rPr>
+        <w:t>M</w:t>
+      </w:r>
+      <w:r>
+        <w:rPr>
+          <w:rFonts w:ascii="Times New Roman" w:hAnsi="Times New Roman" w:cs="Times New Roman"/>
+          <w:b/>
+          <w:bCs/>
+          <w:i/>
+          <w:iCs/>
+          <w:vertAlign w:val="subscript"/>
+        </w:rPr>
+        <w:t>peak</w:t>
+      </w:r>
+      <w:proofErr w:type="spellEnd"/>
+      <w:r>
+        <w:rPr>
+          <w:rFonts w:ascii="Times New Roman" w:hAnsi="Times New Roman" w:cs="Times New Roman"/>
+        </w:rPr>
+        <w:t xml:space="preserve"> </w:t>
+      </w:r>
+      <w:r>
+        <w:rPr>
+          <w:rFonts w:ascii="Times New Roman" w:hAnsi="Times New Roman" w:cs="Times New Roman"/>
+        </w:rPr>
+        <w:t xml:space="preserve">where </w:t>
+      </w:r>
+      <w:proofErr w:type="spellStart"/>
+      <w:r>
+        <w:rPr>
+          <w:rFonts w:ascii="Times New Roman" w:hAnsi="Times New Roman" w:cs="Times New Roman"/>
+          <w:b/>
+          <w:bCs/>
+          <w:i/>
+          <w:iCs/>
+        </w:rPr>
+        <w:t>M</w:t>
+      </w:r>
+      <w:r>
+        <w:rPr>
+          <w:rFonts w:ascii="Times New Roman" w:hAnsi="Times New Roman" w:cs="Times New Roman"/>
+          <w:b/>
+          <w:bCs/>
+          <w:i/>
+          <w:iCs/>
+          <w:vertAlign w:val="subscript"/>
+        </w:rPr>
+        <w:t>peak</w:t>
+      </w:r>
+      <w:proofErr w:type="spellEnd"/>
+      <w:r>
+        <w:rPr>
+          <w:rFonts w:ascii="Times New Roman" w:hAnsi="Times New Roman" w:cs="Times New Roman"/>
+          <w:b/>
+          <w:bCs/>
+          <w:i/>
+          <w:iCs/>
+          <w:vertAlign w:val="subscript"/>
+        </w:rPr>
+        <w:t xml:space="preserve"> </w:t>
+      </w:r>
+      <w:r>
+        <w:rPr>
+          <w:rFonts w:ascii="Times New Roman" w:hAnsi="Times New Roman" w:cs="Times New Roman"/>
+        </w:rPr>
+        <w:t>represents the maximum observed memory consumption during the execution.</w:t>
+      </w:r>
+      <w:r>
+        <w:rPr>
+          <w:rFonts w:ascii="Times New Roman" w:hAnsi="Times New Roman" w:cs="Times New Roman"/>
+        </w:rPr>
+        <w:t xml:space="preserve"> </w:t>
+      </w:r>
+      <w:r>
+        <w:rPr>
+          <w:rFonts w:ascii="Times New Roman" w:hAnsi="Times New Roman" w:cs="Times New Roman"/>
+        </w:rPr>
+        <w:t>Average memory alone is insufficient because a short-lived memory spike may determine whether the system can execute successfully on a constrained device.</w:t>
+      </w:r>
+    </w:p>
+    <w:p>
+      <w:pPr>
+        <w:spacing w:line="360" w:lineRule="auto"/>
+        <w:rPr>
+          <w:rFonts w:ascii="Times New Roman" w:hAnsi="Times New Roman" w:cs="Times New Roman"/>
+        </w:rPr>
+      </w:pPr>
+    </w:p>
+    <w:p>
+      <w:pPr>
+        <w:pStyle w:val="Heading3"/>
+      </w:pPr>
+      <w:r>
         <w:lastRenderedPageBreak/>
-        <w:t>the system will be started in a known state;</w:t>
-      </w:r>
-    </w:p>
-    <w:p>
-      <w:pPr>
-        <w:rPr>
-          <w:rFonts w:ascii="Times New Roman" w:hAnsi="Times New Roman" w:cs="Times New Roman"/>
-        </w:rPr>
-      </w:pPr>
-      <w:r>
-        <w:rPr>
-          <w:rFonts w:ascii="Times New Roman" w:hAnsi="Times New Roman" w:cs="Times New Roman"/>
-        </w:rPr>
-        <w:t xml:space="preserve">background applications will be </w:t>
+        <w:t>3.18.4 Proof Size</w:t>
+      </w:r>
+    </w:p>
+    <w:p>
+      <w:pPr>
+        <w:rPr>
+          <w:rFonts w:ascii="Times New Roman" w:hAnsi="Times New Roman" w:cs="Times New Roman"/>
+        </w:rPr>
+      </w:pPr>
+      <w:r>
+        <w:rPr>
+          <w:rFonts w:ascii="Times New Roman" w:hAnsi="Times New Roman" w:cs="Times New Roman"/>
+        </w:rPr>
+        <w:t>Proof size will be measured as</w:t>
+      </w:r>
+      <w:r>
+        <w:rPr>
+          <w:rFonts w:ascii="Times New Roman" w:hAnsi="Times New Roman" w:cs="Times New Roman"/>
+        </w:rPr>
+        <w:t xml:space="preserve"> </w:t>
       </w:r>
       <w:proofErr w:type="spellStart"/>
       <w:r>
         <w:rPr>
           <w:rFonts w:ascii="Times New Roman" w:hAnsi="Times New Roman" w:cs="Times New Roman"/>
-        </w:rPr>
-        <w:t>minimised</w:t>
+          <w:b/>
+          <w:bCs/>
+          <w:i/>
+          <w:iCs/>
+        </w:rPr>
+        <w:t>S</w:t>
+      </w:r>
+      <w:r>
+        <w:rPr>
+          <w:rFonts w:ascii="Times New Roman" w:hAnsi="Times New Roman" w:cs="Times New Roman"/>
+          <w:b/>
+          <w:bCs/>
+          <w:i/>
+          <w:iCs/>
+          <w:vertAlign w:val="subscript"/>
+        </w:rPr>
+        <w:t>p</w:t>
       </w:r>
       <w:proofErr w:type="spellEnd"/>
       <w:r>
         <w:rPr>
           <w:rFonts w:ascii="Times New Roman" w:hAnsi="Times New Roman" w:cs="Times New Roman"/>
         </w:rPr>
-        <w:t>;</w:t>
-      </w:r>
-    </w:p>
-    <w:p>
-      <w:pPr>
-        <w:rPr>
-          <w:rFonts w:ascii="Times New Roman" w:hAnsi="Times New Roman" w:cs="Times New Roman"/>
-        </w:rPr>
-      </w:pPr>
-      <w:r>
-        <w:rPr>
-          <w:rFonts w:ascii="Times New Roman" w:hAnsi="Times New Roman" w:cs="Times New Roman"/>
-        </w:rPr>
-        <w:t>warm-up executions will be performed where appropriate;</w:t>
-      </w:r>
-    </w:p>
-    <w:p>
-      <w:pPr>
-        <w:rPr>
-          <w:rFonts w:ascii="Times New Roman" w:hAnsi="Times New Roman" w:cs="Times New Roman"/>
-        </w:rPr>
-      </w:pPr>
-      <w:r>
-        <w:rPr>
-          <w:rFonts w:ascii="Times New Roman" w:hAnsi="Times New Roman" w:cs="Times New Roman"/>
-        </w:rPr>
-        <w:t xml:space="preserve">measurements will begin after the environment has </w:t>
+        <w:t xml:space="preserve"> </w:t>
+      </w:r>
+      <w:r>
+        <w:rPr>
+          <w:rFonts w:ascii="Times New Roman" w:hAnsi="Times New Roman" w:cs="Times New Roman"/>
+        </w:rPr>
+        <w:t>=</w:t>
+      </w:r>
+      <w:r>
+        <w:rPr>
+          <w:rFonts w:ascii="Times New Roman" w:hAnsi="Times New Roman" w:cs="Times New Roman"/>
+        </w:rPr>
+        <w:t xml:space="preserve"> </w:t>
+      </w:r>
+      <w:r>
+        <w:rPr>
+          <w:rFonts w:ascii="Times New Roman" w:hAnsi="Times New Roman" w:cs="Times New Roman"/>
+        </w:rPr>
+        <w:t>number of bytes in generated proof</w:t>
+      </w:r>
+      <w:r>
+        <w:rPr>
+          <w:rFonts w:ascii="Times New Roman" w:hAnsi="Times New Roman" w:cs="Times New Roman"/>
+        </w:rPr>
+        <w:t xml:space="preserve">. </w:t>
+      </w:r>
+      <w:r>
+        <w:rPr>
+          <w:rFonts w:ascii="Times New Roman" w:hAnsi="Times New Roman" w:cs="Times New Roman"/>
+        </w:rPr>
+        <w:t>The experiment will also record the size of public inputs separately.</w:t>
+      </w:r>
+      <w:r>
+        <w:rPr>
+          <w:rFonts w:ascii="Times New Roman" w:hAnsi="Times New Roman" w:cs="Times New Roman"/>
+        </w:rPr>
+        <w:t xml:space="preserve"> </w:t>
+      </w:r>
+      <w:r>
+        <w:rPr>
+          <w:rFonts w:ascii="Times New Roman" w:hAnsi="Times New Roman" w:cs="Times New Roman"/>
+        </w:rPr>
+        <w:t>This distinction prevents the study from incorrectly claiming that a proof of a particular size corresponds to the total blockchain payload.</w:t>
+      </w:r>
+    </w:p>
+    <w:p>
+      <w:pPr>
+        <w:pStyle w:val="Heading3"/>
+      </w:pPr>
+      <w:r>
+        <w:t>3.18.5 Gas Consumption</w:t>
+      </w:r>
+    </w:p>
+    <w:p>
+      <w:pPr>
+        <w:rPr>
+          <w:rFonts w:ascii="Times New Roman" w:hAnsi="Times New Roman" w:cs="Times New Roman"/>
+        </w:rPr>
+      </w:pPr>
+      <w:r>
+        <w:rPr>
+          <w:rFonts w:ascii="Times New Roman" w:hAnsi="Times New Roman" w:cs="Times New Roman"/>
+        </w:rPr>
+        <w:t>For each Ethereum verification transaction</w:t>
+      </w:r>
+      <w:r>
+        <w:rPr>
+          <w:rFonts w:ascii="Times New Roman" w:hAnsi="Times New Roman" w:cs="Times New Roman"/>
+        </w:rPr>
+        <w:t xml:space="preserve"> will be </w:t>
       </w:r>
       <w:proofErr w:type="spellStart"/>
       <w:r>
         <w:rPr>
           <w:rFonts w:ascii="Times New Roman" w:hAnsi="Times New Roman" w:cs="Times New Roman"/>
-        </w:rPr>
-        <w:t>stabilised</w:t>
+          <w:b/>
+          <w:bCs/>
+          <w:i/>
+          <w:iCs/>
+        </w:rPr>
+        <w:t>G</w:t>
+      </w:r>
+      <w:r>
+        <w:rPr>
+          <w:rFonts w:ascii="Times New Roman" w:hAnsi="Times New Roman" w:cs="Times New Roman"/>
+          <w:b/>
+          <w:bCs/>
+          <w:i/>
+          <w:iCs/>
+          <w:vertAlign w:val="subscript"/>
+        </w:rPr>
+        <w:t>v</w:t>
       </w:r>
       <w:proofErr w:type="spellEnd"/>
       <w:r>
         <w:rPr>
           <w:rFonts w:ascii="Times New Roman" w:hAnsi="Times New Roman" w:cs="Times New Roman"/>
         </w:rPr>
-        <w:t>;</w:t>
-      </w:r>
-    </w:p>
-    <w:p>
-      <w:pPr>
-        <w:rPr>
-          <w:rFonts w:ascii="Times New Roman" w:hAnsi="Times New Roman" w:cs="Times New Roman"/>
-        </w:rPr>
-      </w:pPr>
-      <w:r>
-        <w:rPr>
-          <w:rFonts w:ascii="Times New Roman" w:hAnsi="Times New Roman" w:cs="Times New Roman"/>
-        </w:rPr>
-        <w:t>each execution will be independently recorded;</w:t>
-      </w:r>
-    </w:p>
-    <w:p>
-      <w:pPr>
-        <w:rPr>
-          <w:rFonts w:ascii="Times New Roman" w:hAnsi="Times New Roman" w:cs="Times New Roman"/>
-        </w:rPr>
-      </w:pPr>
-      <w:r>
-        <w:rPr>
-          <w:rFonts w:ascii="Times New Roman" w:hAnsi="Times New Roman" w:cs="Times New Roman"/>
-        </w:rPr>
-        <w:t>failed executions will be recorded rather than silently discarded;</w:t>
-      </w:r>
-    </w:p>
-    <w:p>
-      <w:pPr>
-        <w:rPr>
-          <w:rFonts w:ascii="Times New Roman" w:hAnsi="Times New Roman" w:cs="Times New Roman"/>
-        </w:rPr>
-      </w:pPr>
-      <w:r>
-        <w:rPr>
-          <w:rFonts w:ascii="Times New Roman" w:hAnsi="Times New Roman" w:cs="Times New Roman"/>
-        </w:rPr>
-        <w:t>abnormal executions will be investigated before removal.</w:t>
-      </w:r>
-    </w:p>
-    <w:p>
-      <w:pPr>
-        <w:rPr>
-          <w:rFonts w:ascii="Times New Roman" w:hAnsi="Times New Roman" w:cs="Times New Roman"/>
-        </w:rPr>
-      </w:pPr>
-    </w:p>
-    <w:p>
-      <w:pPr>
-        <w:rPr>
-          <w:rFonts w:ascii="Times New Roman" w:hAnsi="Times New Roman" w:cs="Times New Roman"/>
-        </w:rPr>
-      </w:pPr>
-      <w:r>
-        <w:rPr>
-          <w:rFonts w:ascii="Times New Roman" w:hAnsi="Times New Roman" w:cs="Times New Roman"/>
-        </w:rPr>
-        <w:t>The reason for recording failures is important.</w:t>
-      </w:r>
-    </w:p>
-    <w:p>
-      <w:pPr>
-        <w:rPr>
-          <w:rFonts w:ascii="Times New Roman" w:hAnsi="Times New Roman" w:cs="Times New Roman"/>
-        </w:rPr>
-      </w:pPr>
-    </w:p>
-    <w:p>
-      <w:pPr>
-        <w:rPr>
-          <w:rFonts w:ascii="Times New Roman" w:hAnsi="Times New Roman" w:cs="Times New Roman"/>
-        </w:rPr>
-      </w:pPr>
-      <w:r>
-        <w:rPr>
-          <w:rFonts w:ascii="Times New Roman" w:hAnsi="Times New Roman" w:cs="Times New Roman"/>
-        </w:rPr>
-        <w:t>Do not delete failed executions simply because they make the results look untidy.</w:t>
-      </w:r>
-    </w:p>
-    <w:p>
-      <w:pPr>
-        <w:rPr>
-          <w:rFonts w:ascii="Times New Roman" w:hAnsi="Times New Roman" w:cs="Times New Roman"/>
-        </w:rPr>
-      </w:pPr>
-    </w:p>
-    <w:p>
-      <w:pPr>
-        <w:rPr>
-          <w:rFonts w:ascii="Times New Roman" w:hAnsi="Times New Roman" w:cs="Times New Roman"/>
-        </w:rPr>
-      </w:pPr>
-      <w:r>
-        <w:rPr>
-          <w:rFonts w:ascii="Times New Roman" w:hAnsi="Times New Roman" w:cs="Times New Roman"/>
-        </w:rPr>
-        <w:t>A failure can itself be evidence of a scalability or resource limitation.</w:t>
-      </w:r>
+        <w:t xml:space="preserve"> = </w:t>
+      </w:r>
+      <w:r>
+        <w:rPr>
+          <w:rFonts w:ascii="Times New Roman" w:hAnsi="Times New Roman" w:cs="Times New Roman"/>
+        </w:rPr>
+        <w:t>gas used by verification transaction</w:t>
+      </w:r>
+      <w:r>
+        <w:rPr>
+          <w:rFonts w:ascii="Times New Roman" w:hAnsi="Times New Roman" w:cs="Times New Roman"/>
+        </w:rPr>
+        <w:t xml:space="preserve">. </w:t>
+      </w:r>
+      <w:r>
+        <w:rPr>
+          <w:rFonts w:ascii="Times New Roman" w:hAnsi="Times New Roman" w:cs="Times New Roman"/>
+        </w:rPr>
+        <w:t>The study will report gas units.</w:t>
+      </w:r>
+      <w:r>
+        <w:t xml:space="preserve"> </w:t>
+      </w:r>
+      <w:r>
+        <w:rPr>
+          <w:rFonts w:ascii="Times New Roman" w:hAnsi="Times New Roman" w:cs="Times New Roman"/>
+        </w:rPr>
+        <w:t>However, monetary cost will be treated as a secondary interpretation because gas prices can vary.</w:t>
+      </w:r>
+      <w:r>
+        <w:rPr>
+          <w:rFonts w:ascii="Times New Roman" w:hAnsi="Times New Roman" w:cs="Times New Roman"/>
+        </w:rPr>
+        <w:t xml:space="preserve"> </w:t>
+      </w:r>
+      <w:r>
+        <w:rPr>
+          <w:rFonts w:ascii="Times New Roman" w:hAnsi="Times New Roman" w:cs="Times New Roman"/>
+        </w:rPr>
+        <w:t>Ethereum's execution specification establishes gas as the resource accounting mechanism for programmable computation.</w:t>
+      </w:r>
+    </w:p>
+    <w:p>
+      <w:pPr>
+        <w:rPr>
+          <w:rFonts w:ascii="Times New Roman" w:hAnsi="Times New Roman" w:cs="Times New Roman"/>
+        </w:rPr>
+      </w:pPr>
     </w:p>
     <w:sectPr>
       <w:pgSz w:w="12240" w:h="15840"/>
@@ -6046,6 +6527,92 @@
 <file path=word/numbering.xml><?xml version="1.0" encoding="utf-8"?>
 <w:numbering xmlns:wpc="http://schemas.microsoft.com/office/word/2010/wordprocessingCanvas" xmlns:cx="http://schemas.microsoft.com/office/drawing/2014/chartex" xmlns:cx1="http://schemas.microsoft.com/office/drawing/2015/9/8/chartex" xmlns:cx2="http://schemas.microsoft.com/office/drawing/2015/10/21/chartex" xmlns:cx3="http://schemas.microsoft.com/office/drawing/2016/5/9/chartex" xmlns:cx4="http://schemas.microsoft.com/office/drawing/2016/5/10/chartex" xmlns:cx5="http://schemas.microsoft.com/office/drawing/2016/5/11/chartex" xmlns:cx6="http://schemas.microsoft.com/office/drawing/2016/5/12/chartex" xmlns:cx7="http://schemas.microsoft.com/office/drawing/2016/5/13/chartex" xmlns:cx8="http://schemas.microsoft.com/office/drawing/2016/5/14/chartex" xmlns:mc="http://schemas.openxmlformats.org/markup-compatibility/2006" xmlns:aink="http://schemas.microsoft.com/office/drawing/2016/ink" xmlns:am3d="http://schemas.microsoft.com/office/drawing/2017/model3d" xmlns:o="urn:schemas-microsoft-com:office:office" xmlns:oel="http://schemas.microsoft.com/office/2019/extlst" xmlns:r="http://schemas.openxmlformats.org/officeDocument/2006/relationships" xmlns:m="http://schemas.openxmlformats.org/officeDocument/2006/math" xmlns:v="urn:schemas-microsoft-com:vml" xmlns:wp14="http://schemas.microsoft.com/office/word/2010/wordprocessingDrawing" xmlns:wp="http://schemas.openxmlformats.org/drawingml/2006/wordprocessingDrawing" xmlns:w10="urn:schemas-microsoft-com:office:word" xmlns:w="http://schemas.openxmlformats.org/wordprocessingml/2006/main" xmlns:w14="http://schemas.microsoft.com/office/word/2010/wordml" xmlns:w15="http://schemas.microsoft.com/office/word/2012/wordml" xmlns:w16cex="http://schemas.microsoft.com/office/word/2018/wordml/cex" xmlns:w16cid="http://schemas.microsoft.com/office/word/2016/wordml/cid" xmlns:w16="http://schemas.microsoft.com/office/word/2018/wordml" xmlns:w16du="http://schemas.microsoft.com/office/word/2023/wordml/word16du" xmlns:w16sdtdh="http://schemas.microsoft.com/office/word/2020/wordml/sdtdatahash" xmlns:w16sdtfl="http://schemas.microsoft.com/office/word/2024/wordml/sdtformatlock" xmlns:w16se="http://schemas.microsoft.com/office/word/2015/wordml/symex" xmlns:wpg="http://schemas.microsoft.com/office/word/2010/wordprocessingGroup" xmlns:wpi="http://schemas.microsoft.com/office/word/2010/wordprocessingInk" xmlns:wne="http://schemas.microsoft.com/office/word/2006/wordml" xmlns:wps="http://schemas.microsoft.com/office/word/2010/wordprocessingShape" mc:Ignorable="w14 w15 w16se w16cid w16 w16cex w16sdtdh w16sdtfl w16du wp14">
   <w:abstractNum w:abstractNumId="0" w15:restartNumberingAfterBreak="0">
+    <w:nsid w:val="18233F10"/>
+    <w:multiLevelType w:val="hybridMultilevel"/>
+    <w:tmpl w:val="1C9C13DE"/>
+    <w:lvl w:ilvl="0" w:tplc="FFFFFFFF">
+      <w:start w:val="1"/>
+      <w:numFmt w:val="decimal"/>
+      <w:lvlText w:val="%1."/>
+      <w:lvlJc w:val="left"/>
+      <w:pPr>
+        <w:ind w:left="720" w:hanging="360"/>
+      </w:pPr>
+    </w:lvl>
+    <w:lvl w:ilvl="1" w:tplc="FFFFFFFF" w:tentative="1">
+      <w:start w:val="1"/>
+      <w:numFmt w:val="lowerLetter"/>
+      <w:lvlText w:val="%2."/>
+      <w:lvlJc w:val="left"/>
+      <w:pPr>
+        <w:ind w:left="1440" w:hanging="360"/>
+      </w:pPr>
+    </w:lvl>
+    <w:lvl w:ilvl="2" w:tplc="FFFFFFFF" w:tentative="1">
+      <w:start w:val="1"/>
+      <w:numFmt w:val="lowerRoman"/>
+      <w:lvlText w:val="%3."/>
+      <w:lvlJc w:val="right"/>
+      <w:pPr>
+        <w:ind w:left="2160" w:hanging="180"/>
+      </w:pPr>
+    </w:lvl>
+    <w:lvl w:ilvl="3" w:tplc="FFFFFFFF" w:tentative="1">
+      <w:start w:val="1"/>
+      <w:numFmt w:val="decimal"/>
+      <w:lvlText w:val="%4."/>
+      <w:lvlJc w:val="left"/>
+      <w:pPr>
+        <w:ind w:left="2880" w:hanging="360"/>
+      </w:pPr>
+    </w:lvl>
+    <w:lvl w:ilvl="4" w:tplc="FFFFFFFF" w:tentative="1">
+      <w:start w:val="1"/>
+      <w:numFmt w:val="lowerLetter"/>
+      <w:lvlText w:val="%5."/>
+      <w:lvlJc w:val="left"/>
+      <w:pPr>
+        <w:ind w:left="3600" w:hanging="360"/>
+      </w:pPr>
+    </w:lvl>
+    <w:lvl w:ilvl="5" w:tplc="FFFFFFFF" w:tentative="1">
+      <w:start w:val="1"/>
+      <w:numFmt w:val="lowerRoman"/>
+      <w:lvlText w:val="%6."/>
+      <w:lvlJc w:val="right"/>
+      <w:pPr>
+        <w:ind w:left="4320" w:hanging="180"/>
+      </w:pPr>
+    </w:lvl>
+    <w:lvl w:ilvl="6" w:tplc="FFFFFFFF" w:tentative="1">
+      <w:start w:val="1"/>
+      <w:numFmt w:val="decimal"/>
+      <w:lvlText w:val="%7."/>
+      <w:lvlJc w:val="left"/>
+      <w:pPr>
+        <w:ind w:left="5040" w:hanging="360"/>
+      </w:pPr>
+    </w:lvl>
+    <w:lvl w:ilvl="7" w:tplc="FFFFFFFF" w:tentative="1">
+      <w:start w:val="1"/>
+      <w:numFmt w:val="lowerLetter"/>
+      <w:lvlText w:val="%8."/>
+      <w:lvlJc w:val="left"/>
+      <w:pPr>
+        <w:ind w:left="5760" w:hanging="360"/>
+      </w:pPr>
+    </w:lvl>
+    <w:lvl w:ilvl="8" w:tplc="FFFFFFFF" w:tentative="1">
+      <w:start w:val="1"/>
+      <w:numFmt w:val="lowerRoman"/>
+      <w:lvlText w:val="%9."/>
+      <w:lvlJc w:val="right"/>
+      <w:pPr>
+        <w:ind w:left="6480" w:hanging="180"/>
+      </w:pPr>
+    </w:lvl>
+  </w:abstractNum>
+  <w:abstractNum w:abstractNumId="1" w15:restartNumberingAfterBreak="0">
     <w:nsid w:val="27593470"/>
     <w:multiLevelType w:val="hybridMultilevel"/>
     <w:tmpl w:val="B7303BF0"/>
@@ -6131,7 +6698,7 @@
       </w:pPr>
     </w:lvl>
   </w:abstractNum>
-  <w:abstractNum w:abstractNumId="1" w15:restartNumberingAfterBreak="0">
+  <w:abstractNum w:abstractNumId="2" w15:restartNumberingAfterBreak="0">
     <w:nsid w:val="2DD61A22"/>
     <w:multiLevelType w:val="hybridMultilevel"/>
     <w:tmpl w:val="72CA0872"/>
@@ -6217,10 +6784,10 @@
       </w:pPr>
     </w:lvl>
   </w:abstractNum>
-  <w:abstractNum w:abstractNumId="2" w15:restartNumberingAfterBreak="0">
+  <w:abstractNum w:abstractNumId="3" w15:restartNumberingAfterBreak="0">
     <w:nsid w:val="4E5D18C2"/>
     <w:multiLevelType w:val="hybridMultilevel"/>
-    <w:tmpl w:val="45846EBA"/>
+    <w:tmpl w:val="1C9C13DE"/>
     <w:lvl w:ilvl="0" w:tplc="0409000F">
       <w:start w:val="1"/>
       <w:numFmt w:val="decimal"/>
@@ -6303,7 +6870,7 @@
       </w:pPr>
     </w:lvl>
   </w:abstractNum>
-  <w:abstractNum w:abstractNumId="3" w15:restartNumberingAfterBreak="0">
+  <w:abstractNum w:abstractNumId="4" w15:restartNumberingAfterBreak="0">
     <w:nsid w:val="5C5025D4"/>
     <w:multiLevelType w:val="hybridMultilevel"/>
     <w:tmpl w:val="BCAC87E4"/>
@@ -6389,7 +6956,7 @@
       </w:pPr>
     </w:lvl>
   </w:abstractNum>
-  <w:abstractNum w:abstractNumId="4" w15:restartNumberingAfterBreak="0">
+  <w:abstractNum w:abstractNumId="5" w15:restartNumberingAfterBreak="0">
     <w:nsid w:val="5D2358A9"/>
     <w:multiLevelType w:val="hybridMultilevel"/>
     <w:tmpl w:val="40D81D38"/>
@@ -6475,7 +7042,7 @@
       </w:pPr>
     </w:lvl>
   </w:abstractNum>
-  <w:abstractNum w:abstractNumId="5" w15:restartNumberingAfterBreak="0">
+  <w:abstractNum w:abstractNumId="6" w15:restartNumberingAfterBreak="0">
     <w:nsid w:val="5DBF20BF"/>
     <w:multiLevelType w:val="hybridMultilevel"/>
     <w:tmpl w:val="FC9817C0"/>
@@ -6561,7 +7128,7 @@
       </w:pPr>
     </w:lvl>
   </w:abstractNum>
-  <w:abstractNum w:abstractNumId="6" w15:restartNumberingAfterBreak="0">
+  <w:abstractNum w:abstractNumId="7" w15:restartNumberingAfterBreak="0">
     <w:nsid w:val="603D4B46"/>
     <w:multiLevelType w:val="hybridMultilevel"/>
     <w:tmpl w:val="41581E32"/>
@@ -6647,7 +7214,7 @@
       </w:pPr>
     </w:lvl>
   </w:abstractNum>
-  <w:abstractNum w:abstractNumId="7" w15:restartNumberingAfterBreak="0">
+  <w:abstractNum w:abstractNumId="8" w15:restartNumberingAfterBreak="0">
     <w:nsid w:val="7E834BB2"/>
     <w:multiLevelType w:val="hybridMultilevel"/>
     <w:tmpl w:val="B824DB12"/>
@@ -6734,28 +7301,31 @@
     </w:lvl>
   </w:abstractNum>
   <w:num w:numId="1" w16cid:durableId="173691526">
+    <w:abstractNumId w:val="2"/>
+  </w:num>
+  <w:num w:numId="2" w16cid:durableId="1406294020">
+    <w:abstractNumId w:val="7"/>
+  </w:num>
+  <w:num w:numId="3" w16cid:durableId="806780805">
+    <w:abstractNumId w:val="5"/>
+  </w:num>
+  <w:num w:numId="4" w16cid:durableId="1607271580">
+    <w:abstractNumId w:val="8"/>
+  </w:num>
+  <w:num w:numId="5" w16cid:durableId="1819687346">
     <w:abstractNumId w:val="1"/>
   </w:num>
-  <w:num w:numId="2" w16cid:durableId="1406294020">
+  <w:num w:numId="6" w16cid:durableId="833687020">
+    <w:abstractNumId w:val="3"/>
+  </w:num>
+  <w:num w:numId="7" w16cid:durableId="850336264">
+    <w:abstractNumId w:val="4"/>
+  </w:num>
+  <w:num w:numId="8" w16cid:durableId="447509587">
     <w:abstractNumId w:val="6"/>
   </w:num>
-  <w:num w:numId="3" w16cid:durableId="806780805">
-    <w:abstractNumId w:val="4"/>
-  </w:num>
-  <w:num w:numId="4" w16cid:durableId="1607271580">
-    <w:abstractNumId w:val="7"/>
-  </w:num>
-  <w:num w:numId="5" w16cid:durableId="1819687346">
+  <w:num w:numId="9" w16cid:durableId="16202998">
     <w:abstractNumId w:val="0"/>
-  </w:num>
-  <w:num w:numId="6" w16cid:durableId="833687020">
-    <w:abstractNumId w:val="2"/>
-  </w:num>
-  <w:num w:numId="7" w16cid:durableId="850336264">
-    <w:abstractNumId w:val="3"/>
-  </w:num>
-  <w:num w:numId="8" w16cid:durableId="447509587">
-    <w:abstractNumId w:val="5"/>
   </w:num>
 </w:numbering>
 </file>
@@ -7360,7 +7930,6 @@
   <w:style w:type="character" w:default="1" w:styleId="DefaultParagraphFont">
     <w:name w:val="Default Paragraph Font"/>
     <w:uiPriority w:val="1"/>
-    <w:semiHidden/>
     <w:unhideWhenUsed/>
   </w:style>
   <w:style w:type="table" w:default="1" w:styleId="TableNormal">

</xml_diff>